<commit_message>
add parameters for template
</commit_message>
<xml_diff>
--- a/templates/contract_template.docx
+++ b/templates/contract_template.docx
@@ -84,7 +84,6 @@
       </w:r>
       <w:bookmarkEnd w:id="2"/>
       <w:bookmarkEnd w:id="3"/>
-      <w:proofErr w:type="gramStart"/>
       <w:r>
         <w:rPr>
           <w:b/>
@@ -101,7 +100,6 @@
         </w:rPr>
         <w:t>number</w:t>
       </w:r>
-      <w:proofErr w:type="gramEnd"/>
       <w:r>
         <w:rPr>
           <w:b/>
@@ -126,22 +124,19 @@
         <w:t xml:space="preserve">г. Калининград                                                                                                                                     </w:t>
       </w:r>
       <w:r>
-        <w:t>05</w:t>
-      </w:r>
-      <w:r>
-        <w:t xml:space="preserve"> </w:t>
-      </w:r>
-      <w:r>
-        <w:t>февраля</w:t>
-      </w:r>
-      <w:r>
-        <w:t xml:space="preserve"> 202</w:t>
-      </w:r>
-      <w:r>
-        <w:t>5</w:t>
-      </w:r>
-      <w:r>
-        <w:t xml:space="preserve"> года  </w:t>
+        <w:t xml:space="preserve">{{ </w:t>
+      </w:r>
+      <w:r>
+        <w:rPr>
+          <w:lang w:val="en-US"/>
+        </w:rPr>
+        <w:t>date</w:t>
+      </w:r>
+      <w:r>
+        <w:t xml:space="preserve"> }}</w:t>
+      </w:r>
+      <w:r>
+        <w:t xml:space="preserve">  </w:t>
       </w:r>
     </w:p>
     <w:p>
@@ -159,15 +154,7 @@
         <w:t>«Лысенко Г.И.</w:t>
       </w:r>
       <w:r>
-        <w:t xml:space="preserve">», в дальнейшем именуемое «Поставщик», в </w:t>
-      </w:r>
-      <w:proofErr w:type="gramStart"/>
-      <w:r>
-        <w:t>лице  Лысенко</w:t>
-      </w:r>
-      <w:proofErr w:type="gramEnd"/>
-      <w:r>
-        <w:t xml:space="preserve"> Галины Ивановны, действующего на основании Устава</w:t>
+        <w:t>», в дальнейшем именуемое «Поставщик», в лице  Лысенко Галины Ивановны, действующего на основании Устава</w:t>
       </w:r>
       <w:r>
         <w:t>, с одной стороны</w:t>
@@ -187,7 +174,6 @@
         </w:rPr>
         <w:t xml:space="preserve"> </w:t>
       </w:r>
-      <w:proofErr w:type="gramStart"/>
       <w:r>
         <w:rPr>
           <w:b/>
@@ -202,7 +188,6 @@
         <w:t>fio</w:t>
       </w:r>
       <w:proofErr w:type="spellEnd"/>
-      <w:proofErr w:type="gramEnd"/>
       <w:r>
         <w:rPr>
           <w:b/>
@@ -378,7 +363,6 @@
         </w:rPr>
         <w:t xml:space="preserve">- </w:t>
       </w:r>
-      <w:proofErr w:type="gramStart"/>
       <w:r>
         <w:rPr>
           <w:rFonts w:ascii="Times New Roman" w:hAnsi="Times New Roman" w:cs="Times New Roman"/>
@@ -388,9 +372,9 @@
           <w:szCs w:val="20"/>
           <w:lang w:val="en-US"/>
         </w:rPr>
-        <w:t>{{ product.name</w:t>
-      </w:r>
-      <w:proofErr w:type="gramEnd"/>
+        <w:t xml:space="preserve">{{ product.name }} – {{ </w:t>
+      </w:r>
+      <w:proofErr w:type="spellStart"/>
       <w:r>
         <w:rPr>
           <w:rFonts w:ascii="Times New Roman" w:hAnsi="Times New Roman" w:cs="Times New Roman"/>
@@ -400,7 +384,19 @@
           <w:szCs w:val="20"/>
           <w:lang w:val="en-US"/>
         </w:rPr>
-        <w:t xml:space="preserve"> }} – {{ </w:t>
+        <w:t>product.quantity</w:t>
+      </w:r>
+      <w:proofErr w:type="spellEnd"/>
+      <w:r>
+        <w:rPr>
+          <w:rFonts w:ascii="Times New Roman" w:hAnsi="Times New Roman" w:cs="Times New Roman"/>
+          <w:b/>
+          <w:bCs/>
+          <w:sz w:val="20"/>
+          <w:szCs w:val="20"/>
+          <w:lang w:val="en-US"/>
+        </w:rPr>
+        <w:t xml:space="preserve"> }} </w:t>
       </w:r>
       <w:proofErr w:type="spellStart"/>
       <w:r>
@@ -410,9 +406,52 @@
           <w:bCs/>
           <w:sz w:val="20"/>
           <w:szCs w:val="20"/>
+        </w:rPr>
+        <w:t>шт</w:t>
+      </w:r>
+      <w:proofErr w:type="spellEnd"/>
+      <w:r>
+        <w:rPr>
+          <w:rFonts w:ascii="Times New Roman" w:hAnsi="Times New Roman" w:cs="Times New Roman"/>
+          <w:b/>
+          <w:bCs/>
+          <w:sz w:val="20"/>
+          <w:szCs w:val="20"/>
           <w:lang w:val="en-US"/>
         </w:rPr>
-        <w:t>product.quantity</w:t>
+        <w:t>.</w:t>
+      </w:r>
+    </w:p>
+    <w:p>
+      <w:pPr>
+        <w:pStyle w:val="af"/>
+        <w:rPr>
+          <w:rFonts w:ascii="Times New Roman" w:hAnsi="Times New Roman" w:cs="Times New Roman"/>
+          <w:sz w:val="20"/>
+          <w:szCs w:val="20"/>
+        </w:rPr>
+      </w:pPr>
+      <w:r>
+        <w:rPr>
+          <w:rFonts w:ascii="Times New Roman" w:hAnsi="Times New Roman" w:cs="Times New Roman"/>
+          <w:b/>
+          <w:bCs/>
+          <w:sz w:val="20"/>
+          <w:szCs w:val="20"/>
+        </w:rPr>
+        <w:t xml:space="preserve">{% </w:t>
+      </w:r>
+      <w:proofErr w:type="spellStart"/>
+      <w:r>
+        <w:rPr>
+          <w:rFonts w:ascii="Times New Roman" w:hAnsi="Times New Roman" w:cs="Times New Roman"/>
+          <w:b/>
+          <w:bCs/>
+          <w:sz w:val="20"/>
+          <w:szCs w:val="20"/>
+          <w:lang w:val="en-US"/>
+        </w:rPr>
+        <w:t>endfor</w:t>
       </w:r>
       <w:proofErr w:type="spellEnd"/>
       <w:r>
@@ -422,86 +461,8 @@
           <w:bCs/>
           <w:sz w:val="20"/>
           <w:szCs w:val="20"/>
-          <w:lang w:val="en-US"/>
-        </w:rPr>
-        <w:t xml:space="preserve"> }} </w:t>
-      </w:r>
-      <w:proofErr w:type="spellStart"/>
-      <w:r>
-        <w:rPr>
-          <w:rFonts w:ascii="Times New Roman" w:hAnsi="Times New Roman" w:cs="Times New Roman"/>
-          <w:b/>
-          <w:bCs/>
-          <w:sz w:val="20"/>
-          <w:szCs w:val="20"/>
-        </w:rPr>
-        <w:t>шт</w:t>
-      </w:r>
-      <w:proofErr w:type="spellEnd"/>
-      <w:r>
-        <w:rPr>
-          <w:rFonts w:ascii="Times New Roman" w:hAnsi="Times New Roman" w:cs="Times New Roman"/>
-          <w:b/>
-          <w:bCs/>
-          <w:sz w:val="20"/>
-          <w:szCs w:val="20"/>
-          <w:lang w:val="en-US"/>
-        </w:rPr>
-        <w:t>.</w:t>
-      </w:r>
-    </w:p>
-    <w:p>
-      <w:pPr>
-        <w:pStyle w:val="af"/>
-        <w:rPr>
-          <w:rFonts w:ascii="Times New Roman" w:hAnsi="Times New Roman" w:cs="Times New Roman"/>
-          <w:sz w:val="20"/>
-          <w:szCs w:val="20"/>
-        </w:rPr>
-      </w:pPr>
-      <w:r>
-        <w:rPr>
-          <w:rFonts w:ascii="Times New Roman" w:hAnsi="Times New Roman" w:cs="Times New Roman"/>
-          <w:b/>
-          <w:bCs/>
-          <w:sz w:val="20"/>
-          <w:szCs w:val="20"/>
-        </w:rPr>
-        <w:t xml:space="preserve">{% </w:t>
-      </w:r>
-      <w:proofErr w:type="spellStart"/>
-      <w:r>
-        <w:rPr>
-          <w:rFonts w:ascii="Times New Roman" w:hAnsi="Times New Roman" w:cs="Times New Roman"/>
-          <w:b/>
-          <w:bCs/>
-          <w:sz w:val="20"/>
-          <w:szCs w:val="20"/>
-          <w:lang w:val="en-US"/>
-        </w:rPr>
-        <w:t>endfor</w:t>
-      </w:r>
-      <w:proofErr w:type="spellEnd"/>
-      <w:r>
-        <w:rPr>
-          <w:rFonts w:ascii="Times New Roman" w:hAnsi="Times New Roman" w:cs="Times New Roman"/>
-          <w:b/>
-          <w:bCs/>
-          <w:sz w:val="20"/>
-          <w:szCs w:val="20"/>
-        </w:rPr>
-        <w:t xml:space="preserve"> </w:t>
-      </w:r>
-      <w:proofErr w:type="gramStart"/>
-      <w:r>
-        <w:rPr>
-          <w:rFonts w:ascii="Times New Roman" w:hAnsi="Times New Roman" w:cs="Times New Roman"/>
-          <w:b/>
-          <w:bCs/>
-          <w:sz w:val="20"/>
-          <w:szCs w:val="20"/>
-        </w:rPr>
-        <w:t>%}</w:t>
+        </w:rPr>
+        <w:t xml:space="preserve"> %}</w:t>
       </w:r>
       <w:r>
         <w:rPr>
@@ -511,7 +472,6 @@
         </w:rPr>
         <w:t>(</w:t>
       </w:r>
-      <w:proofErr w:type="gramEnd"/>
       <w:r>
         <w:rPr>
           <w:rFonts w:ascii="Times New Roman" w:hAnsi="Times New Roman" w:cs="Times New Roman"/>
@@ -642,55 +602,125 @@
           <w:sz w:val="20"/>
           <w:szCs w:val="20"/>
         </w:rPr>
-        <w:t>845</w:t>
-      </w:r>
-      <w:r>
-        <w:rPr>
-          <w:rFonts w:ascii="Times New Roman" w:hAnsi="Times New Roman" w:cs="Times New Roman"/>
-          <w:sz w:val="20"/>
-          <w:szCs w:val="20"/>
-        </w:rPr>
-        <w:t xml:space="preserve"> 000</w:t>
-      </w:r>
-      <w:r>
-        <w:rPr>
-          <w:rFonts w:ascii="Times New Roman" w:hAnsi="Times New Roman" w:cs="Times New Roman"/>
-          <w:sz w:val="20"/>
-          <w:szCs w:val="20"/>
-        </w:rPr>
-        <w:t>,00</w:t>
-      </w:r>
-      <w:r>
-        <w:rPr>
-          <w:rFonts w:ascii="Times New Roman" w:hAnsi="Times New Roman" w:cs="Times New Roman"/>
-          <w:sz w:val="20"/>
-          <w:szCs w:val="20"/>
-        </w:rPr>
-        <w:t xml:space="preserve"> (</w:t>
-      </w:r>
-      <w:r>
-        <w:rPr>
-          <w:rFonts w:ascii="Times New Roman" w:hAnsi="Times New Roman" w:cs="Times New Roman"/>
-          <w:sz w:val="20"/>
-          <w:szCs w:val="20"/>
-        </w:rPr>
-        <w:t>Восемьсот сорок пять тысяч</w:t>
-      </w:r>
-      <w:r>
-        <w:rPr>
-          <w:rFonts w:ascii="Times New Roman" w:hAnsi="Times New Roman" w:cs="Times New Roman"/>
-          <w:sz w:val="20"/>
-          <w:szCs w:val="20"/>
-        </w:rPr>
-        <w:t xml:space="preserve">) </w:t>
-      </w:r>
-      <w:r>
-        <w:rPr>
-          <w:rFonts w:ascii="Times New Roman" w:hAnsi="Times New Roman" w:cs="Times New Roman"/>
-          <w:sz w:val="20"/>
-          <w:szCs w:val="20"/>
-        </w:rPr>
-        <w:t>Рублей 00 копеек</w:t>
+        <w:t xml:space="preserve">{{ </w:t>
+      </w:r>
+      <w:proofErr w:type="spellStart"/>
+      <w:r>
+        <w:rPr>
+          <w:rFonts w:ascii="Times New Roman" w:hAnsi="Times New Roman" w:cs="Times New Roman"/>
+          <w:sz w:val="20"/>
+          <w:szCs w:val="20"/>
+        </w:rPr>
+        <w:t>total</w:t>
+      </w:r>
+      <w:proofErr w:type="spellEnd"/>
+      <w:r>
+        <w:rPr>
+          <w:rFonts w:ascii="Times New Roman" w:hAnsi="Times New Roman" w:cs="Times New Roman"/>
+          <w:sz w:val="20"/>
+          <w:szCs w:val="20"/>
+        </w:rPr>
+        <w:t xml:space="preserve"> }} </w:t>
+      </w:r>
+      <w:r>
+        <w:rPr>
+          <w:rFonts w:ascii="Times New Roman" w:hAnsi="Times New Roman" w:cs="Times New Roman"/>
+          <w:sz w:val="20"/>
+          <w:szCs w:val="20"/>
+        </w:rPr>
+        <w:t>(</w:t>
+      </w:r>
+      <w:r>
+        <w:rPr>
+          <w:rFonts w:ascii="Times New Roman" w:hAnsi="Times New Roman" w:cs="Times New Roman"/>
+          <w:sz w:val="20"/>
+          <w:szCs w:val="20"/>
+        </w:rPr>
+        <w:t xml:space="preserve">{{ </w:t>
+      </w:r>
+      <w:proofErr w:type="spellStart"/>
+      <w:r>
+        <w:rPr>
+          <w:rFonts w:ascii="Times New Roman" w:hAnsi="Times New Roman" w:cs="Times New Roman"/>
+          <w:sz w:val="20"/>
+          <w:szCs w:val="20"/>
+        </w:rPr>
+        <w:t>amount_words</w:t>
+      </w:r>
+      <w:proofErr w:type="spellEnd"/>
+      <w:r>
+        <w:rPr>
+          <w:rFonts w:ascii="Times New Roman" w:hAnsi="Times New Roman" w:cs="Times New Roman"/>
+          <w:sz w:val="20"/>
+          <w:szCs w:val="20"/>
+        </w:rPr>
+        <w:t xml:space="preserve"> </w:t>
+      </w:r>
+      <w:r>
+        <w:rPr>
+          <w:rFonts w:ascii="Times New Roman" w:hAnsi="Times New Roman" w:cs="Times New Roman"/>
+          <w:sz w:val="20"/>
+          <w:szCs w:val="20"/>
+        </w:rPr>
+        <w:t>}}</w:t>
+      </w:r>
+      <w:r>
+        <w:rPr>
+          <w:rFonts w:ascii="Times New Roman" w:hAnsi="Times New Roman" w:cs="Times New Roman"/>
+          <w:sz w:val="20"/>
+          <w:szCs w:val="20"/>
+        </w:rPr>
+        <w:t>)</w:t>
+      </w:r>
+      <w:r>
+        <w:rPr>
+          <w:rFonts w:ascii="Times New Roman" w:hAnsi="Times New Roman" w:cs="Times New Roman"/>
+          <w:sz w:val="20"/>
+          <w:szCs w:val="20"/>
+        </w:rPr>
+        <w:t xml:space="preserve"> </w:t>
+      </w:r>
+      <w:r>
+        <w:rPr>
+          <w:rFonts w:ascii="Times New Roman" w:hAnsi="Times New Roman" w:cs="Times New Roman"/>
+          <w:sz w:val="20"/>
+          <w:szCs w:val="20"/>
+        </w:rPr>
+        <w:t xml:space="preserve">{{ </w:t>
+      </w:r>
+      <w:proofErr w:type="spellStart"/>
+      <w:r>
+        <w:rPr>
+          <w:rFonts w:ascii="Times New Roman" w:hAnsi="Times New Roman" w:cs="Times New Roman"/>
+          <w:sz w:val="20"/>
+          <w:szCs w:val="20"/>
+        </w:rPr>
+        <w:t>currency_rub</w:t>
+      </w:r>
+      <w:proofErr w:type="spellEnd"/>
+      <w:r>
+        <w:rPr>
+          <w:rFonts w:ascii="Times New Roman" w:hAnsi="Times New Roman" w:cs="Times New Roman"/>
+          <w:sz w:val="20"/>
+          <w:szCs w:val="20"/>
+        </w:rPr>
+        <w:t xml:space="preserve"> }}</w:t>
+      </w:r>
+      <w:r>
+        <w:rPr>
+          <w:rFonts w:ascii="Times New Roman" w:hAnsi="Times New Roman" w:cs="Times New Roman"/>
+          <w:sz w:val="20"/>
+          <w:szCs w:val="20"/>
+        </w:rPr>
+        <w:t xml:space="preserve"> </w:t>
+      </w:r>
+      <w:r>
+        <w:rPr>
+          <w:rFonts w:ascii="Times New Roman" w:hAnsi="Times New Roman" w:cs="Times New Roman"/>
+          <w:sz w:val="20"/>
+          <w:szCs w:val="20"/>
+        </w:rPr>
+        <w:t>00 копеек</w:t>
       </w:r>
       <w:bookmarkEnd w:id="6"/>
       <w:bookmarkEnd w:id="7"/>
@@ -1213,25 +1243,7 @@
           <w:sz w:val="20"/>
           <w:szCs w:val="20"/>
         </w:rPr>
-        <w:t xml:space="preserve">. Доставка Оборудования не включена в стоимость Оборудования и осуществляется Покупателем самостоятельно со склада Поставщика г. Калининград, ул. Аллея Смелых 31 Г. Либо </w:t>
-      </w:r>
-      <w:proofErr w:type="gramStart"/>
-      <w:r>
-        <w:rPr>
-          <w:rFonts w:ascii="Times New Roman" w:hAnsi="Times New Roman" w:cs="Times New Roman"/>
-          <w:sz w:val="20"/>
-          <w:szCs w:val="20"/>
-        </w:rPr>
-        <w:t>на иных условиях</w:t>
-      </w:r>
-      <w:proofErr w:type="gramEnd"/>
-      <w:r>
-        <w:rPr>
-          <w:rFonts w:ascii="Times New Roman" w:hAnsi="Times New Roman" w:cs="Times New Roman"/>
-          <w:sz w:val="20"/>
-          <w:szCs w:val="20"/>
-        </w:rPr>
-        <w:t xml:space="preserve"> оговоренных в Товарных накладных.</w:t>
+        <w:t>. Доставка Оборудования не включена в стоимость Оборудования и осуществляется Покупателем самостоятельно со склада Поставщика г. Калининград, ул. Аллея Смелых 31 Г. Либо на иных условиях оговоренных в Товарных накладных.</w:t>
       </w:r>
     </w:p>
     <w:p>
@@ -1352,15 +1364,7 @@
         <w:t>1</w:t>
       </w:r>
       <w:r>
-        <w:t xml:space="preserve"> настоящего Договора, Покупатель уплачивает Поставщику неустойку в размере 0,1</w:t>
-      </w:r>
-      <w:proofErr w:type="gramStart"/>
-      <w:r>
-        <w:t>%  от</w:t>
-      </w:r>
-      <w:proofErr w:type="gramEnd"/>
-      <w:r>
-        <w:t xml:space="preserve"> суммы задолженности за каждый день просрочки.</w:t>
+        <w:t xml:space="preserve"> настоящего Договора, Покупатель уплачивает Поставщику неустойку в размере 0,1%  от суммы задолженности за каждый день просрочки.</w:t>
       </w:r>
     </w:p>
     <w:p>
@@ -1420,21 +1424,7 @@
         <w:rPr>
           <w:b/>
         </w:rPr>
-        <w:t xml:space="preserve">6.  ПОРЯДОК </w:t>
-      </w:r>
-      <w:proofErr w:type="gramStart"/>
-      <w:r>
-        <w:rPr>
-          <w:b/>
-        </w:rPr>
-        <w:t>ПРИЕМКИ  ОБОРУДОВАНИЯ</w:t>
-      </w:r>
-      <w:proofErr w:type="gramEnd"/>
-      <w:r>
-        <w:rPr>
-          <w:b/>
-        </w:rPr>
-        <w:t xml:space="preserve"> ПОКУПАТЕЛЕМ</w:t>
+        <w:t>6.  ПОРЯДОК ПРИЕМКИ  ОБОРУДОВАНИЯ ПОКУПАТЕЛЕМ</w:t>
       </w:r>
     </w:p>
     <w:p>
@@ -1529,25 +1519,7 @@
           <w:sz w:val="20"/>
           <w:szCs w:val="20"/>
         </w:rPr>
-        <w:t xml:space="preserve">6.4. Приемка Оборудования оформляется </w:t>
-      </w:r>
-      <w:proofErr w:type="gramStart"/>
-      <w:r>
-        <w:rPr>
-          <w:rFonts w:ascii="Times New Roman" w:hAnsi="Times New Roman" w:cs="Times New Roman"/>
-          <w:sz w:val="20"/>
-          <w:szCs w:val="20"/>
-        </w:rPr>
-        <w:t>Актом приема-передачи (приложение № 2)</w:t>
-      </w:r>
-      <w:proofErr w:type="gramEnd"/>
-      <w:r>
-        <w:rPr>
-          <w:rFonts w:ascii="Times New Roman" w:hAnsi="Times New Roman" w:cs="Times New Roman"/>
-          <w:sz w:val="20"/>
-          <w:szCs w:val="20"/>
-        </w:rPr>
-        <w:t xml:space="preserve"> являющимся неотъемлемой частью настоящего договора. Оборудование считается принятым Покупателем с момента подписания Акта приема-передачи. </w:t>
+        <w:t xml:space="preserve">6.4. Приемка Оборудования оформляется Актом приема-передачи (приложение № 2) являющимся неотъемлемой частью настоящего договора. Оборудование считается принятым Покупателем с момента подписания Акта приема-передачи. </w:t>
       </w:r>
     </w:p>
     <w:p>
@@ -1686,15 +1658,7 @@
       </w:r>
       <w:r>
         <w:tab/>
-        <w:t xml:space="preserve">обслуживание осуществляется </w:t>
-      </w:r>
-      <w:proofErr w:type="gramStart"/>
-      <w:r>
-        <w:t>согласно регламента</w:t>
-      </w:r>
-      <w:proofErr w:type="gramEnd"/>
-      <w:r>
-        <w:t>, рекомендованного заводом изготовителем, у официального дилера;</w:t>
+        <w:t>обслуживание осуществляется согласно регламента, рекомендованного заводом изготовителем, у официального дилера;</w:t>
       </w:r>
     </w:p>
     <w:p>
@@ -2014,25 +1978,7 @@
           <w:szCs w:val="20"/>
         </w:rPr>
         <w:tab/>
-        <w:t xml:space="preserve">Поставщик в 5-тидневный срок был письменно путем </w:t>
-      </w:r>
-      <w:proofErr w:type="gramStart"/>
-      <w:r>
-        <w:rPr>
-          <w:rFonts w:ascii="Times New Roman" w:hAnsi="Times New Roman" w:cs="Times New Roman"/>
-          <w:sz w:val="20"/>
-          <w:szCs w:val="20"/>
-        </w:rPr>
-        <w:t>электронной  почты</w:t>
-      </w:r>
-      <w:proofErr w:type="gramEnd"/>
-      <w:r>
-        <w:rPr>
-          <w:rFonts w:ascii="Times New Roman" w:hAnsi="Times New Roman" w:cs="Times New Roman"/>
-          <w:sz w:val="20"/>
-          <w:szCs w:val="20"/>
-        </w:rPr>
-        <w:t xml:space="preserve"> извещен об обнаруженных неисправностях Оборудования (произошедших поломках) и их характере;</w:t>
+        <w:t>Поставщик в 5-тидневный срок был письменно путем электронной  почты извещен об обнаруженных неисправностях Оборудования (произошедших поломках) и их характере;</w:t>
       </w:r>
     </w:p>
     <w:p>
@@ -2110,25 +2056,7 @@
           <w:sz w:val="20"/>
           <w:szCs w:val="20"/>
         </w:rPr>
-        <w:t xml:space="preserve">7.8. В случае выявления в гарантийный период недостатков </w:t>
-      </w:r>
-      <w:proofErr w:type="gramStart"/>
-      <w:r>
-        <w:rPr>
-          <w:rFonts w:ascii="Times New Roman" w:hAnsi="Times New Roman" w:cs="Times New Roman"/>
-          <w:sz w:val="20"/>
-          <w:szCs w:val="20"/>
-        </w:rPr>
-        <w:t>Оборудования,  которые</w:t>
-      </w:r>
-      <w:proofErr w:type="gramEnd"/>
-      <w:r>
-        <w:rPr>
-          <w:rFonts w:ascii="Times New Roman" w:hAnsi="Times New Roman" w:cs="Times New Roman"/>
-          <w:sz w:val="20"/>
-          <w:szCs w:val="20"/>
-        </w:rPr>
-        <w:t xml:space="preserve"> возникли не по причине нарушения Покупателем правил использования, хранения или транспортировки Оборудования,  действий третьих лиц или непреодолимой силы, Поставщик обязуется произвести бесплатный ремонт в сроки установленные законодательством РФ. </w:t>
+        <w:t xml:space="preserve">7.8. В случае выявления в гарантийный период недостатков Оборудования,  которые возникли не по причине нарушения Покупателем правил использования, хранения или транспортировки Оборудования,  действий третьих лиц или непреодолимой силы, Поставщик обязуется произвести бесплатный ремонт в сроки установленные законодательством РФ. </w:t>
       </w:r>
     </w:p>
     <w:p>
@@ -2136,15 +2064,7 @@
         <w:jc w:val="both"/>
       </w:pPr>
       <w:r>
-        <w:t xml:space="preserve">7.9. Гарантия поддерживается Поставщиком, только если техническое обслуживание Оборудования производится Покупателем в Сервисном центре Поставщика. При этом, Поставщик не отвечает за правовые действия ремонта или </w:t>
-      </w:r>
-      <w:proofErr w:type="gramStart"/>
-      <w:r>
-        <w:t>иного вмешательства</w:t>
-      </w:r>
-      <w:proofErr w:type="gramEnd"/>
-      <w:r>
-        <w:t xml:space="preserve"> произведенного Покупателем в других сервисных центрах. Обязательное (в соответствие с условиями гарантии) периодическое Техническое обслуживание Оборудования не является ремонтом.</w:t>
+        <w:t>7.9. Гарантия поддерживается Поставщиком, только если техническое обслуживание Оборудования производится Покупателем в Сервисном центре Поставщика. При этом, Поставщик не отвечает за правовые действия ремонта или иного вмешательства произведенного Покупателем в других сервисных центрах. Обязательное (в соответствие с условиями гарантии) периодическое Техническое обслуживание Оборудования не является ремонтом.</w:t>
       </w:r>
     </w:p>
     <w:p>
@@ -2654,7 +2574,6 @@
             <w:shd w:val="clear" w:color="auto" w:fill="auto"/>
           </w:tcPr>
           <w:p>
-            <w:proofErr w:type="gramStart"/>
             <w:r>
               <w:rPr>
                 <w:b/>
@@ -2677,7 +2596,6 @@
               <w:t>fio</w:t>
             </w:r>
             <w:proofErr w:type="spellEnd"/>
-            <w:proofErr w:type="gramEnd"/>
             <w:r>
               <w:rPr>
                 <w:b/>
@@ -2728,19 +2646,11 @@
                 <w:color w:val="000000"/>
               </w:rPr>
             </w:pPr>
-            <w:proofErr w:type="gramStart"/>
-            <w:r>
-              <w:rPr>
-                <w:color w:val="000000"/>
-              </w:rPr>
-              <w:t>ИНН  390702639548</w:t>
-            </w:r>
-            <w:proofErr w:type="gramEnd"/>
-            <w:r>
-              <w:rPr>
-                <w:color w:val="000000"/>
-              </w:rPr>
-              <w:t xml:space="preserve"> </w:t>
+            <w:r>
+              <w:rPr>
+                <w:color w:val="000000"/>
+              </w:rPr>
+              <w:t xml:space="preserve">ИНН  390702639548 </w:t>
             </w:r>
           </w:p>
           <w:p>
@@ -2762,19 +2672,11 @@
                 <w:color w:val="000000"/>
               </w:rPr>
             </w:pPr>
-            <w:proofErr w:type="gramStart"/>
-            <w:r>
-              <w:rPr>
-                <w:color w:val="000000"/>
-              </w:rPr>
-              <w:t>236029  г.</w:t>
-            </w:r>
-            <w:proofErr w:type="gramEnd"/>
-            <w:r>
-              <w:rPr>
-                <w:color w:val="000000"/>
-              </w:rPr>
-              <w:t xml:space="preserve"> Калининград,  ул. Тихая  д.20  кв.3</w:t>
+            <w:r>
+              <w:rPr>
+                <w:color w:val="000000"/>
+              </w:rPr>
+              <w:t>236029  г. Калининград,  ул. Тихая  д.20  кв.3</w:t>
             </w:r>
           </w:p>
           <w:p>
@@ -2800,21 +2702,7 @@
               <w:rPr>
                 <w:color w:val="000000"/>
               </w:rPr>
-              <w:t xml:space="preserve">Банк </w:t>
-            </w:r>
-            <w:proofErr w:type="gramStart"/>
-            <w:r>
-              <w:rPr>
-                <w:color w:val="000000"/>
-              </w:rPr>
-              <w:t>получателя:  Ф</w:t>
-            </w:r>
-            <w:proofErr w:type="gramEnd"/>
-            <w:r>
-              <w:rPr>
-                <w:color w:val="000000"/>
-              </w:rPr>
-              <w:t>-Л "ЕВРОПЕЙСКИЙ" ПАО "БАНК "САНКТ-ПЕТЕРБУРГ", г. КАЛИНИНГРАД</w:t>
+              <w:t>Банк получателя:  Ф-Л "ЕВРОПЕЙСКИЙ" ПАО "БАНК "САНКТ-ПЕТЕРБУРГ", г. КАЛИНИНГРАД</w:t>
             </w:r>
           </w:p>
           <w:p>
@@ -2864,77 +2752,25 @@
           </w:tcPr>
           <w:p>
             <w:pPr>
-              <w:rPr>
-                <w:color w:val="000000"/>
-                <w:sz w:val="18"/>
+              <w:pStyle w:val="af6"/>
+              <w:spacing w:before="0" w:beforeAutospacing="0" w:after="0" w:afterAutospacing="0"/>
+              <w:rPr>
+                <w:rFonts w:eastAsia="Times New Roman"/>
+                <w:color w:val="000000"/>
+                <w:sz w:val="20"/>
+                <w:szCs w:val="20"/>
+                <w:lang w:val="en-US" w:eastAsia="ar-SA"/>
               </w:rPr>
             </w:pPr>
             <w:r>
               <w:rPr>
-                <w:color w:val="000000"/>
-                <w:sz w:val="18"/>
-              </w:rPr>
-              <w:t>Калининградская область, Краснознаменский район, п. Острогожское, ул. Краснознаменская, д. 13</w:t>
-            </w:r>
-          </w:p>
-          <w:p>
-            <w:pPr>
-              <w:rPr>
-                <w:color w:val="000000"/>
-                <w:sz w:val="18"/>
-              </w:rPr>
-            </w:pPr>
-            <w:r>
-              <w:rPr>
-                <w:color w:val="000000"/>
-                <w:sz w:val="18"/>
-              </w:rPr>
-              <w:t>Паспорт серия 2710 № 331846</w:t>
-            </w:r>
-          </w:p>
-          <w:p>
-            <w:pPr>
-              <w:rPr>
-                <w:color w:val="000000"/>
-                <w:sz w:val="18"/>
-              </w:rPr>
-            </w:pPr>
-            <w:r>
-              <w:rPr>
-                <w:color w:val="000000"/>
-                <w:sz w:val="18"/>
-              </w:rPr>
-              <w:t>Отделением УФМС России по Калининградской области Краснознаменского района</w:t>
-            </w:r>
-          </w:p>
-          <w:p>
-            <w:pPr>
-              <w:rPr>
-                <w:color w:val="000000"/>
-                <w:sz w:val="18"/>
-              </w:rPr>
-            </w:pPr>
-            <w:r>
-              <w:rPr>
-                <w:color w:val="000000"/>
-                <w:sz w:val="18"/>
-              </w:rPr>
-              <w:t>Дата выдачи 08.06.2011</w:t>
-            </w:r>
-          </w:p>
-          <w:p>
-            <w:pPr>
-              <w:rPr>
-                <w:color w:val="000000"/>
-                <w:sz w:val="18"/>
-              </w:rPr>
-            </w:pPr>
-            <w:r>
-              <w:rPr>
-                <w:color w:val="000000"/>
-                <w:sz w:val="18"/>
-              </w:rPr>
-              <w:t>Код подразделения: 390-015</w:t>
+                <w:rFonts w:eastAsia="Times New Roman"/>
+                <w:color w:val="000000"/>
+                <w:sz w:val="20"/>
+                <w:szCs w:val="20"/>
+                <w:lang w:val="en-US" w:eastAsia="ar-SA"/>
+              </w:rPr>
+              <w:t>{{ address }}</w:t>
             </w:r>
           </w:p>
           <w:p>
@@ -2942,19 +2778,377 @@
               <w:pStyle w:val="af6"/>
               <w:spacing w:before="0" w:beforeAutospacing="0" w:after="0" w:afterAutospacing="0"/>
               <w:rPr>
-                <w:sz w:val="18"/>
-                <w:szCs w:val="18"/>
+                <w:rFonts w:eastAsia="Times New Roman"/>
+                <w:color w:val="000000"/>
+                <w:sz w:val="20"/>
+                <w:szCs w:val="20"/>
+                <w:lang w:val="en-US" w:eastAsia="ar-SA"/>
               </w:rPr>
             </w:pPr>
             <w:r>
               <w:rPr>
-                <w:color w:val="000000"/>
-                <w:sz w:val="18"/>
-              </w:rPr>
-              <w:t>Тел: +89632921349</w:t>
+                <w:rFonts w:eastAsia="Times New Roman"/>
+                <w:color w:val="000000"/>
+                <w:sz w:val="20"/>
+                <w:szCs w:val="20"/>
+                <w:lang w:eastAsia="ar-SA"/>
+              </w:rPr>
+              <w:t>Паспорт</w:t>
+            </w:r>
+            <w:r>
+              <w:rPr>
+                <w:rFonts w:eastAsia="Times New Roman"/>
+                <w:color w:val="000000"/>
+                <w:sz w:val="20"/>
+                <w:szCs w:val="20"/>
+                <w:lang w:val="en-US" w:eastAsia="ar-SA"/>
+              </w:rPr>
+              <w:t xml:space="preserve"> </w:t>
+            </w:r>
+            <w:r>
+              <w:rPr>
+                <w:rFonts w:eastAsia="Times New Roman"/>
+                <w:color w:val="000000"/>
+                <w:sz w:val="20"/>
+                <w:szCs w:val="20"/>
+                <w:lang w:eastAsia="ar-SA"/>
+              </w:rPr>
+              <w:t>серия</w:t>
+            </w:r>
+            <w:r>
+              <w:rPr>
+                <w:rFonts w:eastAsia="Times New Roman"/>
+                <w:color w:val="000000"/>
+                <w:sz w:val="20"/>
+                <w:szCs w:val="20"/>
+                <w:lang w:val="en-US" w:eastAsia="ar-SA"/>
+              </w:rPr>
+              <w:t xml:space="preserve"> {{</w:t>
+            </w:r>
+            <w:r>
+              <w:rPr>
+                <w:sz w:val="20"/>
+                <w:szCs w:val="20"/>
+                <w:lang w:val="en-US"/>
+              </w:rPr>
+              <w:t xml:space="preserve"> </w:t>
+            </w:r>
+            <w:proofErr w:type="spellStart"/>
+            <w:r>
+              <w:rPr>
+                <w:rFonts w:eastAsia="Times New Roman"/>
+                <w:color w:val="000000"/>
+                <w:sz w:val="20"/>
+                <w:szCs w:val="20"/>
+                <w:lang w:val="en-US" w:eastAsia="ar-SA"/>
+              </w:rPr>
+              <w:t>passport_series</w:t>
+            </w:r>
+            <w:proofErr w:type="spellEnd"/>
+            <w:r>
+              <w:rPr>
+                <w:rFonts w:eastAsia="Times New Roman"/>
+                <w:color w:val="000000"/>
+                <w:sz w:val="20"/>
+                <w:szCs w:val="20"/>
+                <w:lang w:val="en-US" w:eastAsia="ar-SA"/>
+              </w:rPr>
+              <w:t>}} № {{</w:t>
+            </w:r>
+            <w:r>
+              <w:rPr>
+                <w:sz w:val="20"/>
+                <w:szCs w:val="20"/>
+                <w:lang w:val="en-US"/>
+              </w:rPr>
+              <w:t xml:space="preserve"> </w:t>
+            </w:r>
+            <w:proofErr w:type="spellStart"/>
+            <w:r>
+              <w:rPr>
+                <w:rFonts w:eastAsia="Times New Roman"/>
+                <w:color w:val="000000"/>
+                <w:sz w:val="20"/>
+                <w:szCs w:val="20"/>
+                <w:lang w:val="en-US" w:eastAsia="ar-SA"/>
+              </w:rPr>
+              <w:t>passport_number</w:t>
+            </w:r>
+            <w:proofErr w:type="spellEnd"/>
+            <w:r>
+              <w:rPr>
+                <w:rFonts w:eastAsia="Times New Roman"/>
+                <w:color w:val="000000"/>
+                <w:sz w:val="20"/>
+                <w:szCs w:val="20"/>
+                <w:lang w:val="en-US" w:eastAsia="ar-SA"/>
+              </w:rPr>
+              <w:t xml:space="preserve"> }}</w:t>
             </w:r>
           </w:p>
-          <w:p/>
+          <w:p>
+            <w:pPr>
+              <w:pStyle w:val="af6"/>
+              <w:spacing w:before="0" w:beforeAutospacing="0" w:after="0" w:afterAutospacing="0"/>
+              <w:rPr>
+                <w:rFonts w:eastAsia="Times New Roman"/>
+                <w:color w:val="000000"/>
+                <w:sz w:val="20"/>
+                <w:szCs w:val="20"/>
+                <w:lang w:val="en-US" w:eastAsia="ar-SA"/>
+              </w:rPr>
+            </w:pPr>
+            <w:r>
+              <w:rPr>
+                <w:rFonts w:eastAsia="Times New Roman"/>
+                <w:color w:val="000000"/>
+                <w:sz w:val="20"/>
+                <w:szCs w:val="20"/>
+                <w:lang w:eastAsia="ar-SA"/>
+              </w:rPr>
+              <w:t>Выдан</w:t>
+            </w:r>
+            <w:r>
+              <w:rPr>
+                <w:rFonts w:eastAsia="Times New Roman"/>
+                <w:color w:val="000000"/>
+                <w:sz w:val="20"/>
+                <w:szCs w:val="20"/>
+                <w:lang w:val="en-US" w:eastAsia="ar-SA"/>
+              </w:rPr>
+              <w:t xml:space="preserve"> </w:t>
+            </w:r>
+            <w:r>
+              <w:rPr>
+                <w:rFonts w:eastAsia="Times New Roman"/>
+                <w:color w:val="000000"/>
+                <w:sz w:val="20"/>
+                <w:szCs w:val="20"/>
+                <w:lang w:val="en-US" w:eastAsia="ar-SA"/>
+              </w:rPr>
+              <w:t xml:space="preserve">{{ </w:t>
+            </w:r>
+            <w:proofErr w:type="spellStart"/>
+            <w:r>
+              <w:rPr>
+                <w:rFonts w:eastAsia="Times New Roman"/>
+                <w:color w:val="000000"/>
+                <w:sz w:val="20"/>
+                <w:szCs w:val="20"/>
+                <w:lang w:val="en-US" w:eastAsia="ar-SA"/>
+              </w:rPr>
+              <w:t>passport_issued</w:t>
+            </w:r>
+            <w:proofErr w:type="spellEnd"/>
+            <w:r>
+              <w:rPr>
+                <w:rFonts w:eastAsia="Times New Roman"/>
+                <w:color w:val="000000"/>
+                <w:sz w:val="20"/>
+                <w:szCs w:val="20"/>
+                <w:lang w:val="en-US" w:eastAsia="ar-SA"/>
+              </w:rPr>
+              <w:t xml:space="preserve"> }}</w:t>
+            </w:r>
+          </w:p>
+          <w:p>
+            <w:pPr>
+              <w:pStyle w:val="af6"/>
+              <w:spacing w:before="0" w:beforeAutospacing="0" w:after="0" w:afterAutospacing="0"/>
+              <w:rPr>
+                <w:rFonts w:eastAsia="Times New Roman"/>
+                <w:color w:val="000000"/>
+                <w:sz w:val="20"/>
+                <w:szCs w:val="20"/>
+                <w:lang w:val="en-US" w:eastAsia="ar-SA"/>
+              </w:rPr>
+            </w:pPr>
+            <w:r>
+              <w:rPr>
+                <w:rFonts w:eastAsia="Times New Roman"/>
+                <w:color w:val="000000"/>
+                <w:sz w:val="20"/>
+                <w:szCs w:val="20"/>
+                <w:lang w:eastAsia="ar-SA"/>
+              </w:rPr>
+              <w:t>Дата</w:t>
+            </w:r>
+            <w:r>
+              <w:rPr>
+                <w:rFonts w:eastAsia="Times New Roman"/>
+                <w:color w:val="000000"/>
+                <w:sz w:val="20"/>
+                <w:szCs w:val="20"/>
+                <w:lang w:val="en-US" w:eastAsia="ar-SA"/>
+              </w:rPr>
+              <w:t xml:space="preserve"> </w:t>
+            </w:r>
+            <w:r>
+              <w:rPr>
+                <w:rFonts w:eastAsia="Times New Roman"/>
+                <w:color w:val="000000"/>
+                <w:sz w:val="20"/>
+                <w:szCs w:val="20"/>
+                <w:lang w:eastAsia="ar-SA"/>
+              </w:rPr>
+              <w:t>выдачи</w:t>
+            </w:r>
+            <w:r>
+              <w:rPr>
+                <w:rFonts w:eastAsia="Times New Roman"/>
+                <w:color w:val="000000"/>
+                <w:sz w:val="20"/>
+                <w:szCs w:val="20"/>
+                <w:lang w:val="en-US" w:eastAsia="ar-SA"/>
+              </w:rPr>
+              <w:t xml:space="preserve">: {{ </w:t>
+            </w:r>
+            <w:proofErr w:type="spellStart"/>
+            <w:r>
+              <w:rPr>
+                <w:rFonts w:eastAsia="Times New Roman"/>
+                <w:color w:val="000000"/>
+                <w:sz w:val="20"/>
+                <w:szCs w:val="20"/>
+                <w:lang w:val="en-US" w:eastAsia="ar-SA"/>
+              </w:rPr>
+              <w:t>passport</w:t>
+            </w:r>
+            <w:r>
+              <w:rPr>
+                <w:rFonts w:eastAsia="Times New Roman"/>
+                <w:color w:val="000000"/>
+                <w:sz w:val="20"/>
+                <w:szCs w:val="20"/>
+                <w:lang w:val="en-US" w:eastAsia="ar-SA"/>
+              </w:rPr>
+              <w:t>_</w:t>
+            </w:r>
+            <w:r>
+              <w:rPr>
+                <w:rFonts w:eastAsia="Times New Roman"/>
+                <w:color w:val="000000"/>
+                <w:sz w:val="20"/>
+                <w:szCs w:val="20"/>
+                <w:lang w:val="en-US" w:eastAsia="ar-SA"/>
+              </w:rPr>
+              <w:t>date</w:t>
+            </w:r>
+            <w:proofErr w:type="spellEnd"/>
+            <w:r>
+              <w:rPr>
+                <w:rFonts w:eastAsia="Times New Roman"/>
+                <w:color w:val="000000"/>
+                <w:sz w:val="20"/>
+                <w:szCs w:val="20"/>
+                <w:lang w:val="en-US" w:eastAsia="ar-SA"/>
+              </w:rPr>
+              <w:t xml:space="preserve"> }}</w:t>
+            </w:r>
+          </w:p>
+          <w:p>
+            <w:pPr>
+              <w:pStyle w:val="af6"/>
+              <w:spacing w:before="0" w:beforeAutospacing="0" w:after="0" w:afterAutospacing="0"/>
+              <w:rPr>
+                <w:sz w:val="20"/>
+                <w:szCs w:val="20"/>
+                <w:lang w:val="en-US"/>
+              </w:rPr>
+            </w:pPr>
+            <w:r>
+              <w:rPr>
+                <w:color w:val="000000"/>
+                <w:sz w:val="20"/>
+                <w:szCs w:val="20"/>
+              </w:rPr>
+              <w:t>Код</w:t>
+            </w:r>
+            <w:r>
+              <w:rPr>
+                <w:color w:val="000000"/>
+                <w:sz w:val="20"/>
+                <w:szCs w:val="20"/>
+                <w:lang w:val="en-US"/>
+              </w:rPr>
+              <w:t xml:space="preserve"> </w:t>
+            </w:r>
+            <w:r>
+              <w:rPr>
+                <w:color w:val="000000"/>
+                <w:sz w:val="20"/>
+                <w:szCs w:val="20"/>
+              </w:rPr>
+              <w:t>подразделения</w:t>
+            </w:r>
+            <w:r>
+              <w:rPr>
+                <w:color w:val="000000"/>
+                <w:sz w:val="20"/>
+                <w:szCs w:val="20"/>
+                <w:lang w:val="en-US"/>
+              </w:rPr>
+              <w:t xml:space="preserve">: </w:t>
+            </w:r>
+            <w:r>
+              <w:rPr>
+                <w:rFonts w:eastAsia="Times New Roman"/>
+                <w:color w:val="000000"/>
+                <w:sz w:val="20"/>
+                <w:szCs w:val="20"/>
+                <w:lang w:val="en-US" w:eastAsia="ar-SA"/>
+              </w:rPr>
+              <w:t xml:space="preserve">{{ </w:t>
+            </w:r>
+            <w:proofErr w:type="spellStart"/>
+            <w:r>
+              <w:rPr>
+                <w:rFonts w:eastAsia="Times New Roman"/>
+                <w:color w:val="000000"/>
+                <w:sz w:val="20"/>
+                <w:szCs w:val="20"/>
+                <w:lang w:val="en-US" w:eastAsia="ar-SA"/>
+              </w:rPr>
+              <w:t>passport</w:t>
+            </w:r>
+            <w:r>
+              <w:rPr>
+                <w:rFonts w:eastAsia="Times New Roman"/>
+                <w:color w:val="000000"/>
+                <w:sz w:val="20"/>
+                <w:szCs w:val="20"/>
+                <w:lang w:val="en-US" w:eastAsia="ar-SA"/>
+              </w:rPr>
+              <w:t>_code</w:t>
+            </w:r>
+            <w:proofErr w:type="spellEnd"/>
+            <w:r>
+              <w:rPr>
+                <w:rFonts w:eastAsia="Times New Roman"/>
+                <w:color w:val="000000"/>
+                <w:sz w:val="20"/>
+                <w:szCs w:val="20"/>
+                <w:lang w:val="en-US" w:eastAsia="ar-SA"/>
+              </w:rPr>
+              <w:t xml:space="preserve"> }}</w:t>
+            </w:r>
+          </w:p>
+          <w:p>
+            <w:pPr>
+              <w:rPr>
+                <w:lang w:val="en-US"/>
+              </w:rPr>
+            </w:pPr>
+            <w:r>
+              <w:t>Тел</w:t>
+            </w:r>
+            <w:r>
+              <w:rPr>
+                <w:lang w:val="en-US"/>
+              </w:rPr>
+              <w:t>: {{ phone }}</w:t>
+            </w:r>
+          </w:p>
           <w:p/>
         </w:tc>
       </w:tr>
@@ -2976,29 +3170,66 @@
         <w:rPr>
           <w:color w:val="000000"/>
         </w:rPr>
-        <w:t>Лысенко Г.И.</w:t>
+        <w:t>Лысенко</w:t>
       </w:r>
       <w:r>
         <w:rPr>
           <w:color w:val="000000"/>
         </w:rPr>
-        <w:t xml:space="preserve">                                                       </w:t>
-      </w:r>
-      <w:r>
-        <w:t>_______________________</w:t>
-      </w:r>
-      <w:proofErr w:type="gramStart"/>
-      <w:r>
-        <w:t xml:space="preserve">_  </w:t>
+        <w:t xml:space="preserve"> </w:t>
+      </w:r>
+      <w:r>
+        <w:rPr>
+          <w:color w:val="000000"/>
+        </w:rPr>
+        <w:t>Г</w:t>
+      </w:r>
+      <w:r>
+        <w:rPr>
+          <w:color w:val="000000"/>
+        </w:rPr>
+        <w:t>.</w:t>
+      </w:r>
+      <w:r>
+        <w:rPr>
+          <w:color w:val="000000"/>
+        </w:rPr>
+        <w:t>И</w:t>
+      </w:r>
+      <w:r>
+        <w:rPr>
+          <w:color w:val="000000"/>
+        </w:rPr>
+        <w:t xml:space="preserve">.                                                       </w:t>
+      </w:r>
+      <w:r>
+        <w:t xml:space="preserve">________________________  </w:t>
+      </w:r>
+      <w:r>
+        <w:t xml:space="preserve">{{ </w:t>
+      </w:r>
+      <w:r>
+        <w:rPr>
+          <w:lang w:val="en-US"/>
+        </w:rPr>
+        <w:t>format</w:t>
+      </w:r>
+      <w:r>
+        <w:t>_</w:t>
       </w:r>
       <w:proofErr w:type="spellStart"/>
       <w:r>
-        <w:t>Сливец</w:t>
+        <w:rPr>
+          <w:lang w:val="en-US"/>
+        </w:rPr>
+        <w:t>fio</w:t>
       </w:r>
       <w:proofErr w:type="spellEnd"/>
-      <w:proofErr w:type="gramEnd"/>
-      <w:r>
-        <w:t xml:space="preserve"> В.В.</w:t>
+      <w:r>
+        <w:t xml:space="preserve"> }</w:t>
+      </w:r>
+      <w:r>
+        <w:t>}</w:t>
       </w:r>
     </w:p>
     <w:p>
@@ -3060,14 +3291,7 @@
         <w:rPr>
           <w:i/>
         </w:rPr>
-        <w:t xml:space="preserve">купли-продажи </w:t>
-      </w:r>
-      <w:proofErr w:type="gramStart"/>
-      <w:r>
-        <w:rPr>
-          <w:i/>
-        </w:rPr>
-        <w:t>оборудования</w:t>
+        <w:t>купли-продажи оборудования</w:t>
       </w:r>
       <w:r>
         <w:rPr>
@@ -3089,7 +3313,6 @@
         </w:rPr>
         <w:t>05</w:t>
       </w:r>
-      <w:proofErr w:type="gramEnd"/>
       <w:r>
         <w:rPr>
           <w:b/>
@@ -3199,32 +3422,161 @@
       <w:r>
         <w:t xml:space="preserve"> и </w:t>
       </w:r>
+      <w:r>
+        <w:rPr>
+          <w:b/>
+        </w:rPr>
+        <w:t>{{</w:t>
+      </w:r>
+      <w:r>
+        <w:rPr>
+          <w:b/>
+        </w:rPr>
+        <w:t xml:space="preserve"> </w:t>
+      </w:r>
       <w:proofErr w:type="spellStart"/>
       <w:r>
         <w:rPr>
           <w:b/>
-        </w:rPr>
-        <w:t>Сливец</w:t>
+          <w:lang w:val="en-US"/>
+        </w:rPr>
+        <w:t>fio</w:t>
       </w:r>
       <w:proofErr w:type="spellEnd"/>
       <w:r>
         <w:rPr>
           <w:b/>
         </w:rPr>
-        <w:t xml:space="preserve"> Виктор Викторович</w:t>
-      </w:r>
-      <w:r>
-        <w:rPr>
-          <w:b/>
-          <w:lang w:eastAsia="ru-RU"/>
-        </w:rPr>
         <w:t xml:space="preserve"> </w:t>
       </w:r>
       <w:r>
+        <w:rPr>
+          <w:b/>
+        </w:rPr>
+        <w:t>}}</w:t>
+      </w:r>
+      <w:r>
+        <w:rPr>
+          <w:b/>
+        </w:rPr>
+        <w:t xml:space="preserve"> </w:t>
+      </w:r>
+      <w:r>
         <w:t>в дальнейшем именуемое</w:t>
       </w:r>
       <w:r>
-        <w:t xml:space="preserve"> «Покупатель», действующего на основании паспорта гражданина РФ серия 2710 № 331846, выдан 08.06.2011 года</w:t>
+        <w:t xml:space="preserve"> «Покупатель», действующего на основании паспорта гражданина РФ серия </w:t>
+      </w:r>
+      <w:r>
+        <w:rPr>
+          <w:color w:val="000000"/>
+        </w:rPr>
+        <w:t>{{</w:t>
+      </w:r>
+      <w:r>
+        <w:t xml:space="preserve"> </w:t>
+      </w:r>
+      <w:r>
+        <w:rPr>
+          <w:color w:val="000000"/>
+          <w:lang w:val="en-US"/>
+        </w:rPr>
+        <w:t>passport</w:t>
+      </w:r>
+      <w:r>
+        <w:rPr>
+          <w:color w:val="000000"/>
+        </w:rPr>
+        <w:t>_</w:t>
+      </w:r>
+      <w:r>
+        <w:rPr>
+          <w:color w:val="000000"/>
+          <w:lang w:val="en-US"/>
+        </w:rPr>
+        <w:t>series</w:t>
+      </w:r>
+      <w:r>
+        <w:rPr>
+          <w:color w:val="000000"/>
+        </w:rPr>
+        <w:t>}}</w:t>
+      </w:r>
+      <w:r>
+        <w:t xml:space="preserve"> </w:t>
+      </w:r>
+      <w:r>
+        <w:rPr>
+          <w:color w:val="000000"/>
+        </w:rPr>
+        <w:t>{{</w:t>
+      </w:r>
+      <w:r>
+        <w:t xml:space="preserve"> </w:t>
+      </w:r>
+      <w:r>
+        <w:rPr>
+          <w:color w:val="000000"/>
+          <w:lang w:val="en-US"/>
+        </w:rPr>
+        <w:t>passport</w:t>
+      </w:r>
+      <w:r>
+        <w:rPr>
+          <w:color w:val="000000"/>
+        </w:rPr>
+        <w:t>_</w:t>
+      </w:r>
+      <w:r>
+        <w:rPr>
+          <w:color w:val="000000"/>
+          <w:lang w:val="en-US"/>
+        </w:rPr>
+        <w:t>number</w:t>
+      </w:r>
+      <w:r>
+        <w:rPr>
+          <w:color w:val="000000"/>
+        </w:rPr>
+        <w:t xml:space="preserve"> }}</w:t>
+      </w:r>
+      <w:r>
+        <w:t xml:space="preserve">, выдан </w:t>
+      </w:r>
+      <w:r>
+        <w:rPr>
+          <w:color w:val="000000"/>
+        </w:rPr>
+        <w:t xml:space="preserve">{{ </w:t>
+      </w:r>
+      <w:r>
+        <w:rPr>
+          <w:color w:val="000000"/>
+          <w:lang w:val="en-US"/>
+        </w:rPr>
+        <w:t>passport</w:t>
+      </w:r>
+      <w:r>
+        <w:rPr>
+          <w:color w:val="000000"/>
+        </w:rPr>
+        <w:t>_</w:t>
+      </w:r>
+      <w:r>
+        <w:rPr>
+          <w:color w:val="000000"/>
+          <w:lang w:val="en-US"/>
+        </w:rPr>
+        <w:t>date</w:t>
+      </w:r>
+      <w:r>
+        <w:rPr>
+          <w:color w:val="000000"/>
+        </w:rPr>
+        <w:t xml:space="preserve"> }}</w:t>
+      </w:r>
+      <w:r>
+        <w:t xml:space="preserve"> года</w:t>
       </w:r>
       <w:r>
         <w:t>,</w:t>
@@ -3265,44 +3617,20 @@
         <w:rPr>
           <w:b/>
         </w:rPr>
-        <w:t>05</w:t>
-      </w:r>
-      <w:r>
-        <w:rPr>
-          <w:b/>
-        </w:rPr>
-        <w:t>/</w:t>
-      </w:r>
-      <w:r>
-        <w:rPr>
-          <w:b/>
-        </w:rPr>
-        <w:t>02</w:t>
-      </w:r>
-      <w:r>
-        <w:rPr>
-          <w:b/>
-        </w:rPr>
-        <w:t>/202</w:t>
-      </w:r>
-      <w:r>
-        <w:rPr>
-          <w:b/>
-        </w:rPr>
-        <w:t>5</w:t>
-      </w:r>
-      <w:r>
-        <w:rPr>
-          <w:b/>
-        </w:rPr>
-        <w:t>/</w:t>
-      </w:r>
-      <w:proofErr w:type="gramStart"/>
-      <w:r>
-        <w:rPr>
-          <w:b/>
-        </w:rPr>
-        <w:t>М</w:t>
+        <w:t xml:space="preserve">{{ </w:t>
+      </w:r>
+      <w:r>
+        <w:rPr>
+          <w:b/>
+          <w:lang w:val="en-US"/>
+        </w:rPr>
+        <w:t>number</w:t>
+      </w:r>
+      <w:r>
+        <w:rPr>
+          <w:b/>
+        </w:rPr>
+        <w:t xml:space="preserve"> }}</w:t>
       </w:r>
       <w:r>
         <w:rPr>
@@ -3320,32 +3648,27 @@
         <w:rPr>
           <w:i/>
         </w:rPr>
-        <w:t>от</w:t>
-      </w:r>
-      <w:proofErr w:type="gramEnd"/>
+        <w:t xml:space="preserve">от  </w:t>
+      </w:r>
       <w:r>
         <w:rPr>
           <w:i/>
         </w:rPr>
-        <w:t xml:space="preserve">  «</w:t>
-      </w:r>
+        <w:t xml:space="preserve">{{ </w:t>
+      </w:r>
+      <w:proofErr w:type="spellStart"/>
       <w:r>
         <w:rPr>
           <w:i/>
         </w:rPr>
-        <w:t>05</w:t>
-      </w:r>
+        <w:t>date</w:t>
+      </w:r>
+      <w:proofErr w:type="spellEnd"/>
       <w:r>
         <w:rPr>
           <w:i/>
         </w:rPr>
-        <w:t>» февраля 2025</w:t>
-      </w:r>
-      <w:r>
-        <w:rPr>
-          <w:i/>
-        </w:rPr>
-        <w:t xml:space="preserve"> года</w:t>
+        <w:t xml:space="preserve"> }}</w:t>
       </w:r>
     </w:p>
     <w:p>
@@ -3686,16 +4009,7 @@
           <w:sz w:val="20"/>
           <w:szCs w:val="20"/>
         </w:rPr>
-        <w:t xml:space="preserve">Восемьсот сорок пять </w:t>
-      </w:r>
-      <w:proofErr w:type="gramStart"/>
-      <w:r>
-        <w:rPr>
-          <w:rFonts w:ascii="Times New Roman" w:hAnsi="Times New Roman" w:cs="Times New Roman"/>
-          <w:sz w:val="20"/>
-          <w:szCs w:val="20"/>
-        </w:rPr>
-        <w:t>тысяч</w:t>
+        <w:t>Восемьсот сорок пять тысяч</w:t>
       </w:r>
       <w:r>
         <w:rPr>
@@ -3727,16 +4041,7 @@
           <w:sz w:val="20"/>
           <w:szCs w:val="20"/>
         </w:rPr>
-        <w:t>ублей</w:t>
-      </w:r>
-      <w:proofErr w:type="gramEnd"/>
-      <w:r>
-        <w:rPr>
-          <w:rFonts w:ascii="Times New Roman" w:hAnsi="Times New Roman" w:cs="Times New Roman"/>
-          <w:sz w:val="20"/>
-          <w:szCs w:val="20"/>
-        </w:rPr>
-        <w:t xml:space="preserve"> 00 копеек</w:t>
+        <w:t>ублей 00 копеек</w:t>
       </w:r>
       <w:r>
         <w:rPr>
@@ -3786,93 +4091,47 @@
         <w:rPr>
           <w:b/>
         </w:rPr>
-        <w:t>05</w:t>
-      </w:r>
-      <w:r>
-        <w:rPr>
-          <w:b/>
-        </w:rPr>
-        <w:t>/</w:t>
-      </w:r>
-      <w:r>
-        <w:rPr>
-          <w:b/>
-        </w:rPr>
-        <w:t>02</w:t>
-      </w:r>
-      <w:r>
-        <w:rPr>
-          <w:b/>
-        </w:rPr>
-        <w:t>/202</w:t>
-      </w:r>
-      <w:r>
-        <w:rPr>
-          <w:b/>
-        </w:rPr>
-        <w:t>5</w:t>
-      </w:r>
-      <w:r>
-        <w:rPr>
-          <w:b/>
-        </w:rPr>
-        <w:t>/</w:t>
-      </w:r>
-      <w:proofErr w:type="gramStart"/>
-      <w:r>
-        <w:rPr>
-          <w:b/>
-        </w:rPr>
-        <w:t>М</w:t>
-      </w:r>
-      <w:r>
-        <w:rPr>
-          <w:b/>
-        </w:rPr>
-        <w:t xml:space="preserve"> </w:t>
-      </w:r>
-      <w:r>
-        <w:rPr>
-          <w:b/>
-        </w:rPr>
-        <w:t xml:space="preserve"> </w:t>
+        <w:t xml:space="preserve">{{ </w:t>
+      </w:r>
+      <w:proofErr w:type="spellStart"/>
+      <w:r>
+        <w:rPr>
+          <w:b/>
+        </w:rPr>
+        <w:t>number</w:t>
+      </w:r>
+      <w:proofErr w:type="spellEnd"/>
+      <w:r>
+        <w:rPr>
+          <w:b/>
+        </w:rPr>
+        <w:t xml:space="preserve"> }}  </w:t>
       </w:r>
       <w:r>
         <w:rPr>
           <w:i/>
         </w:rPr>
-        <w:t>от</w:t>
-      </w:r>
-      <w:proofErr w:type="gramEnd"/>
+        <w:t xml:space="preserve">от  </w:t>
+      </w:r>
       <w:r>
         <w:rPr>
           <w:i/>
         </w:rPr>
-        <w:t xml:space="preserve">  «</w:t>
-      </w:r>
+        <w:t xml:space="preserve">{{ </w:t>
+      </w:r>
+      <w:proofErr w:type="spellStart"/>
       <w:r>
         <w:rPr>
           <w:i/>
         </w:rPr>
-        <w:t>05</w:t>
-      </w:r>
+        <w:t>date</w:t>
+      </w:r>
+      <w:proofErr w:type="spellEnd"/>
       <w:r>
         <w:rPr>
           <w:i/>
         </w:rPr>
-        <w:t>» февраля</w:t>
-      </w:r>
-      <w:r>
-        <w:rPr>
-          <w:i/>
-        </w:rPr>
-        <w:t xml:space="preserve"> 2025</w:t>
-      </w:r>
-      <w:r>
-        <w:rPr>
-          <w:i/>
-        </w:rPr>
-        <w:t xml:space="preserve"> года</w:t>
+        <w:t xml:space="preserve"> }}</w:t>
       </w:r>
     </w:p>
     <w:p>
@@ -3997,7 +4256,6 @@
             <w:shd w:val="clear" w:color="auto" w:fill="auto"/>
           </w:tcPr>
           <w:p>
-            <w:proofErr w:type="gramStart"/>
             <w:r>
               <w:rPr>
                 <w:b/>
@@ -4020,7 +4278,6 @@
               <w:t>fio</w:t>
             </w:r>
             <w:proofErr w:type="spellEnd"/>
-            <w:proofErr w:type="gramEnd"/>
             <w:r>
               <w:rPr>
                 <w:b/>
@@ -4071,19 +4328,11 @@
                 <w:color w:val="000000"/>
               </w:rPr>
             </w:pPr>
-            <w:proofErr w:type="gramStart"/>
-            <w:r>
-              <w:rPr>
-                <w:color w:val="000000"/>
-              </w:rPr>
-              <w:t>ИНН  390702639548</w:t>
-            </w:r>
-            <w:proofErr w:type="gramEnd"/>
-            <w:r>
-              <w:rPr>
-                <w:color w:val="000000"/>
-              </w:rPr>
-              <w:t xml:space="preserve"> </w:t>
+            <w:r>
+              <w:rPr>
+                <w:color w:val="000000"/>
+              </w:rPr>
+              <w:t xml:space="preserve">ИНН  390702639548 </w:t>
             </w:r>
           </w:p>
           <w:p>
@@ -4105,19 +4354,11 @@
                 <w:color w:val="000000"/>
               </w:rPr>
             </w:pPr>
-            <w:proofErr w:type="gramStart"/>
-            <w:r>
-              <w:rPr>
-                <w:color w:val="000000"/>
-              </w:rPr>
-              <w:t>236029  г.</w:t>
-            </w:r>
-            <w:proofErr w:type="gramEnd"/>
-            <w:r>
-              <w:rPr>
-                <w:color w:val="000000"/>
-              </w:rPr>
-              <w:t xml:space="preserve"> Калининград,  ул. Тихая  д.20  кв.3</w:t>
+            <w:r>
+              <w:rPr>
+                <w:color w:val="000000"/>
+              </w:rPr>
+              <w:t>236029  г. Калининград,  ул. Тихая  д.20  кв.3</w:t>
             </w:r>
           </w:p>
           <w:p>
@@ -4143,21 +4384,7 @@
               <w:rPr>
                 <w:color w:val="000000"/>
               </w:rPr>
-              <w:t xml:space="preserve">Банк </w:t>
-            </w:r>
-            <w:proofErr w:type="gramStart"/>
-            <w:r>
-              <w:rPr>
-                <w:color w:val="000000"/>
-              </w:rPr>
-              <w:t>получателя:  Ф</w:t>
-            </w:r>
-            <w:proofErr w:type="gramEnd"/>
-            <w:r>
-              <w:rPr>
-                <w:color w:val="000000"/>
-              </w:rPr>
-              <w:t>-Л "ЕВРОПЕЙСКИЙ" ПАО "БАНК "САНКТ-ПЕТЕРБУРГ", г. КАЛИНИНГРАД</w:t>
+              <w:t>Банк получателя:  Ф-Л "ЕВРОПЕЙСКИЙ" ПАО "БАНК "САНКТ-ПЕТЕРБУРГ", г. КАЛИНИНГРАД</w:t>
             </w:r>
           </w:p>
           <w:p>
@@ -4217,7 +4444,6 @@
                 <w:lang w:val="en-US" w:eastAsia="ar-SA"/>
               </w:rPr>
             </w:pPr>
-            <w:proofErr w:type="gramStart"/>
             <w:r>
               <w:rPr>
                 <w:rFonts w:eastAsia="Times New Roman"/>
@@ -4226,18 +4452,7 @@
                 <w:szCs w:val="20"/>
                 <w:lang w:val="en-US" w:eastAsia="ar-SA"/>
               </w:rPr>
-              <w:t>{{ address</w:t>
-            </w:r>
-            <w:proofErr w:type="gramEnd"/>
-            <w:r>
-              <w:rPr>
-                <w:rFonts w:eastAsia="Times New Roman"/>
-                <w:color w:val="000000"/>
-                <w:sz w:val="20"/>
-                <w:szCs w:val="20"/>
-                <w:lang w:val="en-US" w:eastAsia="ar-SA"/>
-              </w:rPr>
-              <w:t xml:space="preserve"> }}</w:t>
+              <w:t>{{ address }}</w:t>
             </w:r>
           </w:p>
           <w:p>
@@ -4290,9 +4505,17 @@
                 <w:szCs w:val="20"/>
                 <w:lang w:val="en-US" w:eastAsia="ar-SA"/>
               </w:rPr>
+              <w:t xml:space="preserve"> {{</w:t>
+            </w:r>
+            <w:r>
+              <w:rPr>
+                <w:sz w:val="20"/>
+                <w:szCs w:val="20"/>
+                <w:lang w:val="en-US"/>
+              </w:rPr>
               <w:t xml:space="preserve"> </w:t>
             </w:r>
-            <w:proofErr w:type="gramStart"/>
+            <w:proofErr w:type="spellStart"/>
             <w:r>
               <w:rPr>
                 <w:rFonts w:eastAsia="Times New Roman"/>
@@ -4301,37 +4524,7 @@
                 <w:szCs w:val="20"/>
                 <w:lang w:val="en-US" w:eastAsia="ar-SA"/>
               </w:rPr>
-              <w:t>{{</w:t>
-            </w:r>
-            <w:r>
-              <w:rPr>
-                <w:sz w:val="20"/>
-                <w:szCs w:val="20"/>
-                <w:lang w:val="en-US"/>
-              </w:rPr>
-              <w:t xml:space="preserve"> </w:t>
-            </w:r>
-            <w:proofErr w:type="spellStart"/>
-            <w:r>
-              <w:rPr>
-                <w:rFonts w:eastAsia="Times New Roman"/>
-                <w:color w:val="000000"/>
-                <w:sz w:val="20"/>
-                <w:szCs w:val="20"/>
-                <w:lang w:val="en-US" w:eastAsia="ar-SA"/>
-              </w:rPr>
-              <w:t>passport</w:t>
-            </w:r>
-            <w:proofErr w:type="gramEnd"/>
-            <w:r>
-              <w:rPr>
-                <w:rFonts w:eastAsia="Times New Roman"/>
-                <w:color w:val="000000"/>
-                <w:sz w:val="20"/>
-                <w:szCs w:val="20"/>
-                <w:lang w:val="en-US" w:eastAsia="ar-SA"/>
-              </w:rPr>
-              <w:t>_series</w:t>
+              <w:t>passport_series</w:t>
             </w:r>
             <w:proofErr w:type="spellEnd"/>
             <w:r>
@@ -4405,7 +4598,7 @@
                 <w:szCs w:val="20"/>
                 <w:lang w:eastAsia="ar-SA"/>
               </w:rPr>
-              <w:t>Дата</w:t>
+              <w:t>Выдан</w:t>
             </w:r>
             <w:r>
               <w:rPr>
@@ -4423,10 +4616,11 @@
                 <w:color w:val="000000"/>
                 <w:sz w:val="20"/>
                 <w:szCs w:val="20"/>
-                <w:lang w:eastAsia="ar-SA"/>
-              </w:rPr>
-              <w:t>выдачи</w:t>
-            </w:r>
+                <w:lang w:val="en-US" w:eastAsia="ar-SA"/>
+              </w:rPr>
+              <w:t xml:space="preserve">{{ </w:t>
+            </w:r>
+            <w:proofErr w:type="spellStart"/>
             <w:r>
               <w:rPr>
                 <w:rFonts w:eastAsia="Times New Roman"/>
@@ -4435,50 +4629,7 @@
                 <w:szCs w:val="20"/>
                 <w:lang w:val="en-US" w:eastAsia="ar-SA"/>
               </w:rPr>
-              <w:t xml:space="preserve">: </w:t>
-            </w:r>
-            <w:proofErr w:type="gramStart"/>
-            <w:r>
-              <w:rPr>
-                <w:rFonts w:eastAsia="Times New Roman"/>
-                <w:color w:val="000000"/>
-                <w:sz w:val="20"/>
-                <w:szCs w:val="20"/>
-                <w:lang w:val="en-US" w:eastAsia="ar-SA"/>
-              </w:rPr>
-              <w:t xml:space="preserve">{{ </w:t>
-            </w:r>
-            <w:proofErr w:type="spellStart"/>
-            <w:r>
-              <w:rPr>
-                <w:rFonts w:eastAsia="Times New Roman"/>
-                <w:color w:val="000000"/>
-                <w:sz w:val="20"/>
-                <w:szCs w:val="20"/>
-                <w:lang w:val="en-US" w:eastAsia="ar-SA"/>
-              </w:rPr>
-              <w:t>passport</w:t>
-            </w:r>
-            <w:proofErr w:type="gramEnd"/>
-            <w:r>
-              <w:rPr>
-                <w:rFonts w:eastAsia="Times New Roman"/>
-                <w:color w:val="000000"/>
-                <w:sz w:val="20"/>
-                <w:szCs w:val="20"/>
-                <w:lang w:val="en-US" w:eastAsia="ar-SA"/>
-              </w:rPr>
-              <w:t>_</w:t>
-            </w:r>
-            <w:r>
-              <w:rPr>
-                <w:rFonts w:eastAsia="Times New Roman"/>
-                <w:color w:val="000000"/>
-                <w:sz w:val="20"/>
-                <w:szCs w:val="20"/>
-                <w:lang w:val="en-US" w:eastAsia="ar-SA"/>
-              </w:rPr>
-              <w:t>date</w:t>
+              <w:t>passport_issued</w:t>
             </w:r>
             <w:proofErr w:type="spellEnd"/>
             <w:r>
@@ -4497,55 +4648,52 @@
               <w:pStyle w:val="af6"/>
               <w:spacing w:before="0" w:beforeAutospacing="0" w:after="0" w:afterAutospacing="0"/>
               <w:rPr>
-                <w:sz w:val="20"/>
-                <w:szCs w:val="20"/>
-                <w:lang w:val="en-US"/>
+                <w:rFonts w:eastAsia="Times New Roman"/>
+                <w:color w:val="000000"/>
+                <w:sz w:val="20"/>
+                <w:szCs w:val="20"/>
+                <w:lang w:val="en-US" w:eastAsia="ar-SA"/>
               </w:rPr>
             </w:pPr>
             <w:r>
               <w:rPr>
-                <w:color w:val="000000"/>
-                <w:sz w:val="20"/>
-                <w:szCs w:val="20"/>
-              </w:rPr>
-              <w:t>Код</w:t>
-            </w:r>
-            <w:r>
-              <w:rPr>
-                <w:color w:val="000000"/>
-                <w:sz w:val="20"/>
-                <w:szCs w:val="20"/>
-                <w:lang w:val="en-US"/>
+                <w:rFonts w:eastAsia="Times New Roman"/>
+                <w:color w:val="000000"/>
+                <w:sz w:val="20"/>
+                <w:szCs w:val="20"/>
+                <w:lang w:eastAsia="ar-SA"/>
+              </w:rPr>
+              <w:t>Дата</w:t>
+            </w:r>
+            <w:r>
+              <w:rPr>
+                <w:rFonts w:eastAsia="Times New Roman"/>
+                <w:color w:val="000000"/>
+                <w:sz w:val="20"/>
+                <w:szCs w:val="20"/>
+                <w:lang w:val="en-US" w:eastAsia="ar-SA"/>
               </w:rPr>
               <w:t xml:space="preserve"> </w:t>
             </w:r>
             <w:r>
               <w:rPr>
-                <w:color w:val="000000"/>
-                <w:sz w:val="20"/>
-                <w:szCs w:val="20"/>
-              </w:rPr>
-              <w:t>подразделения</w:t>
-            </w:r>
-            <w:r>
-              <w:rPr>
-                <w:color w:val="000000"/>
-                <w:sz w:val="20"/>
-                <w:szCs w:val="20"/>
-                <w:lang w:val="en-US"/>
-              </w:rPr>
-              <w:t xml:space="preserve">: </w:t>
-            </w:r>
-            <w:proofErr w:type="gramStart"/>
-            <w:r>
-              <w:rPr>
                 <w:rFonts w:eastAsia="Times New Roman"/>
                 <w:color w:val="000000"/>
                 <w:sz w:val="20"/>
                 <w:szCs w:val="20"/>
+                <w:lang w:eastAsia="ar-SA"/>
+              </w:rPr>
+              <w:t>выдачи</w:t>
+            </w:r>
+            <w:r>
+              <w:rPr>
+                <w:rFonts w:eastAsia="Times New Roman"/>
+                <w:color w:val="000000"/>
+                <w:sz w:val="20"/>
+                <w:szCs w:val="20"/>
                 <w:lang w:val="en-US" w:eastAsia="ar-SA"/>
               </w:rPr>
-              <w:t xml:space="preserve">{{ </w:t>
+              <w:t xml:space="preserve">: {{ </w:t>
             </w:r>
             <w:proofErr w:type="spellStart"/>
             <w:r>
@@ -4558,7 +4706,6 @@
               </w:rPr>
               <w:t>passport</w:t>
             </w:r>
-            <w:proofErr w:type="gramEnd"/>
             <w:r>
               <w:rPr>
                 <w:rFonts w:eastAsia="Times New Roman"/>
@@ -4567,7 +4714,17 @@
                 <w:szCs w:val="20"/>
                 <w:lang w:val="en-US" w:eastAsia="ar-SA"/>
               </w:rPr>
-              <w:t>_code</w:t>
+              <w:t>_</w:t>
+            </w:r>
+            <w:r>
+              <w:rPr>
+                <w:rFonts w:eastAsia="Times New Roman"/>
+                <w:color w:val="000000"/>
+                <w:sz w:val="20"/>
+                <w:szCs w:val="20"/>
+                <w:lang w:val="en-US" w:eastAsia="ar-SA"/>
+              </w:rPr>
+              <w:t>date</w:t>
             </w:r>
             <w:proofErr w:type="spellEnd"/>
             <w:r>
@@ -4583,38 +4740,111 @@
           </w:p>
           <w:p>
             <w:pPr>
-              <w:rPr>
+              <w:pStyle w:val="af6"/>
+              <w:spacing w:before="0" w:beforeAutospacing="0" w:after="0" w:afterAutospacing="0"/>
+              <w:rPr>
+                <w:sz w:val="20"/>
+                <w:szCs w:val="20"/>
                 <w:lang w:val="en-US"/>
               </w:rPr>
             </w:pPr>
             <w:r>
+              <w:rPr>
+                <w:color w:val="000000"/>
+                <w:sz w:val="20"/>
+                <w:szCs w:val="20"/>
+              </w:rPr>
+              <w:t>Код</w:t>
+            </w:r>
+            <w:r>
+              <w:rPr>
+                <w:color w:val="000000"/>
+                <w:sz w:val="20"/>
+                <w:szCs w:val="20"/>
+                <w:lang w:val="en-US"/>
+              </w:rPr>
+              <w:t xml:space="preserve"> </w:t>
+            </w:r>
+            <w:r>
+              <w:rPr>
+                <w:color w:val="000000"/>
+                <w:sz w:val="20"/>
+                <w:szCs w:val="20"/>
+              </w:rPr>
+              <w:t>подразделения</w:t>
+            </w:r>
+            <w:r>
+              <w:rPr>
+                <w:color w:val="000000"/>
+                <w:sz w:val="20"/>
+                <w:szCs w:val="20"/>
+                <w:lang w:val="en-US"/>
+              </w:rPr>
+              <w:t xml:space="preserve">: </w:t>
+            </w:r>
+            <w:r>
+              <w:rPr>
+                <w:rFonts w:eastAsia="Times New Roman"/>
+                <w:color w:val="000000"/>
+                <w:sz w:val="20"/>
+                <w:szCs w:val="20"/>
+                <w:lang w:val="en-US" w:eastAsia="ar-SA"/>
+              </w:rPr>
+              <w:t xml:space="preserve">{{ </w:t>
+            </w:r>
+            <w:proofErr w:type="spellStart"/>
+            <w:r>
+              <w:rPr>
+                <w:rFonts w:eastAsia="Times New Roman"/>
+                <w:color w:val="000000"/>
+                <w:sz w:val="20"/>
+                <w:szCs w:val="20"/>
+                <w:lang w:val="en-US" w:eastAsia="ar-SA"/>
+              </w:rPr>
+              <w:t>passport</w:t>
+            </w:r>
+            <w:r>
+              <w:rPr>
+                <w:rFonts w:eastAsia="Times New Roman"/>
+                <w:color w:val="000000"/>
+                <w:sz w:val="20"/>
+                <w:szCs w:val="20"/>
+                <w:lang w:val="en-US" w:eastAsia="ar-SA"/>
+              </w:rPr>
+              <w:t>_code</w:t>
+            </w:r>
+            <w:proofErr w:type="spellEnd"/>
+            <w:r>
+              <w:rPr>
+                <w:rFonts w:eastAsia="Times New Roman"/>
+                <w:color w:val="000000"/>
+                <w:sz w:val="20"/>
+                <w:szCs w:val="20"/>
+                <w:lang w:val="en-US" w:eastAsia="ar-SA"/>
+              </w:rPr>
+              <w:t xml:space="preserve"> }}</w:t>
+            </w:r>
+          </w:p>
+          <w:p>
+            <w:pPr>
+              <w:rPr>
+                <w:lang w:val="en-US"/>
+              </w:rPr>
+            </w:pPr>
+            <w:r>
               <w:t>Тел</w:t>
             </w:r>
             <w:r>
               <w:rPr>
                 <w:lang w:val="en-US"/>
               </w:rPr>
-              <w:t xml:space="preserve">: </w:t>
-            </w:r>
-            <w:proofErr w:type="gramStart"/>
+              <w:t>: {{</w:t>
+            </w:r>
             <w:r>
               <w:rPr>
                 <w:lang w:val="en-US"/>
               </w:rPr>
-              <w:t>{{</w:t>
-            </w:r>
-            <w:r>
-              <w:rPr>
-                <w:lang w:val="en-US"/>
-              </w:rPr>
-              <w:t xml:space="preserve"> phone</w:t>
-            </w:r>
-            <w:proofErr w:type="gramEnd"/>
-            <w:r>
-              <w:rPr>
-                <w:lang w:val="en-US"/>
-              </w:rPr>
-              <w:t xml:space="preserve"> </w:t>
+              <w:t xml:space="preserve"> phone </w:t>
             </w:r>
             <w:r>
               <w:rPr>
@@ -4659,20 +4889,30 @@
         <w:t xml:space="preserve">                                                       </w:t>
       </w:r>
       <w:r>
-        <w:t>_______________________</w:t>
-      </w:r>
-      <w:proofErr w:type="gramStart"/>
-      <w:r>
-        <w:t xml:space="preserve">_  </w:t>
+        <w:t xml:space="preserve">________________________  </w:t>
+      </w:r>
+      <w:r>
+        <w:t xml:space="preserve">{{ </w:t>
+      </w:r>
+      <w:r>
+        <w:rPr>
+          <w:lang w:val="en-US"/>
+        </w:rPr>
+        <w:t>format</w:t>
+      </w:r>
+      <w:r>
+        <w:t>_</w:t>
       </w:r>
       <w:proofErr w:type="spellStart"/>
       <w:r>
-        <w:t>Сливец</w:t>
+        <w:rPr>
+          <w:lang w:val="en-US"/>
+        </w:rPr>
+        <w:t>fio</w:t>
       </w:r>
       <w:proofErr w:type="spellEnd"/>
-      <w:proofErr w:type="gramEnd"/>
-      <w:r>
-        <w:t xml:space="preserve"> В.В.</w:t>
+      <w:r>
+        <w:t xml:space="preserve"> }}</w:t>
       </w:r>
     </w:p>
     <w:p>
@@ -4783,81 +5023,73 @@
         <w:rPr>
           <w:b/>
         </w:rPr>
-        <w:t>05</w:t>
-      </w:r>
-      <w:r>
-        <w:rPr>
-          <w:b/>
-        </w:rPr>
-        <w:t>/</w:t>
-      </w:r>
-      <w:r>
-        <w:rPr>
-          <w:b/>
-        </w:rPr>
-        <w:t>02</w:t>
-      </w:r>
-      <w:r>
-        <w:rPr>
-          <w:b/>
-        </w:rPr>
-        <w:t>/202</w:t>
-      </w:r>
-      <w:r>
-        <w:rPr>
-          <w:b/>
-        </w:rPr>
-        <w:t>5</w:t>
-      </w:r>
-      <w:r>
-        <w:rPr>
-          <w:b/>
-        </w:rPr>
-        <w:t>/</w:t>
-      </w:r>
-      <w:proofErr w:type="gramStart"/>
-      <w:r>
-        <w:rPr>
-          <w:b/>
-        </w:rPr>
-        <w:t xml:space="preserve">М </w:t>
-      </w:r>
-      <w:r>
-        <w:rPr>
-          <w:b/>
-        </w:rPr>
+        <w:t>{{</w:t>
+      </w:r>
+      <w:r>
         <w:t xml:space="preserve"> </w:t>
       </w:r>
       <w:r>
         <w:rPr>
+          <w:b/>
+          <w:lang w:val="en-US"/>
+        </w:rPr>
+        <w:t>number</w:t>
+      </w:r>
+      <w:r>
+        <w:rPr>
+          <w:b/>
+        </w:rPr>
+        <w:t xml:space="preserve"> </w:t>
+      </w:r>
+      <w:r>
+        <w:rPr>
+          <w:b/>
+        </w:rPr>
+        <w:t>}}</w:t>
+      </w:r>
+      <w:r>
+        <w:rPr>
+          <w:b/>
+        </w:rPr>
+        <w:t xml:space="preserve"> </w:t>
+      </w:r>
+      <w:r>
+        <w:rPr>
+          <w:b/>
+        </w:rPr>
+        <w:t xml:space="preserve"> </w:t>
+      </w:r>
+      <w:r>
+        <w:rPr>
+          <w:b/>
+        </w:rPr>
+        <w:t xml:space="preserve"> </w:t>
+      </w:r>
+      <w:r>
+        <w:rPr>
           <w:i/>
         </w:rPr>
-        <w:t>от</w:t>
-      </w:r>
-      <w:proofErr w:type="gramEnd"/>
+        <w:t xml:space="preserve">от  </w:t>
+      </w:r>
       <w:r>
         <w:rPr>
           <w:i/>
         </w:rPr>
-        <w:t xml:space="preserve">  «</w:t>
-      </w:r>
+        <w:t xml:space="preserve">{{ </w:t>
+      </w:r>
+      <w:proofErr w:type="spellStart"/>
       <w:r>
         <w:rPr>
           <w:i/>
         </w:rPr>
-        <w:t>05</w:t>
-      </w:r>
+        <w:t>date</w:t>
+      </w:r>
+      <w:proofErr w:type="spellEnd"/>
       <w:r>
         <w:rPr>
           <w:i/>
         </w:rPr>
-        <w:t>» февраля 2025</w:t>
-      </w:r>
-      <w:r>
-        <w:rPr>
-          <w:i/>
-        </w:rPr>
-        <w:t xml:space="preserve"> года</w:t>
+        <w:t xml:space="preserve"> }}</w:t>
       </w:r>
     </w:p>
     <w:p>
@@ -4906,18 +5138,10 @@
         <w:jc w:val="both"/>
       </w:pPr>
       <w:r>
-        <w:t xml:space="preserve">г. Калининград                                                                                                                       </w:t>
-      </w:r>
-      <w:proofErr w:type="gramStart"/>
-      <w:r>
-        <w:t xml:space="preserve">   </w:t>
-      </w:r>
-      <w:r>
-        <w:t>«</w:t>
-      </w:r>
-      <w:proofErr w:type="gramEnd"/>
-      <w:r>
-        <w:t>__»_______  202</w:t>
+        <w:t xml:space="preserve">г. Калининград                                                                                                                          </w:t>
+      </w:r>
+      <w:r>
+        <w:t>«__»_______  202</w:t>
       </w:r>
       <w:r>
         <w:t>5</w:t>
@@ -4949,19 +5173,38 @@
       <w:r>
         <w:t xml:space="preserve"> и </w:t>
       </w:r>
+      <w:r>
+        <w:rPr>
+          <w:b/>
+        </w:rPr>
+        <w:t>{{</w:t>
+      </w:r>
+      <w:r>
+        <w:rPr>
+          <w:b/>
+        </w:rPr>
+        <w:t xml:space="preserve"> </w:t>
+      </w:r>
       <w:proofErr w:type="spellStart"/>
       <w:r>
         <w:rPr>
           <w:b/>
-        </w:rPr>
-        <w:t>Сливец</w:t>
+          <w:lang w:val="en-US"/>
+        </w:rPr>
+        <w:t>fio</w:t>
       </w:r>
       <w:proofErr w:type="spellEnd"/>
       <w:r>
         <w:rPr>
           <w:b/>
         </w:rPr>
-        <w:t xml:space="preserve"> Виктор Викторович</w:t>
+        <w:t xml:space="preserve"> </w:t>
+      </w:r>
+      <w:r>
+        <w:rPr>
+          <w:b/>
+        </w:rPr>
+        <w:t>}}</w:t>
       </w:r>
       <w:r>
         <w:rPr>
@@ -4974,7 +5217,91 @@
         <w:t>в дальнейшем именуемое</w:t>
       </w:r>
       <w:r>
-        <w:t xml:space="preserve"> «Покупатель», действующего на основании паспорта гражданина РФ серия 2710 № 331846, выдан 08.06.2011 года</w:t>
+        <w:t xml:space="preserve"> «Покупатель», действующего на основании паспорта гражданина РФ серия </w:t>
+      </w:r>
+      <w:r>
+        <w:rPr>
+          <w:color w:val="000000"/>
+        </w:rPr>
+        <w:t>{{</w:t>
+      </w:r>
+      <w:r>
+        <w:t xml:space="preserve"> </w:t>
+      </w:r>
+      <w:r>
+        <w:rPr>
+          <w:color w:val="000000"/>
+          <w:lang w:val="en-US"/>
+        </w:rPr>
+        <w:t>passport</w:t>
+      </w:r>
+      <w:r>
+        <w:rPr>
+          <w:color w:val="000000"/>
+        </w:rPr>
+        <w:t>_</w:t>
+      </w:r>
+      <w:r>
+        <w:rPr>
+          <w:color w:val="000000"/>
+          <w:lang w:val="en-US"/>
+        </w:rPr>
+        <w:t>series</w:t>
+      </w:r>
+      <w:r>
+        <w:rPr>
+          <w:color w:val="000000"/>
+        </w:rPr>
+        <w:t>}}</w:t>
+      </w:r>
+      <w:r>
+        <w:t xml:space="preserve"> № </w:t>
+      </w:r>
+      <w:r>
+        <w:t xml:space="preserve">{{ </w:t>
+      </w:r>
+      <w:proofErr w:type="spellStart"/>
+      <w:r>
+        <w:t>passport_number</w:t>
+      </w:r>
+      <w:proofErr w:type="spellEnd"/>
+      <w:r>
+        <w:t xml:space="preserve"> }}</w:t>
+      </w:r>
+      <w:r>
+        <w:t xml:space="preserve">, выдан </w:t>
+      </w:r>
+      <w:r>
+        <w:rPr>
+          <w:color w:val="000000"/>
+        </w:rPr>
+        <w:t xml:space="preserve">{{ </w:t>
+      </w:r>
+      <w:r>
+        <w:rPr>
+          <w:color w:val="000000"/>
+          <w:lang w:val="en-US"/>
+        </w:rPr>
+        <w:t>passport</w:t>
+      </w:r>
+      <w:r>
+        <w:rPr>
+          <w:color w:val="000000"/>
+        </w:rPr>
+        <w:t>_</w:t>
+      </w:r>
+      <w:r>
+        <w:rPr>
+          <w:color w:val="000000"/>
+          <w:lang w:val="en-US"/>
+        </w:rPr>
+        <w:t>date</w:t>
+      </w:r>
+      <w:r>
+        <w:rPr>
+          <w:color w:val="000000"/>
+        </w:rPr>
+        <w:t xml:space="preserve"> }}</w:t>
       </w:r>
       <w:r>
         <w:t xml:space="preserve">, </w:t>
@@ -5019,81 +5346,61 @@
         <w:rPr>
           <w:b/>
         </w:rPr>
-        <w:t>05</w:t>
-      </w:r>
-      <w:r>
-        <w:rPr>
-          <w:b/>
-        </w:rPr>
-        <w:t>/</w:t>
-      </w:r>
-      <w:r>
-        <w:rPr>
-          <w:b/>
-        </w:rPr>
-        <w:t>02</w:t>
-      </w:r>
-      <w:r>
-        <w:rPr>
-          <w:b/>
-        </w:rPr>
-        <w:t>/202</w:t>
-      </w:r>
-      <w:r>
-        <w:rPr>
-          <w:b/>
-        </w:rPr>
-        <w:t>5</w:t>
-      </w:r>
-      <w:r>
-        <w:rPr>
-          <w:b/>
-        </w:rPr>
-        <w:t>/</w:t>
-      </w:r>
-      <w:proofErr w:type="gramStart"/>
-      <w:r>
-        <w:rPr>
-          <w:b/>
-        </w:rPr>
-        <w:t xml:space="preserve">М </w:t>
-      </w:r>
-      <w:r>
-        <w:rPr>
-          <w:b/>
-        </w:rPr>
+        <w:t>{{</w:t>
+      </w:r>
+      <w:r>
         <w:t xml:space="preserve"> </w:t>
       </w:r>
       <w:r>
         <w:rPr>
+          <w:b/>
+          <w:lang w:val="en-US"/>
+        </w:rPr>
+        <w:t>number</w:t>
+      </w:r>
+      <w:r>
+        <w:rPr>
+          <w:b/>
+        </w:rPr>
+        <w:t xml:space="preserve"> </w:t>
+      </w:r>
+      <w:r>
+        <w:rPr>
+          <w:b/>
+        </w:rPr>
+        <w:t>}}</w:t>
+      </w:r>
+      <w:r>
+        <w:rPr>
+          <w:b/>
+        </w:rPr>
+        <w:t xml:space="preserve"> </w:t>
+      </w:r>
+      <w:r>
+        <w:rPr>
           <w:i/>
         </w:rPr>
-        <w:t>от</w:t>
-      </w:r>
-      <w:proofErr w:type="gramEnd"/>
+        <w:t xml:space="preserve">от  </w:t>
+      </w:r>
       <w:r>
         <w:rPr>
           <w:i/>
         </w:rPr>
-        <w:t xml:space="preserve">  «</w:t>
-      </w:r>
+        <w:t xml:space="preserve">{{ </w:t>
+      </w:r>
+      <w:proofErr w:type="spellStart"/>
       <w:r>
         <w:rPr>
           <w:i/>
         </w:rPr>
-        <w:t>05</w:t>
-      </w:r>
+        <w:t>date</w:t>
+      </w:r>
+      <w:proofErr w:type="spellEnd"/>
       <w:r>
         <w:rPr>
           <w:i/>
         </w:rPr>
-        <w:t>» февраля 2025</w:t>
-      </w:r>
-      <w:r>
-        <w:rPr>
-          <w:i/>
-        </w:rPr>
-        <w:t xml:space="preserve"> года</w:t>
+        <w:t xml:space="preserve"> }}</w:t>
       </w:r>
     </w:p>
     <w:p>
@@ -5441,11 +5748,7 @@
         <w:t xml:space="preserve">. Настоящий акт является неотъемлемой частью договора купли-продажи оборудования </w:t>
       </w:r>
       <w:r>
-        <w:t xml:space="preserve">купли-продажи </w:t>
-      </w:r>
-      <w:proofErr w:type="gramStart"/>
-      <w:r>
-        <w:t xml:space="preserve">оборудования </w:t>
+        <w:t xml:space="preserve">купли-продажи оборудования </w:t>
       </w:r>
       <w:r>
         <w:t xml:space="preserve"> </w:t>
@@ -5454,38 +5757,21 @@
         <w:rPr>
           <w:b/>
         </w:rPr>
-        <w:t>05</w:t>
-      </w:r>
-      <w:proofErr w:type="gramEnd"/>
-      <w:r>
-        <w:rPr>
-          <w:b/>
-        </w:rPr>
-        <w:t>/</w:t>
-      </w:r>
-      <w:r>
-        <w:rPr>
-          <w:b/>
-        </w:rPr>
-        <w:t>02</w:t>
-      </w:r>
-      <w:r>
-        <w:rPr>
-          <w:b/>
-        </w:rPr>
-        <w:t>/202</w:t>
-      </w:r>
-      <w:r>
-        <w:rPr>
-          <w:b/>
-        </w:rPr>
-        <w:t>5</w:t>
-      </w:r>
-      <w:r>
-        <w:rPr>
-          <w:b/>
-        </w:rPr>
-        <w:t xml:space="preserve">/М </w:t>
+        <w:t xml:space="preserve">{{ </w:t>
+      </w:r>
+      <w:proofErr w:type="spellStart"/>
+      <w:r>
+        <w:rPr>
+          <w:b/>
+        </w:rPr>
+        <w:t>number</w:t>
+      </w:r>
+      <w:proofErr w:type="spellEnd"/>
+      <w:r>
+        <w:rPr>
+          <w:b/>
+        </w:rPr>
+        <w:t xml:space="preserve"> }} </w:t>
       </w:r>
       <w:r>
         <w:rPr>
@@ -5497,25 +5783,27 @@
         <w:rPr>
           <w:i/>
         </w:rPr>
-        <w:t>от  «</w:t>
+        <w:t xml:space="preserve">от  </w:t>
       </w:r>
       <w:r>
         <w:rPr>
           <w:i/>
         </w:rPr>
-        <w:t>05</w:t>
-      </w:r>
+        <w:t xml:space="preserve">{{ </w:t>
+      </w:r>
+      <w:proofErr w:type="spellStart"/>
       <w:r>
         <w:rPr>
           <w:i/>
         </w:rPr>
-        <w:t>» февраля 2025</w:t>
-      </w:r>
+        <w:t>date</w:t>
+      </w:r>
+      <w:proofErr w:type="spellEnd"/>
       <w:r>
         <w:rPr>
           <w:i/>
         </w:rPr>
-        <w:t xml:space="preserve"> года</w:t>
+        <w:t xml:space="preserve"> }}</w:t>
       </w:r>
       <w:r>
         <w:rPr>
@@ -5653,19 +5941,40 @@
             <w:shd w:val="clear" w:color="auto" w:fill="auto"/>
           </w:tcPr>
           <w:p>
+            <w:r>
+              <w:rPr>
+                <w:b/>
+              </w:rPr>
+              <w:t>{{</w:t>
+            </w:r>
+            <w:r>
+              <w:rPr>
+                <w:b/>
+                <w:lang w:val="en-US"/>
+              </w:rPr>
+              <w:t xml:space="preserve"> </w:t>
+            </w:r>
             <w:proofErr w:type="spellStart"/>
             <w:r>
               <w:rPr>
                 <w:b/>
-              </w:rPr>
-              <w:t>Сливец</w:t>
+                <w:lang w:val="en-US"/>
+              </w:rPr>
+              <w:t>fio</w:t>
             </w:r>
             <w:proofErr w:type="spellEnd"/>
             <w:r>
               <w:rPr>
                 <w:b/>
-              </w:rPr>
-              <w:t xml:space="preserve"> Виктор Викторович</w:t>
+                <w:lang w:val="en-US"/>
+              </w:rPr>
+              <w:t xml:space="preserve"> </w:t>
+            </w:r>
+            <w:r>
+              <w:rPr>
+                <w:b/>
+              </w:rPr>
+              <w:t>}}</w:t>
             </w:r>
           </w:p>
         </w:tc>
@@ -5704,19 +6013,11 @@
                 <w:color w:val="000000"/>
               </w:rPr>
             </w:pPr>
-            <w:proofErr w:type="gramStart"/>
-            <w:r>
-              <w:rPr>
-                <w:color w:val="000000"/>
-              </w:rPr>
-              <w:t>ИНН  390702639548</w:t>
-            </w:r>
-            <w:proofErr w:type="gramEnd"/>
-            <w:r>
-              <w:rPr>
-                <w:color w:val="000000"/>
-              </w:rPr>
-              <w:t xml:space="preserve"> </w:t>
+            <w:r>
+              <w:rPr>
+                <w:color w:val="000000"/>
+              </w:rPr>
+              <w:t xml:space="preserve">ИНН  390702639548 </w:t>
             </w:r>
           </w:p>
           <w:p>
@@ -5738,19 +6039,11 @@
                 <w:color w:val="000000"/>
               </w:rPr>
             </w:pPr>
-            <w:proofErr w:type="gramStart"/>
-            <w:r>
-              <w:rPr>
-                <w:color w:val="000000"/>
-              </w:rPr>
-              <w:t>236029  г.</w:t>
-            </w:r>
-            <w:proofErr w:type="gramEnd"/>
-            <w:r>
-              <w:rPr>
-                <w:color w:val="000000"/>
-              </w:rPr>
-              <w:t xml:space="preserve"> Калининград,  ул. Тихая  д.20  кв.3</w:t>
+            <w:r>
+              <w:rPr>
+                <w:color w:val="000000"/>
+              </w:rPr>
+              <w:t>236029  г. Калининград,  ул. Тихая  д.20  кв.3</w:t>
             </w:r>
           </w:p>
           <w:p>
@@ -5776,21 +6069,7 @@
               <w:rPr>
                 <w:color w:val="000000"/>
               </w:rPr>
-              <w:t xml:space="preserve">Банк </w:t>
-            </w:r>
-            <w:proofErr w:type="gramStart"/>
-            <w:r>
-              <w:rPr>
-                <w:color w:val="000000"/>
-              </w:rPr>
-              <w:t>получателя:  Ф</w:t>
-            </w:r>
-            <w:proofErr w:type="gramEnd"/>
-            <w:r>
-              <w:rPr>
-                <w:color w:val="000000"/>
-              </w:rPr>
-              <w:t>-Л "ЕВРОПЕЙСКИЙ" ПАО "БАНК "САНКТ-ПЕТЕРБУРГ", г. КАЛИНИНГРАД</w:t>
+              <w:t>Банк получателя:  Ф-Л "ЕВРОПЕЙСКИЙ" ПАО "БАНК "САНКТ-ПЕТЕРБУРГ", г. КАЛИНИНГРАД</w:t>
             </w:r>
           </w:p>
           <w:p>
@@ -5840,107 +6119,410 @@
           </w:tcPr>
           <w:p>
             <w:pPr>
-              <w:rPr>
-                <w:color w:val="000000"/>
-                <w:sz w:val="18"/>
+              <w:pStyle w:val="af6"/>
+              <w:spacing w:before="0" w:beforeAutospacing="0" w:after="0" w:afterAutospacing="0"/>
+              <w:rPr>
+                <w:rFonts w:eastAsia="Times New Roman"/>
+                <w:color w:val="000000"/>
+                <w:sz w:val="20"/>
+                <w:szCs w:val="20"/>
+                <w:lang w:val="en-US" w:eastAsia="ar-SA"/>
               </w:rPr>
             </w:pPr>
             <w:r>
               <w:rPr>
-                <w:color w:val="000000"/>
-                <w:sz w:val="18"/>
-              </w:rPr>
-              <w:t>Калининградская область, Краснознаменский район, п. Острогожское, ул. Краснознаменская, д. 13</w:t>
+                <w:rFonts w:eastAsia="Times New Roman"/>
+                <w:color w:val="000000"/>
+                <w:sz w:val="20"/>
+                <w:szCs w:val="20"/>
+                <w:lang w:val="en-US" w:eastAsia="ar-SA"/>
+              </w:rPr>
+              <w:t>{{ address }}</w:t>
             </w:r>
           </w:p>
           <w:p>
             <w:pPr>
-              <w:rPr>
-                <w:color w:val="000000"/>
-                <w:sz w:val="18"/>
+              <w:pStyle w:val="af6"/>
+              <w:spacing w:before="0" w:beforeAutospacing="0" w:after="0" w:afterAutospacing="0"/>
+              <w:rPr>
+                <w:rFonts w:eastAsia="Times New Roman"/>
+                <w:color w:val="000000"/>
+                <w:sz w:val="20"/>
+                <w:szCs w:val="20"/>
+                <w:lang w:val="en-US" w:eastAsia="ar-SA"/>
               </w:rPr>
             </w:pPr>
             <w:r>
               <w:rPr>
-                <w:color w:val="000000"/>
-                <w:sz w:val="18"/>
-              </w:rPr>
-              <w:t>Паспорт серия 2710 № 331846</w:t>
+                <w:rFonts w:eastAsia="Times New Roman"/>
+                <w:color w:val="000000"/>
+                <w:sz w:val="20"/>
+                <w:szCs w:val="20"/>
+                <w:lang w:eastAsia="ar-SA"/>
+              </w:rPr>
+              <w:t>Паспорт</w:t>
+            </w:r>
+            <w:r>
+              <w:rPr>
+                <w:rFonts w:eastAsia="Times New Roman"/>
+                <w:color w:val="000000"/>
+                <w:sz w:val="20"/>
+                <w:szCs w:val="20"/>
+                <w:lang w:val="en-US" w:eastAsia="ar-SA"/>
+              </w:rPr>
+              <w:t xml:space="preserve"> </w:t>
+            </w:r>
+            <w:r>
+              <w:rPr>
+                <w:rFonts w:eastAsia="Times New Roman"/>
+                <w:color w:val="000000"/>
+                <w:sz w:val="20"/>
+                <w:szCs w:val="20"/>
+                <w:lang w:eastAsia="ar-SA"/>
+              </w:rPr>
+              <w:t>серия</w:t>
+            </w:r>
+            <w:r>
+              <w:rPr>
+                <w:rFonts w:eastAsia="Times New Roman"/>
+                <w:color w:val="000000"/>
+                <w:sz w:val="20"/>
+                <w:szCs w:val="20"/>
+                <w:lang w:val="en-US" w:eastAsia="ar-SA"/>
+              </w:rPr>
+              <w:t xml:space="preserve"> {{</w:t>
+            </w:r>
+            <w:r>
+              <w:rPr>
+                <w:sz w:val="20"/>
+                <w:szCs w:val="20"/>
+                <w:lang w:val="en-US"/>
+              </w:rPr>
+              <w:t xml:space="preserve"> </w:t>
+            </w:r>
+            <w:proofErr w:type="spellStart"/>
+            <w:r>
+              <w:rPr>
+                <w:rFonts w:eastAsia="Times New Roman"/>
+                <w:color w:val="000000"/>
+                <w:sz w:val="20"/>
+                <w:szCs w:val="20"/>
+                <w:lang w:val="en-US" w:eastAsia="ar-SA"/>
+              </w:rPr>
+              <w:t>passport_series</w:t>
+            </w:r>
+            <w:proofErr w:type="spellEnd"/>
+            <w:r>
+              <w:rPr>
+                <w:rFonts w:eastAsia="Times New Roman"/>
+                <w:color w:val="000000"/>
+                <w:sz w:val="20"/>
+                <w:szCs w:val="20"/>
+                <w:lang w:val="en-US" w:eastAsia="ar-SA"/>
+              </w:rPr>
+              <w:t>}} № {{</w:t>
+            </w:r>
+            <w:r>
+              <w:rPr>
+                <w:sz w:val="20"/>
+                <w:szCs w:val="20"/>
+                <w:lang w:val="en-US"/>
+              </w:rPr>
+              <w:t xml:space="preserve"> </w:t>
+            </w:r>
+            <w:proofErr w:type="spellStart"/>
+            <w:r>
+              <w:rPr>
+                <w:rFonts w:eastAsia="Times New Roman"/>
+                <w:color w:val="000000"/>
+                <w:sz w:val="20"/>
+                <w:szCs w:val="20"/>
+                <w:lang w:val="en-US" w:eastAsia="ar-SA"/>
+              </w:rPr>
+              <w:t>passport_number</w:t>
+            </w:r>
+            <w:proofErr w:type="spellEnd"/>
+            <w:r>
+              <w:rPr>
+                <w:rFonts w:eastAsia="Times New Roman"/>
+                <w:color w:val="000000"/>
+                <w:sz w:val="20"/>
+                <w:szCs w:val="20"/>
+                <w:lang w:val="en-US" w:eastAsia="ar-SA"/>
+              </w:rPr>
+              <w:t xml:space="preserve"> }}</w:t>
             </w:r>
           </w:p>
           <w:p>
             <w:pPr>
-              <w:rPr>
-                <w:color w:val="000000"/>
-                <w:sz w:val="18"/>
+              <w:pStyle w:val="af6"/>
+              <w:spacing w:before="0" w:beforeAutospacing="0" w:after="0" w:afterAutospacing="0"/>
+              <w:rPr>
+                <w:rFonts w:eastAsia="Times New Roman"/>
+                <w:color w:val="000000"/>
+                <w:sz w:val="20"/>
+                <w:szCs w:val="20"/>
+                <w:lang w:val="en-US" w:eastAsia="ar-SA"/>
               </w:rPr>
             </w:pPr>
             <w:r>
               <w:rPr>
-                <w:color w:val="000000"/>
-                <w:sz w:val="18"/>
-              </w:rPr>
-              <w:t>Отделением УФМС России по Калининградской области Краснознаменского района</w:t>
+                <w:rFonts w:eastAsia="Times New Roman"/>
+                <w:color w:val="000000"/>
+                <w:sz w:val="20"/>
+                <w:szCs w:val="20"/>
+                <w:lang w:eastAsia="ar-SA"/>
+              </w:rPr>
+              <w:t>Выдан</w:t>
+            </w:r>
+            <w:r>
+              <w:rPr>
+                <w:rFonts w:eastAsia="Times New Roman"/>
+                <w:color w:val="000000"/>
+                <w:sz w:val="20"/>
+                <w:szCs w:val="20"/>
+                <w:lang w:val="en-US" w:eastAsia="ar-SA"/>
+              </w:rPr>
+              <w:t xml:space="preserve"> </w:t>
+            </w:r>
+            <w:r>
+              <w:rPr>
+                <w:rFonts w:eastAsia="Times New Roman"/>
+                <w:color w:val="000000"/>
+                <w:sz w:val="20"/>
+                <w:szCs w:val="20"/>
+                <w:lang w:val="en-US" w:eastAsia="ar-SA"/>
+              </w:rPr>
+              <w:t xml:space="preserve">{{ </w:t>
+            </w:r>
+            <w:proofErr w:type="spellStart"/>
+            <w:r>
+              <w:rPr>
+                <w:rFonts w:eastAsia="Times New Roman"/>
+                <w:color w:val="000000"/>
+                <w:sz w:val="20"/>
+                <w:szCs w:val="20"/>
+                <w:lang w:val="en-US" w:eastAsia="ar-SA"/>
+              </w:rPr>
+              <w:t>passport_issued</w:t>
+            </w:r>
+            <w:proofErr w:type="spellEnd"/>
+            <w:r>
+              <w:rPr>
+                <w:rFonts w:eastAsia="Times New Roman"/>
+                <w:color w:val="000000"/>
+                <w:sz w:val="20"/>
+                <w:szCs w:val="20"/>
+                <w:lang w:val="en-US" w:eastAsia="ar-SA"/>
+              </w:rPr>
+              <w:t xml:space="preserve"> }}</w:t>
             </w:r>
           </w:p>
           <w:p>
             <w:pPr>
-              <w:rPr>
-                <w:color w:val="000000"/>
-                <w:sz w:val="18"/>
+              <w:pStyle w:val="af6"/>
+              <w:spacing w:before="0" w:beforeAutospacing="0" w:after="0" w:afterAutospacing="0"/>
+              <w:rPr>
+                <w:rFonts w:eastAsia="Times New Roman"/>
+                <w:color w:val="000000"/>
+                <w:sz w:val="20"/>
+                <w:szCs w:val="20"/>
+                <w:lang w:val="en-US" w:eastAsia="ar-SA"/>
               </w:rPr>
             </w:pPr>
             <w:r>
               <w:rPr>
-                <w:color w:val="000000"/>
-                <w:sz w:val="18"/>
-              </w:rPr>
-              <w:t>Дата выдачи 08.06.2011</w:t>
+                <w:rFonts w:eastAsia="Times New Roman"/>
+                <w:color w:val="000000"/>
+                <w:sz w:val="20"/>
+                <w:szCs w:val="20"/>
+                <w:lang w:eastAsia="ar-SA"/>
+              </w:rPr>
+              <w:t>Дата</w:t>
+            </w:r>
+            <w:r>
+              <w:rPr>
+                <w:rFonts w:eastAsia="Times New Roman"/>
+                <w:color w:val="000000"/>
+                <w:sz w:val="20"/>
+                <w:szCs w:val="20"/>
+                <w:lang w:val="en-US" w:eastAsia="ar-SA"/>
+              </w:rPr>
+              <w:t xml:space="preserve"> </w:t>
+            </w:r>
+            <w:r>
+              <w:rPr>
+                <w:rFonts w:eastAsia="Times New Roman"/>
+                <w:color w:val="000000"/>
+                <w:sz w:val="20"/>
+                <w:szCs w:val="20"/>
+                <w:lang w:eastAsia="ar-SA"/>
+              </w:rPr>
+              <w:t>выдачи</w:t>
+            </w:r>
+            <w:r>
+              <w:rPr>
+                <w:rFonts w:eastAsia="Times New Roman"/>
+                <w:color w:val="000000"/>
+                <w:sz w:val="20"/>
+                <w:szCs w:val="20"/>
+                <w:lang w:val="en-US" w:eastAsia="ar-SA"/>
+              </w:rPr>
+              <w:t xml:space="preserve">: {{ </w:t>
+            </w:r>
+            <w:proofErr w:type="spellStart"/>
+            <w:r>
+              <w:rPr>
+                <w:rFonts w:eastAsia="Times New Roman"/>
+                <w:color w:val="000000"/>
+                <w:sz w:val="20"/>
+                <w:szCs w:val="20"/>
+                <w:lang w:val="en-US" w:eastAsia="ar-SA"/>
+              </w:rPr>
+              <w:t>passport</w:t>
+            </w:r>
+            <w:r>
+              <w:rPr>
+                <w:rFonts w:eastAsia="Times New Roman"/>
+                <w:color w:val="000000"/>
+                <w:sz w:val="20"/>
+                <w:szCs w:val="20"/>
+                <w:lang w:val="en-US" w:eastAsia="ar-SA"/>
+              </w:rPr>
+              <w:t>_</w:t>
+            </w:r>
+            <w:r>
+              <w:rPr>
+                <w:rFonts w:eastAsia="Times New Roman"/>
+                <w:color w:val="000000"/>
+                <w:sz w:val="20"/>
+                <w:szCs w:val="20"/>
+                <w:lang w:val="en-US" w:eastAsia="ar-SA"/>
+              </w:rPr>
+              <w:t>date</w:t>
+            </w:r>
+            <w:proofErr w:type="spellEnd"/>
+            <w:r>
+              <w:rPr>
+                <w:rFonts w:eastAsia="Times New Roman"/>
+                <w:color w:val="000000"/>
+                <w:sz w:val="20"/>
+                <w:szCs w:val="20"/>
+                <w:lang w:val="en-US" w:eastAsia="ar-SA"/>
+              </w:rPr>
+              <w:t xml:space="preserve"> }}</w:t>
             </w:r>
           </w:p>
           <w:p>
             <w:pPr>
-              <w:rPr>
-                <w:color w:val="000000"/>
-                <w:sz w:val="18"/>
+              <w:pStyle w:val="af6"/>
+              <w:spacing w:before="0" w:beforeAutospacing="0" w:after="0" w:afterAutospacing="0"/>
+              <w:rPr>
+                <w:sz w:val="20"/>
+                <w:szCs w:val="20"/>
+                <w:lang w:val="en-US"/>
               </w:rPr>
             </w:pPr>
             <w:r>
               <w:rPr>
                 <w:color w:val="000000"/>
-                <w:sz w:val="18"/>
-              </w:rPr>
-              <w:t>Код подразделения: 390-015</w:t>
+                <w:sz w:val="20"/>
+                <w:szCs w:val="20"/>
+              </w:rPr>
+              <w:t>Код</w:t>
+            </w:r>
+            <w:r>
+              <w:rPr>
+                <w:color w:val="000000"/>
+                <w:sz w:val="20"/>
+                <w:szCs w:val="20"/>
+                <w:lang w:val="en-US"/>
+              </w:rPr>
+              <w:t xml:space="preserve"> </w:t>
+            </w:r>
+            <w:r>
+              <w:rPr>
+                <w:color w:val="000000"/>
+                <w:sz w:val="20"/>
+                <w:szCs w:val="20"/>
+              </w:rPr>
+              <w:t>подразделения</w:t>
+            </w:r>
+            <w:r>
+              <w:rPr>
+                <w:color w:val="000000"/>
+                <w:sz w:val="20"/>
+                <w:szCs w:val="20"/>
+                <w:lang w:val="en-US"/>
+              </w:rPr>
+              <w:t xml:space="preserve">: </w:t>
+            </w:r>
+            <w:r>
+              <w:rPr>
+                <w:rFonts w:eastAsia="Times New Roman"/>
+                <w:color w:val="000000"/>
+                <w:sz w:val="20"/>
+                <w:szCs w:val="20"/>
+                <w:lang w:val="en-US" w:eastAsia="ar-SA"/>
+              </w:rPr>
+              <w:t xml:space="preserve">{{ </w:t>
+            </w:r>
+            <w:proofErr w:type="spellStart"/>
+            <w:r>
+              <w:rPr>
+                <w:rFonts w:eastAsia="Times New Roman"/>
+                <w:color w:val="000000"/>
+                <w:sz w:val="20"/>
+                <w:szCs w:val="20"/>
+                <w:lang w:val="en-US" w:eastAsia="ar-SA"/>
+              </w:rPr>
+              <w:t>passport</w:t>
+            </w:r>
+            <w:r>
+              <w:rPr>
+                <w:rFonts w:eastAsia="Times New Roman"/>
+                <w:color w:val="000000"/>
+                <w:sz w:val="20"/>
+                <w:szCs w:val="20"/>
+                <w:lang w:val="en-US" w:eastAsia="ar-SA"/>
+              </w:rPr>
+              <w:t>_code</w:t>
+            </w:r>
+            <w:proofErr w:type="spellEnd"/>
+            <w:r>
+              <w:rPr>
+                <w:rFonts w:eastAsia="Times New Roman"/>
+                <w:color w:val="000000"/>
+                <w:sz w:val="20"/>
+                <w:szCs w:val="20"/>
+                <w:lang w:val="en-US" w:eastAsia="ar-SA"/>
+              </w:rPr>
+              <w:t xml:space="preserve"> }}</w:t>
             </w:r>
           </w:p>
           <w:p>
             <w:pPr>
               <w:rPr>
+                <w:lang w:val="en-US"/>
+              </w:rPr>
+            </w:pPr>
+            <w:r>
+              <w:t>Тел</w:t>
+            </w:r>
+            <w:r>
+              <w:rPr>
+                <w:lang w:val="en-US"/>
+              </w:rPr>
+              <w:t>: {{ phone }}</w:t>
+            </w:r>
+          </w:p>
+          <w:p>
+            <w:pPr>
+              <w:rPr>
                 <w:color w:val="000000"/>
                 <w:sz w:val="18"/>
               </w:rPr>
             </w:pPr>
-            <w:r>
-              <w:rPr>
-                <w:color w:val="000000"/>
-                <w:sz w:val="18"/>
-              </w:rPr>
-              <w:t xml:space="preserve">Тел: </w:t>
-            </w:r>
-            <w:r>
-              <w:rPr>
-                <w:color w:val="000000"/>
-                <w:sz w:val="18"/>
-              </w:rPr>
-              <w:t>+</w:t>
-            </w:r>
-            <w:r>
-              <w:rPr>
-                <w:color w:val="000000"/>
-                <w:sz w:val="18"/>
-              </w:rPr>
-              <w:t>89632921349</w:t>
-            </w:r>
           </w:p>
           <w:p>
             <w:pPr>
@@ -5983,20 +6565,30 @@
         <w:t xml:space="preserve">                                                       </w:t>
       </w:r>
       <w:r>
-        <w:t>_______________________</w:t>
-      </w:r>
-      <w:proofErr w:type="gramStart"/>
-      <w:r>
-        <w:t xml:space="preserve">_  </w:t>
+        <w:t xml:space="preserve">________________________  </w:t>
+      </w:r>
+      <w:r>
+        <w:t xml:space="preserve">{{ </w:t>
+      </w:r>
+      <w:r>
+        <w:rPr>
+          <w:lang w:val="en-US"/>
+        </w:rPr>
+        <w:t>format</w:t>
+      </w:r>
+      <w:r>
+        <w:t>_</w:t>
       </w:r>
       <w:proofErr w:type="spellStart"/>
       <w:r>
-        <w:t>Сливец</w:t>
+        <w:rPr>
+          <w:lang w:val="en-US"/>
+        </w:rPr>
+        <w:t>fio</w:t>
       </w:r>
       <w:proofErr w:type="spellEnd"/>
-      <w:proofErr w:type="gramEnd"/>
-      <w:r>
-        <w:t xml:space="preserve"> В.В.</w:t>
+      <w:r>
+        <w:t xml:space="preserve"> }}</w:t>
       </w:r>
     </w:p>
     <w:p>
@@ -6060,7 +6652,6 @@
         <w:i/>
       </w:rPr>
     </w:pPr>
-    <w:proofErr w:type="gramStart"/>
     <w:r>
       <w:rPr>
         <w:i/>
@@ -6071,14 +6662,7 @@
       <w:rPr>
         <w:i/>
       </w:rPr>
-      <w:t>купли</w:t>
-    </w:r>
-    <w:proofErr w:type="gramEnd"/>
-    <w:r>
-      <w:rPr>
-        <w:i/>
-      </w:rPr>
-      <w:t>-продажи</w:t>
+      <w:t>купли-продажи</w:t>
     </w:r>
     <w:r>
       <w:rPr>
@@ -6107,43 +6691,29 @@
       <w:rPr>
         <w:b/>
       </w:rPr>
-      <w:t xml:space="preserve">№ </w:t>
+      <w:t>{{</w:t>
+    </w:r>
+    <w:r>
+      <w:t xml:space="preserve"> </w:t>
+    </w:r>
+    <w:r>
+      <w:rPr>
+        <w:b/>
+        <w:lang w:val="en-US"/>
+      </w:rPr>
+      <w:t>number</w:t>
     </w:r>
     <w:r>
       <w:rPr>
         <w:b/>
       </w:rPr>
-      <w:t>05</w:t>
+      <w:t xml:space="preserve"> </w:t>
     </w:r>
     <w:r>
       <w:rPr>
         <w:b/>
       </w:rPr>
-      <w:t>/</w:t>
-    </w:r>
-    <w:r>
-      <w:rPr>
-        <w:b/>
-      </w:rPr>
-      <w:t>02</w:t>
-    </w:r>
-    <w:r>
-      <w:rPr>
-        <w:b/>
-      </w:rPr>
-      <w:t>/202</w:t>
-    </w:r>
-    <w:r>
-      <w:rPr>
-        <w:b/>
-      </w:rPr>
-      <w:t>5</w:t>
-    </w:r>
-    <w:r>
-      <w:rPr>
-        <w:b/>
-      </w:rPr>
-      <w:t>/М</w:t>
+      <w:t>}}</w:t>
     </w:r>
     <w:r>
       <w:rPr>
@@ -6155,57 +6725,28 @@
       <w:rPr>
         <w:i/>
       </w:rPr>
-      <w:t>от  «</w:t>
+      <w:t xml:space="preserve">от  </w:t>
+    </w:r>
+    <w:bookmarkEnd w:id="20"/>
+    <w:r>
+      <w:rPr>
+        <w:i/>
+      </w:rPr>
+      <w:t xml:space="preserve">{{ </w:t>
+    </w:r>
+    <w:r>
+      <w:rPr>
+        <w:i/>
+        <w:lang w:val="en-US"/>
+      </w:rPr>
+      <w:t>date</w:t>
     </w:r>
     <w:r>
       <w:rPr>
         <w:i/>
       </w:rPr>
-      <w:t>05</w:t>
+      <w:t xml:space="preserve"> }}</w:t>
     </w:r>
-    <w:r>
-      <w:rPr>
-        <w:i/>
-      </w:rPr>
-      <w:t>»</w:t>
-    </w:r>
-    <w:r>
-      <w:rPr>
-        <w:i/>
-      </w:rPr>
-      <w:t xml:space="preserve"> </w:t>
-    </w:r>
-    <w:r>
-      <w:rPr>
-        <w:i/>
-      </w:rPr>
-      <w:t>февраля</w:t>
-    </w:r>
-    <w:r>
-      <w:rPr>
-        <w:i/>
-      </w:rPr>
-      <w:t xml:space="preserve"> </w:t>
-    </w:r>
-    <w:r>
-      <w:rPr>
-        <w:i/>
-      </w:rPr>
-      <w:t>202</w:t>
-    </w:r>
-    <w:r>
-      <w:rPr>
-        <w:i/>
-      </w:rPr>
-      <w:t>5</w:t>
-    </w:r>
-    <w:r>
-      <w:rPr>
-        <w:i/>
-      </w:rPr>
-      <w:t xml:space="preserve"> года</w:t>
-    </w:r>
-    <w:bookmarkEnd w:id="20"/>
   </w:p>
   <w:p>
     <w:pPr>
@@ -6223,21 +6764,7 @@
       <w:rPr>
         <w:i/>
       </w:rPr>
-      <w:t xml:space="preserve">От ПОСТАВЩИКА: ____________________________   От </w:t>
-    </w:r>
-    <w:proofErr w:type="gramStart"/>
-    <w:r>
-      <w:rPr>
-        <w:i/>
-      </w:rPr>
-      <w:t>ПОКУПАТЕЛЯ:_</w:t>
-    </w:r>
-    <w:proofErr w:type="gramEnd"/>
-    <w:r>
-      <w:rPr>
-        <w:i/>
-      </w:rPr>
-      <w:t>______________________________</w:t>
+      <w:t>От ПОСТАВЩИКА: ____________________________   От ПОКУПАТЕЛЯ:_______________________________</w:t>
     </w:r>
   </w:p>
   <w:p>

</xml_diff>

<commit_message>
add table for template
</commit_message>
<xml_diff>
--- a/templates/contract_template.docx
+++ b/templates/contract_template.docx
@@ -84,6 +84,7 @@
       </w:r>
       <w:bookmarkEnd w:id="2"/>
       <w:bookmarkEnd w:id="3"/>
+      <w:proofErr w:type="gramStart"/>
       <w:r>
         <w:rPr>
           <w:b/>
@@ -100,6 +101,7 @@
         </w:rPr>
         <w:t>number</w:t>
       </w:r>
+      <w:proofErr w:type="gramEnd"/>
       <w:r>
         <w:rPr>
           <w:b/>
@@ -121,10 +123,18 @@
         <w:jc w:val="both"/>
       </w:pPr>
       <w:r>
-        <w:t xml:space="preserve">г. Калининград                                                                                                                                     </w:t>
-      </w:r>
-      <w:r>
-        <w:t xml:space="preserve">{{ </w:t>
+        <w:t xml:space="preserve">г. Калининград                                                                                                                                  </w:t>
+      </w:r>
+      <w:proofErr w:type="gramStart"/>
+      <w:r>
+        <w:t xml:space="preserve">   </w:t>
+      </w:r>
+      <w:r>
+        <w:t>{</w:t>
+      </w:r>
+      <w:proofErr w:type="gramEnd"/>
+      <w:r>
+        <w:t xml:space="preserve">{ </w:t>
       </w:r>
       <w:r>
         <w:rPr>
@@ -154,7 +164,15 @@
         <w:t>«Лысенко Г.И.</w:t>
       </w:r>
       <w:r>
-        <w:t>», в дальнейшем именуемое «Поставщик», в лице  Лысенко Галины Ивановны, действующего на основании Устава</w:t>
+        <w:t xml:space="preserve">», в дальнейшем именуемое «Поставщик», в </w:t>
+      </w:r>
+      <w:proofErr w:type="gramStart"/>
+      <w:r>
+        <w:t>лице  Лысенко</w:t>
+      </w:r>
+      <w:proofErr w:type="gramEnd"/>
+      <w:r>
+        <w:t xml:space="preserve"> Галины Ивановны, действующего на основании Устава</w:t>
       </w:r>
       <w:r>
         <w:t>, с одной стороны</w:t>
@@ -174,6 +192,7 @@
         </w:rPr>
         <w:t xml:space="preserve"> </w:t>
       </w:r>
+      <w:proofErr w:type="gramStart"/>
       <w:r>
         <w:rPr>
           <w:b/>
@@ -188,6 +207,7 @@
         <w:t>fio</w:t>
       </w:r>
       <w:proofErr w:type="spellEnd"/>
+      <w:proofErr w:type="gramEnd"/>
       <w:r>
         <w:rPr>
           <w:b/>
@@ -363,6 +383,7 @@
         </w:rPr>
         <w:t xml:space="preserve">- </w:t>
       </w:r>
+      <w:proofErr w:type="gramStart"/>
       <w:r>
         <w:rPr>
           <w:rFonts w:ascii="Times New Roman" w:hAnsi="Times New Roman" w:cs="Times New Roman"/>
@@ -372,7 +393,19 @@
           <w:szCs w:val="20"/>
           <w:lang w:val="en-US"/>
         </w:rPr>
-        <w:t xml:space="preserve">{{ product.name }} – {{ </w:t>
+        <w:t>{{ product.name</w:t>
+      </w:r>
+      <w:proofErr w:type="gramEnd"/>
+      <w:r>
+        <w:rPr>
+          <w:rFonts w:ascii="Times New Roman" w:hAnsi="Times New Roman" w:cs="Times New Roman"/>
+          <w:b/>
+          <w:bCs/>
+          <w:sz w:val="20"/>
+          <w:szCs w:val="20"/>
+          <w:lang w:val="en-US"/>
+        </w:rPr>
+        <w:t xml:space="preserve"> }} – {{ </w:t>
       </w:r>
       <w:proofErr w:type="spellStart"/>
       <w:r>
@@ -462,7 +495,18 @@
           <w:sz w:val="20"/>
           <w:szCs w:val="20"/>
         </w:rPr>
-        <w:t xml:space="preserve"> %}</w:t>
+        <w:t xml:space="preserve"> </w:t>
+      </w:r>
+      <w:proofErr w:type="gramStart"/>
+      <w:r>
+        <w:rPr>
+          <w:rFonts w:ascii="Times New Roman" w:hAnsi="Times New Roman" w:cs="Times New Roman"/>
+          <w:b/>
+          <w:bCs/>
+          <w:sz w:val="20"/>
+          <w:szCs w:val="20"/>
+        </w:rPr>
+        <w:t>%}</w:t>
       </w:r>
       <w:r>
         <w:rPr>
@@ -472,6 +516,7 @@
         </w:rPr>
         <w:t>(</w:t>
       </w:r>
+      <w:proofErr w:type="gramEnd"/>
       <w:r>
         <w:rPr>
           <w:rFonts w:ascii="Times New Roman" w:hAnsi="Times New Roman" w:cs="Times New Roman"/>
@@ -596,6 +641,7 @@
         </w:rPr>
         <w:t xml:space="preserve">авляет </w:t>
       </w:r>
+      <w:proofErr w:type="gramStart"/>
       <w:r>
         <w:rPr>
           <w:rFonts w:ascii="Times New Roman" w:hAnsi="Times New Roman" w:cs="Times New Roman"/>
@@ -614,6 +660,7 @@
         <w:t>total</w:t>
       </w:r>
       <w:proofErr w:type="spellEnd"/>
+      <w:proofErr w:type="gramEnd"/>
       <w:r>
         <w:rPr>
           <w:rFonts w:ascii="Times New Roman" w:hAnsi="Times New Roman" w:cs="Times New Roman"/>
@@ -1243,7 +1290,25 @@
           <w:sz w:val="20"/>
           <w:szCs w:val="20"/>
         </w:rPr>
-        <w:t>. Доставка Оборудования не включена в стоимость Оборудования и осуществляется Покупателем самостоятельно со склада Поставщика г. Калининград, ул. Аллея Смелых 31 Г. Либо на иных условиях оговоренных в Товарных накладных.</w:t>
+        <w:t xml:space="preserve">. Доставка Оборудования не включена в стоимость Оборудования и осуществляется Покупателем самостоятельно со склада Поставщика г. Калининград, ул. Аллея Смелых 31 Г. Либо </w:t>
+      </w:r>
+      <w:proofErr w:type="gramStart"/>
+      <w:r>
+        <w:rPr>
+          <w:rFonts w:ascii="Times New Roman" w:hAnsi="Times New Roman" w:cs="Times New Roman"/>
+          <w:sz w:val="20"/>
+          <w:szCs w:val="20"/>
+        </w:rPr>
+        <w:t>на иных условиях</w:t>
+      </w:r>
+      <w:proofErr w:type="gramEnd"/>
+      <w:r>
+        <w:rPr>
+          <w:rFonts w:ascii="Times New Roman" w:hAnsi="Times New Roman" w:cs="Times New Roman"/>
+          <w:sz w:val="20"/>
+          <w:szCs w:val="20"/>
+        </w:rPr>
+        <w:t xml:space="preserve"> оговоренных в Товарных накладных.</w:t>
       </w:r>
     </w:p>
     <w:p>
@@ -1364,7 +1429,15 @@
         <w:t>1</w:t>
       </w:r>
       <w:r>
-        <w:t xml:space="preserve"> настоящего Договора, Покупатель уплачивает Поставщику неустойку в размере 0,1%  от суммы задолженности за каждый день просрочки.</w:t>
+        <w:t xml:space="preserve"> настоящего Договора, Покупатель уплачивает Поставщику неустойку в размере 0,1</w:t>
+      </w:r>
+      <w:proofErr w:type="gramStart"/>
+      <w:r>
+        <w:t>%  от</w:t>
+      </w:r>
+      <w:proofErr w:type="gramEnd"/>
+      <w:r>
+        <w:t xml:space="preserve"> суммы задолженности за каждый день просрочки.</w:t>
       </w:r>
     </w:p>
     <w:p>
@@ -1424,7 +1497,21 @@
         <w:rPr>
           <w:b/>
         </w:rPr>
-        <w:t>6.  ПОРЯДОК ПРИЕМКИ  ОБОРУДОВАНИЯ ПОКУПАТЕЛЕМ</w:t>
+        <w:t xml:space="preserve">6.  ПОРЯДОК </w:t>
+      </w:r>
+      <w:proofErr w:type="gramStart"/>
+      <w:r>
+        <w:rPr>
+          <w:b/>
+        </w:rPr>
+        <w:t>ПРИЕМКИ  ОБОРУДОВАНИЯ</w:t>
+      </w:r>
+      <w:proofErr w:type="gramEnd"/>
+      <w:r>
+        <w:rPr>
+          <w:b/>
+        </w:rPr>
+        <w:t xml:space="preserve"> ПОКУПАТЕЛЕМ</w:t>
       </w:r>
     </w:p>
     <w:p>
@@ -1519,7 +1606,25 @@
           <w:sz w:val="20"/>
           <w:szCs w:val="20"/>
         </w:rPr>
-        <w:t xml:space="preserve">6.4. Приемка Оборудования оформляется Актом приема-передачи (приложение № 2) являющимся неотъемлемой частью настоящего договора. Оборудование считается принятым Покупателем с момента подписания Акта приема-передачи. </w:t>
+        <w:t xml:space="preserve">6.4. Приемка Оборудования оформляется </w:t>
+      </w:r>
+      <w:proofErr w:type="gramStart"/>
+      <w:r>
+        <w:rPr>
+          <w:rFonts w:ascii="Times New Roman" w:hAnsi="Times New Roman" w:cs="Times New Roman"/>
+          <w:sz w:val="20"/>
+          <w:szCs w:val="20"/>
+        </w:rPr>
+        <w:t>Актом приема-передачи (приложение № 2)</w:t>
+      </w:r>
+      <w:proofErr w:type="gramEnd"/>
+      <w:r>
+        <w:rPr>
+          <w:rFonts w:ascii="Times New Roman" w:hAnsi="Times New Roman" w:cs="Times New Roman"/>
+          <w:sz w:val="20"/>
+          <w:szCs w:val="20"/>
+        </w:rPr>
+        <w:t xml:space="preserve"> являющимся неотъемлемой частью настоящего договора. Оборудование считается принятым Покупателем с момента подписания Акта приема-передачи. </w:t>
       </w:r>
     </w:p>
     <w:p>
@@ -1658,7 +1763,15 @@
       </w:r>
       <w:r>
         <w:tab/>
-        <w:t>обслуживание осуществляется согласно регламента, рекомендованного заводом изготовителем, у официального дилера;</w:t>
+        <w:t xml:space="preserve">обслуживание осуществляется </w:t>
+      </w:r>
+      <w:proofErr w:type="gramStart"/>
+      <w:r>
+        <w:t>согласно регламента</w:t>
+      </w:r>
+      <w:proofErr w:type="gramEnd"/>
+      <w:r>
+        <w:t>, рекомендованного заводом изготовителем, у официального дилера;</w:t>
       </w:r>
     </w:p>
     <w:p>
@@ -1978,7 +2091,25 @@
           <w:szCs w:val="20"/>
         </w:rPr>
         <w:tab/>
-        <w:t>Поставщик в 5-тидневный срок был письменно путем электронной  почты извещен об обнаруженных неисправностях Оборудования (произошедших поломках) и их характере;</w:t>
+        <w:t xml:space="preserve">Поставщик в 5-тидневный срок был письменно путем </w:t>
+      </w:r>
+      <w:proofErr w:type="gramStart"/>
+      <w:r>
+        <w:rPr>
+          <w:rFonts w:ascii="Times New Roman" w:hAnsi="Times New Roman" w:cs="Times New Roman"/>
+          <w:sz w:val="20"/>
+          <w:szCs w:val="20"/>
+        </w:rPr>
+        <w:t>электронной  почты</w:t>
+      </w:r>
+      <w:proofErr w:type="gramEnd"/>
+      <w:r>
+        <w:rPr>
+          <w:rFonts w:ascii="Times New Roman" w:hAnsi="Times New Roman" w:cs="Times New Roman"/>
+          <w:sz w:val="20"/>
+          <w:szCs w:val="20"/>
+        </w:rPr>
+        <w:t xml:space="preserve"> извещен об обнаруженных неисправностях Оборудования (произошедших поломках) и их характере;</w:t>
       </w:r>
     </w:p>
     <w:p>
@@ -2056,7 +2187,25 @@
           <w:sz w:val="20"/>
           <w:szCs w:val="20"/>
         </w:rPr>
-        <w:t xml:space="preserve">7.8. В случае выявления в гарантийный период недостатков Оборудования,  которые возникли не по причине нарушения Покупателем правил использования, хранения или транспортировки Оборудования,  действий третьих лиц или непреодолимой силы, Поставщик обязуется произвести бесплатный ремонт в сроки установленные законодательством РФ. </w:t>
+        <w:t xml:space="preserve">7.8. В случае выявления в гарантийный период недостатков </w:t>
+      </w:r>
+      <w:proofErr w:type="gramStart"/>
+      <w:r>
+        <w:rPr>
+          <w:rFonts w:ascii="Times New Roman" w:hAnsi="Times New Roman" w:cs="Times New Roman"/>
+          <w:sz w:val="20"/>
+          <w:szCs w:val="20"/>
+        </w:rPr>
+        <w:t>Оборудования,  которые</w:t>
+      </w:r>
+      <w:proofErr w:type="gramEnd"/>
+      <w:r>
+        <w:rPr>
+          <w:rFonts w:ascii="Times New Roman" w:hAnsi="Times New Roman" w:cs="Times New Roman"/>
+          <w:sz w:val="20"/>
+          <w:szCs w:val="20"/>
+        </w:rPr>
+        <w:t xml:space="preserve"> возникли не по причине нарушения Покупателем правил использования, хранения или транспортировки Оборудования,  действий третьих лиц или непреодолимой силы, Поставщик обязуется произвести бесплатный ремонт в сроки установленные законодательством РФ. </w:t>
       </w:r>
     </w:p>
     <w:p>
@@ -2064,7 +2213,15 @@
         <w:jc w:val="both"/>
       </w:pPr>
       <w:r>
-        <w:t>7.9. Гарантия поддерживается Поставщиком, только если техническое обслуживание Оборудования производится Покупателем в Сервисном центре Поставщика. При этом, Поставщик не отвечает за правовые действия ремонта или иного вмешательства произведенного Покупателем в других сервисных центрах. Обязательное (в соответствие с условиями гарантии) периодическое Техническое обслуживание Оборудования не является ремонтом.</w:t>
+        <w:t xml:space="preserve">7.9. Гарантия поддерживается Поставщиком, только если техническое обслуживание Оборудования производится Покупателем в Сервисном центре Поставщика. При этом, Поставщик не отвечает за правовые действия ремонта или </w:t>
+      </w:r>
+      <w:proofErr w:type="gramStart"/>
+      <w:r>
+        <w:t>иного вмешательства</w:t>
+      </w:r>
+      <w:proofErr w:type="gramEnd"/>
+      <w:r>
+        <w:t xml:space="preserve"> произведенного Покупателем в других сервисных центрах. Обязательное (в соответствие с условиями гарантии) периодическое Техническое обслуживание Оборудования не является ремонтом.</w:t>
       </w:r>
     </w:p>
     <w:p>
@@ -2574,6 +2731,7 @@
             <w:shd w:val="clear" w:color="auto" w:fill="auto"/>
           </w:tcPr>
           <w:p>
+            <w:proofErr w:type="gramStart"/>
             <w:r>
               <w:rPr>
                 <w:b/>
@@ -2596,6 +2754,7 @@
               <w:t>fio</w:t>
             </w:r>
             <w:proofErr w:type="spellEnd"/>
+            <w:proofErr w:type="gramEnd"/>
             <w:r>
               <w:rPr>
                 <w:b/>
@@ -2646,11 +2805,19 @@
                 <w:color w:val="000000"/>
               </w:rPr>
             </w:pPr>
-            <w:r>
-              <w:rPr>
-                <w:color w:val="000000"/>
-              </w:rPr>
-              <w:t xml:space="preserve">ИНН  390702639548 </w:t>
+            <w:proofErr w:type="gramStart"/>
+            <w:r>
+              <w:rPr>
+                <w:color w:val="000000"/>
+              </w:rPr>
+              <w:t>ИНН  390702639548</w:t>
+            </w:r>
+            <w:proofErr w:type="gramEnd"/>
+            <w:r>
+              <w:rPr>
+                <w:color w:val="000000"/>
+              </w:rPr>
+              <w:t xml:space="preserve"> </w:t>
             </w:r>
           </w:p>
           <w:p>
@@ -2672,11 +2839,19 @@
                 <w:color w:val="000000"/>
               </w:rPr>
             </w:pPr>
-            <w:r>
-              <w:rPr>
-                <w:color w:val="000000"/>
-              </w:rPr>
-              <w:t>236029  г. Калининград,  ул. Тихая  д.20  кв.3</w:t>
+            <w:proofErr w:type="gramStart"/>
+            <w:r>
+              <w:rPr>
+                <w:color w:val="000000"/>
+              </w:rPr>
+              <w:t>236029  г.</w:t>
+            </w:r>
+            <w:proofErr w:type="gramEnd"/>
+            <w:r>
+              <w:rPr>
+                <w:color w:val="000000"/>
+              </w:rPr>
+              <w:t xml:space="preserve"> Калининград,  ул. Тихая  д.20  кв.3</w:t>
             </w:r>
           </w:p>
           <w:p>
@@ -2702,7 +2877,21 @@
               <w:rPr>
                 <w:color w:val="000000"/>
               </w:rPr>
-              <w:t>Банк получателя:  Ф-Л "ЕВРОПЕЙСКИЙ" ПАО "БАНК "САНКТ-ПЕТЕРБУРГ", г. КАЛИНИНГРАД</w:t>
+              <w:t xml:space="preserve">Банк </w:t>
+            </w:r>
+            <w:proofErr w:type="gramStart"/>
+            <w:r>
+              <w:rPr>
+                <w:color w:val="000000"/>
+              </w:rPr>
+              <w:t>получателя:  Ф</w:t>
+            </w:r>
+            <w:proofErr w:type="gramEnd"/>
+            <w:r>
+              <w:rPr>
+                <w:color w:val="000000"/>
+              </w:rPr>
+              <w:t>-Л "ЕВРОПЕЙСКИЙ" ПАО "БАНК "САНКТ-ПЕТЕРБУРГ", г. КАЛИНИНГРАД</w:t>
             </w:r>
           </w:p>
           <w:p>
@@ -2762,6 +2951,7 @@
                 <w:lang w:val="en-US" w:eastAsia="ar-SA"/>
               </w:rPr>
             </w:pPr>
+            <w:proofErr w:type="gramStart"/>
             <w:r>
               <w:rPr>
                 <w:rFonts w:eastAsia="Times New Roman"/>
@@ -2770,7 +2960,18 @@
                 <w:szCs w:val="20"/>
                 <w:lang w:val="en-US" w:eastAsia="ar-SA"/>
               </w:rPr>
-              <w:t>{{ address }}</w:t>
+              <w:t>{{ address</w:t>
+            </w:r>
+            <w:proofErr w:type="gramEnd"/>
+            <w:r>
+              <w:rPr>
+                <w:rFonts w:eastAsia="Times New Roman"/>
+                <w:color w:val="000000"/>
+                <w:sz w:val="20"/>
+                <w:szCs w:val="20"/>
+                <w:lang w:val="en-US" w:eastAsia="ar-SA"/>
+              </w:rPr>
+              <w:t xml:space="preserve"> }}</w:t>
             </w:r>
           </w:p>
           <w:p>
@@ -2823,7 +3024,18 @@
                 <w:szCs w:val="20"/>
                 <w:lang w:val="en-US" w:eastAsia="ar-SA"/>
               </w:rPr>
-              <w:t xml:space="preserve"> {{</w:t>
+              <w:t xml:space="preserve"> </w:t>
+            </w:r>
+            <w:proofErr w:type="gramStart"/>
+            <w:r>
+              <w:rPr>
+                <w:rFonts w:eastAsia="Times New Roman"/>
+                <w:color w:val="000000"/>
+                <w:sz w:val="20"/>
+                <w:szCs w:val="20"/>
+                <w:lang w:val="en-US" w:eastAsia="ar-SA"/>
+              </w:rPr>
+              <w:t>{{</w:t>
             </w:r>
             <w:r>
               <w:rPr>
@@ -2842,7 +3054,18 @@
                 <w:szCs w:val="20"/>
                 <w:lang w:val="en-US" w:eastAsia="ar-SA"/>
               </w:rPr>
-              <w:t>passport_series</w:t>
+              <w:t>passport</w:t>
+            </w:r>
+            <w:proofErr w:type="gramEnd"/>
+            <w:r>
+              <w:rPr>
+                <w:rFonts w:eastAsia="Times New Roman"/>
+                <w:color w:val="000000"/>
+                <w:sz w:val="20"/>
+                <w:szCs w:val="20"/>
+                <w:lang w:val="en-US" w:eastAsia="ar-SA"/>
+              </w:rPr>
+              <w:t>_series</w:t>
             </w:r>
             <w:proofErr w:type="spellEnd"/>
             <w:r>
@@ -2918,6 +3141,7 @@
               </w:rPr>
               <w:t xml:space="preserve"> </w:t>
             </w:r>
+            <w:proofErr w:type="gramStart"/>
             <w:r>
               <w:rPr>
                 <w:rFonts w:eastAsia="Times New Roman"/>
@@ -2937,7 +3161,18 @@
                 <w:szCs w:val="20"/>
                 <w:lang w:val="en-US" w:eastAsia="ar-SA"/>
               </w:rPr>
-              <w:t>passport_issued</w:t>
+              <w:t>passport</w:t>
+            </w:r>
+            <w:proofErr w:type="gramEnd"/>
+            <w:r>
+              <w:rPr>
+                <w:rFonts w:eastAsia="Times New Roman"/>
+                <w:color w:val="000000"/>
+                <w:sz w:val="20"/>
+                <w:szCs w:val="20"/>
+                <w:lang w:val="en-US" w:eastAsia="ar-SA"/>
+              </w:rPr>
+              <w:t>_issued</w:t>
             </w:r>
             <w:proofErr w:type="spellEnd"/>
             <w:r>
@@ -3001,7 +3236,18 @@
                 <w:szCs w:val="20"/>
                 <w:lang w:val="en-US" w:eastAsia="ar-SA"/>
               </w:rPr>
-              <w:t xml:space="preserve">: {{ </w:t>
+              <w:t xml:space="preserve">: </w:t>
+            </w:r>
+            <w:proofErr w:type="gramStart"/>
+            <w:r>
+              <w:rPr>
+                <w:rFonts w:eastAsia="Times New Roman"/>
+                <w:color w:val="000000"/>
+                <w:sz w:val="20"/>
+                <w:szCs w:val="20"/>
+                <w:lang w:val="en-US" w:eastAsia="ar-SA"/>
+              </w:rPr>
+              <w:t xml:space="preserve">{{ </w:t>
             </w:r>
             <w:proofErr w:type="spellStart"/>
             <w:r>
@@ -3014,6 +3260,7 @@
               </w:rPr>
               <w:t>passport</w:t>
             </w:r>
+            <w:proofErr w:type="gramEnd"/>
             <w:r>
               <w:rPr>
                 <w:rFonts w:eastAsia="Times New Roman"/>
@@ -3090,6 +3337,7 @@
               </w:rPr>
               <w:t xml:space="preserve">: </w:t>
             </w:r>
+            <w:proofErr w:type="gramStart"/>
             <w:r>
               <w:rPr>
                 <w:rFonts w:eastAsia="Times New Roman"/>
@@ -3111,6 +3359,7 @@
               </w:rPr>
               <w:t>passport</w:t>
             </w:r>
+            <w:proofErr w:type="gramEnd"/>
             <w:r>
               <w:rPr>
                 <w:rFonts w:eastAsia="Times New Roman"/>
@@ -3146,10 +3395,30 @@
               <w:rPr>
                 <w:lang w:val="en-US"/>
               </w:rPr>
-              <w:t>: {{ phone }}</w:t>
+              <w:t xml:space="preserve">: </w:t>
+            </w:r>
+            <w:proofErr w:type="gramStart"/>
+            <w:r>
+              <w:rPr>
+                <w:lang w:val="en-US"/>
+              </w:rPr>
+              <w:t>{{ phone</w:t>
+            </w:r>
+            <w:proofErr w:type="gramEnd"/>
+            <w:r>
+              <w:rPr>
+                <w:lang w:val="en-US"/>
+              </w:rPr>
+              <w:t xml:space="preserve"> }}</w:t>
             </w:r>
           </w:p>
-          <w:p/>
+          <w:p>
+            <w:pPr>
+              <w:rPr>
+                <w:lang w:val="en-US"/>
+              </w:rPr>
+            </w:pPr>
+          </w:p>
         </w:tc>
       </w:tr>
     </w:tbl>
@@ -3203,10 +3472,18 @@
         <w:t xml:space="preserve">.                                                       </w:t>
       </w:r>
       <w:r>
-        <w:t xml:space="preserve">________________________  </w:t>
-      </w:r>
-      <w:r>
-        <w:t xml:space="preserve">{{ </w:t>
+        <w:t>_______________________</w:t>
+      </w:r>
+      <w:proofErr w:type="gramStart"/>
+      <w:r>
+        <w:t xml:space="preserve">_  </w:t>
+      </w:r>
+      <w:r>
+        <w:t>{</w:t>
+      </w:r>
+      <w:proofErr w:type="gramEnd"/>
+      <w:r>
+        <w:t xml:space="preserve">{ </w:t>
       </w:r>
       <w:r>
         <w:rPr>
@@ -3291,7 +3568,14 @@
         <w:rPr>
           <w:i/>
         </w:rPr>
-        <w:t>купли-продажи оборудования</w:t>
+        <w:t xml:space="preserve">купли-продажи </w:t>
+      </w:r>
+      <w:proofErr w:type="gramStart"/>
+      <w:r>
+        <w:rPr>
+          <w:i/>
+        </w:rPr>
+        <w:t>оборудования</w:t>
       </w:r>
       <w:r>
         <w:rPr>
@@ -3313,6 +3597,7 @@
         </w:rPr>
         <w:t>05</w:t>
       </w:r>
+      <w:proofErr w:type="gramEnd"/>
       <w:r>
         <w:rPr>
           <w:b/>
@@ -3613,6 +3898,7 @@
       <w:r>
         <w:t xml:space="preserve"> </w:t>
       </w:r>
+      <w:proofErr w:type="gramStart"/>
       <w:r>
         <w:rPr>
           <w:b/>
@@ -3626,6 +3912,7 @@
         </w:rPr>
         <w:t>number</w:t>
       </w:r>
+      <w:proofErr w:type="gramEnd"/>
       <w:r>
         <w:rPr>
           <w:b/>
@@ -3681,7 +3968,8 @@
           <w:tab w:val="left" w:pos="0"/>
           <w:tab w:val="left" w:pos="360"/>
         </w:tabs>
-        <w:spacing w:before="280" w:after="280"/>
+        <w:spacing w:before="280" w:after="120"/>
+        <w:ind w:left="641" w:hanging="357"/>
         <w:jc w:val="both"/>
         <w:rPr>
           <w:rFonts w:ascii="Arial" w:hAnsi="Arial" w:cs="Arial"/>
@@ -3698,72 +3986,23 @@
     </w:p>
     <w:tbl>
       <w:tblPr>
+        <w:tblStyle w:val="af7"/>
         <w:tblW w:w="0" w:type="auto"/>
-        <w:tblInd w:w="720" w:type="dxa"/>
-        <w:tblBorders>
-          <w:top w:val="single" w:sz="4" w:space="0" w:color="auto"/>
-          <w:left w:val="single" w:sz="4" w:space="0" w:color="auto"/>
-          <w:bottom w:val="single" w:sz="4" w:space="0" w:color="auto"/>
-          <w:right w:val="single" w:sz="4" w:space="0" w:color="auto"/>
-          <w:insideH w:val="single" w:sz="4" w:space="0" w:color="auto"/>
-          <w:insideV w:val="single" w:sz="4" w:space="0" w:color="auto"/>
-        </w:tblBorders>
+        <w:jc w:val="center"/>
         <w:tblLook w:val="04A0" w:firstRow="1" w:lastRow="0" w:firstColumn="1" w:lastColumn="0" w:noHBand="0" w:noVBand="1"/>
       </w:tblPr>
       <w:tblGrid>
-        <w:gridCol w:w="5228"/>
-        <w:gridCol w:w="2075"/>
-        <w:gridCol w:w="2433"/>
+        <w:gridCol w:w="5807"/>
+        <w:gridCol w:w="1286"/>
+        <w:gridCol w:w="2808"/>
       </w:tblGrid>
       <w:tr>
+        <w:trPr>
+          <w:jc w:val="center"/>
+        </w:trPr>
         <w:tc>
           <w:tcPr>
-            <w:tcW w:w="5342" w:type="dxa"/>
-            <w:shd w:val="clear" w:color="auto" w:fill="auto"/>
-          </w:tcPr>
-          <w:p>
-            <w:pPr>
-              <w:pStyle w:val="af"/>
-              <w:tabs>
-                <w:tab w:val="center" w:pos="2563"/>
-                <w:tab w:val="left" w:pos="3795"/>
-              </w:tabs>
-              <w:rPr>
-                <w:rFonts w:ascii="Times New Roman" w:hAnsi="Times New Roman" w:cs="Times New Roman"/>
-                <w:b/>
-                <w:sz w:val="20"/>
-              </w:rPr>
-            </w:pPr>
-            <w:r>
-              <w:rPr>
-                <w:rFonts w:ascii="Times New Roman" w:hAnsi="Times New Roman" w:cs="Times New Roman"/>
-                <w:b/>
-                <w:sz w:val="20"/>
-              </w:rPr>
-              <w:tab/>
-            </w:r>
-            <w:r>
-              <w:rPr>
-                <w:rFonts w:ascii="Times New Roman" w:hAnsi="Times New Roman" w:cs="Times New Roman"/>
-                <w:b/>
-                <w:sz w:val="20"/>
-              </w:rPr>
-              <w:t>Наименование</w:t>
-            </w:r>
-            <w:r>
-              <w:rPr>
-                <w:rFonts w:ascii="Times New Roman" w:hAnsi="Times New Roman" w:cs="Times New Roman"/>
-                <w:b/>
-                <w:sz w:val="20"/>
-              </w:rPr>
-              <w:tab/>
-            </w:r>
-          </w:p>
-        </w:tc>
-        <w:tc>
-          <w:tcPr>
-            <w:tcW w:w="2126" w:type="dxa"/>
-            <w:shd w:val="clear" w:color="auto" w:fill="auto"/>
+            <w:tcW w:w="5807" w:type="dxa"/>
           </w:tcPr>
           <w:p>
             <w:pPr>
@@ -3772,23 +4011,26 @@
               <w:rPr>
                 <w:rFonts w:ascii="Times New Roman" w:hAnsi="Times New Roman" w:cs="Times New Roman"/>
                 <w:b/>
-                <w:sz w:val="20"/>
+                <w:bCs/>
+                <w:sz w:val="20"/>
+                <w:szCs w:val="20"/>
               </w:rPr>
             </w:pPr>
             <w:r>
               <w:rPr>
                 <w:rFonts w:ascii="Times New Roman" w:hAnsi="Times New Roman" w:cs="Times New Roman"/>
                 <w:b/>
-                <w:sz w:val="20"/>
-              </w:rPr>
-              <w:t>Количество</w:t>
+                <w:bCs/>
+                <w:sz w:val="20"/>
+                <w:szCs w:val="20"/>
+              </w:rPr>
+              <w:t>Наименование</w:t>
             </w:r>
           </w:p>
         </w:tc>
         <w:tc>
           <w:tcPr>
-            <w:tcW w:w="2494" w:type="dxa"/>
-            <w:shd w:val="clear" w:color="auto" w:fill="auto"/>
+            <w:tcW w:w="1279" w:type="dxa"/>
           </w:tcPr>
           <w:p>
             <w:pPr>
@@ -3797,25 +4039,59 @@
               <w:rPr>
                 <w:rFonts w:ascii="Times New Roman" w:hAnsi="Times New Roman" w:cs="Times New Roman"/>
                 <w:b/>
-                <w:sz w:val="20"/>
+                <w:bCs/>
+                <w:sz w:val="20"/>
+                <w:szCs w:val="20"/>
               </w:rPr>
             </w:pPr>
             <w:r>
               <w:rPr>
                 <w:rFonts w:ascii="Times New Roman" w:hAnsi="Times New Roman" w:cs="Times New Roman"/>
                 <w:b/>
-                <w:sz w:val="20"/>
-              </w:rPr>
-              <w:t>Стоимость оборудования</w:t>
+                <w:bCs/>
+                <w:sz w:val="20"/>
+                <w:szCs w:val="20"/>
+              </w:rPr>
+              <w:t>Количество</w:t>
+            </w:r>
+          </w:p>
+        </w:tc>
+        <w:tc>
+          <w:tcPr>
+            <w:tcW w:w="2808" w:type="dxa"/>
+          </w:tcPr>
+          <w:p>
+            <w:pPr>
+              <w:pStyle w:val="af"/>
+              <w:jc w:val="center"/>
+              <w:rPr>
+                <w:rFonts w:ascii="Times New Roman" w:hAnsi="Times New Roman" w:cs="Times New Roman"/>
+                <w:b/>
+                <w:bCs/>
+                <w:sz w:val="20"/>
+                <w:szCs w:val="20"/>
+              </w:rPr>
+            </w:pPr>
+            <w:r>
+              <w:rPr>
+                <w:rFonts w:ascii="Times New Roman" w:hAnsi="Times New Roman" w:cs="Times New Roman"/>
+                <w:b/>
+                <w:bCs/>
+                <w:sz w:val="20"/>
+                <w:szCs w:val="20"/>
+              </w:rPr>
+              <w:t>Цена</w:t>
             </w:r>
           </w:p>
         </w:tc>
       </w:tr>
       <w:tr>
+        <w:trPr>
+          <w:jc w:val="center"/>
+        </w:trPr>
         <w:tc>
           <w:tcPr>
-            <w:tcW w:w="5342" w:type="dxa"/>
-            <w:shd w:val="clear" w:color="auto" w:fill="auto"/>
+            <w:tcW w:w="5807" w:type="dxa"/>
           </w:tcPr>
           <w:p>
             <w:pPr>
@@ -3823,77 +4099,107 @@
               <w:jc w:val="both"/>
               <w:rPr>
                 <w:rFonts w:ascii="Times New Roman" w:hAnsi="Times New Roman" w:cs="Times New Roman"/>
-                <w:b/>
-                <w:sz w:val="20"/>
-                <w:szCs w:val="20"/>
+                <w:sz w:val="20"/>
+                <w:szCs w:val="20"/>
+                <w:lang w:val="en-US"/>
               </w:rPr>
             </w:pPr>
             <w:r>
               <w:rPr>
-                <w:rFonts w:ascii="Times New Roman" w:hAnsi="Times New Roman" w:cs="Times New Roman"/>
-                <w:b/>
-                <w:sz w:val="20"/>
-                <w:szCs w:val="20"/>
-              </w:rPr>
-              <w:t xml:space="preserve">Косилка дисковая </w:t>
-            </w:r>
-            <w:proofErr w:type="spellStart"/>
-            <w:r>
-              <w:rPr>
-                <w:rFonts w:ascii="Times New Roman" w:hAnsi="Times New Roman" w:cs="Times New Roman"/>
-                <w:b/>
-                <w:sz w:val="20"/>
-                <w:szCs w:val="20"/>
-              </w:rPr>
-              <w:t>задненавесная</w:t>
-            </w:r>
-            <w:proofErr w:type="spellEnd"/>
-            <w:r>
-              <w:rPr>
-                <w:rFonts w:ascii="Times New Roman" w:hAnsi="Times New Roman" w:cs="Times New Roman"/>
-                <w:b/>
-                <w:sz w:val="20"/>
-                <w:szCs w:val="20"/>
-              </w:rPr>
-              <w:t xml:space="preserve"> </w:t>
-            </w:r>
-            <w:proofErr w:type="spellStart"/>
-            <w:r>
-              <w:rPr>
-                <w:rFonts w:ascii="Times New Roman" w:hAnsi="Times New Roman" w:cs="Times New Roman"/>
-                <w:b/>
-                <w:sz w:val="20"/>
-                <w:szCs w:val="20"/>
-              </w:rPr>
-              <w:t>Samba</w:t>
-            </w:r>
-            <w:proofErr w:type="spellEnd"/>
-            <w:r>
-              <w:rPr>
-                <w:rFonts w:ascii="Times New Roman" w:hAnsi="Times New Roman" w:cs="Times New Roman"/>
-                <w:b/>
-                <w:sz w:val="20"/>
-                <w:szCs w:val="20"/>
-              </w:rPr>
-              <w:t xml:space="preserve"> 280 </w:t>
-            </w:r>
-            <w:proofErr w:type="spellStart"/>
-            <w:r>
-              <w:rPr>
-                <w:rFonts w:ascii="Times New Roman" w:hAnsi="Times New Roman" w:cs="Times New Roman"/>
-                <w:b/>
-                <w:sz w:val="20"/>
-                <w:szCs w:val="20"/>
-              </w:rPr>
-              <w:t>SaMASZ</w:t>
-            </w:r>
-            <w:proofErr w:type="spellEnd"/>
+                <w:lang w:val="en-US"/>
+              </w:rPr>
+              <w:t xml:space="preserve">{%tr for p in </w:t>
+            </w:r>
+            <w:r>
+              <w:rPr>
+                <w:lang w:val="en-US"/>
+              </w:rPr>
+              <w:t>products</w:t>
+            </w:r>
+            <w:r>
+              <w:rPr>
+                <w:lang w:val="en-US"/>
+              </w:rPr>
+              <w:t xml:space="preserve"> %}</w:t>
+            </w:r>
           </w:p>
         </w:tc>
         <w:tc>
           <w:tcPr>
-            <w:tcW w:w="2126" w:type="dxa"/>
-            <w:shd w:val="clear" w:color="auto" w:fill="auto"/>
+            <w:tcW w:w="1279" w:type="dxa"/>
+          </w:tcPr>
+          <w:p>
+            <w:pPr>
+              <w:pStyle w:val="af"/>
+              <w:jc w:val="both"/>
+              <w:rPr>
+                <w:rFonts w:ascii="Times New Roman" w:hAnsi="Times New Roman" w:cs="Times New Roman"/>
+                <w:sz w:val="20"/>
+                <w:szCs w:val="20"/>
+                <w:lang w:val="en-US"/>
+              </w:rPr>
+            </w:pPr>
+          </w:p>
+        </w:tc>
+        <w:tc>
+          <w:tcPr>
+            <w:tcW w:w="2808" w:type="dxa"/>
+          </w:tcPr>
+          <w:p>
+            <w:pPr>
+              <w:pStyle w:val="af"/>
+              <w:jc w:val="both"/>
+              <w:rPr>
+                <w:rFonts w:ascii="Times New Roman" w:hAnsi="Times New Roman" w:cs="Times New Roman"/>
+                <w:sz w:val="20"/>
+                <w:szCs w:val="20"/>
+                <w:lang w:val="en-US"/>
+              </w:rPr>
+            </w:pPr>
+          </w:p>
+        </w:tc>
+      </w:tr>
+      <w:tr>
+        <w:trPr>
+          <w:jc w:val="center"/>
+        </w:trPr>
+        <w:tc>
+          <w:tcPr>
+            <w:tcW w:w="5807" w:type="dxa"/>
+          </w:tcPr>
+          <w:p>
+            <w:pPr>
+              <w:pStyle w:val="af"/>
+              <w:rPr>
+                <w:rFonts w:ascii="Times New Roman" w:hAnsi="Times New Roman" w:cs="Times New Roman"/>
+                <w:b/>
+                <w:bCs/>
+                <w:sz w:val="20"/>
+                <w:szCs w:val="20"/>
+                <w:lang w:val="en-US"/>
+              </w:rPr>
+            </w:pPr>
+            <w:proofErr w:type="gramStart"/>
+            <w:r>
+              <w:rPr>
+                <w:b/>
+                <w:bCs/>
+              </w:rPr>
+              <w:t>{{ p</w:t>
+            </w:r>
+            <w:proofErr w:type="gramEnd"/>
+            <w:r>
+              <w:rPr>
+                <w:b/>
+                <w:bCs/>
+              </w:rPr>
+              <w:t>.name }}</w:t>
+            </w:r>
+          </w:p>
+        </w:tc>
+        <w:tc>
+          <w:tcPr>
+            <w:tcW w:w="1279" w:type="dxa"/>
           </w:tcPr>
           <w:p>
             <w:pPr>
@@ -3902,51 +4208,128 @@
               <w:rPr>
                 <w:rFonts w:ascii="Times New Roman" w:hAnsi="Times New Roman" w:cs="Times New Roman"/>
                 <w:sz w:val="20"/>
+                <w:szCs w:val="20"/>
+                <w:lang w:val="en-US"/>
               </w:rPr>
             </w:pPr>
-            <w:r>
-              <w:rPr>
-                <w:rFonts w:ascii="Times New Roman" w:hAnsi="Times New Roman" w:cs="Times New Roman"/>
-                <w:sz w:val="20"/>
-              </w:rPr>
-              <w:t>1</w:t>
+            <w:proofErr w:type="gramStart"/>
+            <w:r>
+              <w:t>{{ p.</w:t>
+            </w:r>
+            <w:proofErr w:type="gramEnd"/>
+            <w:r>
+              <w:t xml:space="preserve"> </w:t>
+            </w:r>
+            <w:proofErr w:type="spellStart"/>
+            <w:r>
+              <w:t>quantity</w:t>
+            </w:r>
+            <w:proofErr w:type="spellEnd"/>
+            <w:r>
+              <w:t>}}</w:t>
             </w:r>
           </w:p>
         </w:tc>
         <w:tc>
           <w:tcPr>
-            <w:tcW w:w="2494" w:type="dxa"/>
-            <w:shd w:val="clear" w:color="auto" w:fill="auto"/>
+            <w:tcW w:w="2808" w:type="dxa"/>
           </w:tcPr>
           <w:p>
             <w:pPr>
               <w:pStyle w:val="af"/>
+              <w:jc w:val="center"/>
+            </w:pPr>
+            <w:proofErr w:type="gramStart"/>
+            <w:r>
+              <w:t>{{ p.</w:t>
+            </w:r>
+            <w:proofErr w:type="gramEnd"/>
+            <w:r>
+              <w:t xml:space="preserve"> </w:t>
+            </w:r>
+            <w:proofErr w:type="spellStart"/>
+            <w:r>
+              <w:t>amount</w:t>
+            </w:r>
+            <w:proofErr w:type="spellEnd"/>
+            <w:r>
+              <w:t>}}</w:t>
+            </w:r>
+          </w:p>
+        </w:tc>
+      </w:tr>
+      <w:tr>
+        <w:trPr>
+          <w:jc w:val="center"/>
+        </w:trPr>
+        <w:tc>
+          <w:tcPr>
+            <w:tcW w:w="5807" w:type="dxa"/>
+          </w:tcPr>
+          <w:p>
+            <w:pPr>
+              <w:pStyle w:val="af"/>
+              <w:jc w:val="both"/>
               <w:rPr>
                 <w:rFonts w:ascii="Times New Roman" w:hAnsi="Times New Roman" w:cs="Times New Roman"/>
                 <w:sz w:val="20"/>
+                <w:szCs w:val="20"/>
+                <w:lang w:val="en-US"/>
               </w:rPr>
             </w:pPr>
             <w:r>
+              <w:t>{%</w:t>
+            </w:r>
+            <w:proofErr w:type="spellStart"/>
+            <w:r>
+              <w:t>tr</w:t>
+            </w:r>
+            <w:proofErr w:type="spellEnd"/>
+            <w:r>
+              <w:t xml:space="preserve"> </w:t>
+            </w:r>
+            <w:proofErr w:type="spellStart"/>
+            <w:r>
+              <w:t>endfor</w:t>
+            </w:r>
+            <w:proofErr w:type="spellEnd"/>
+            <w:r>
+              <w:t xml:space="preserve"> %}</w:t>
+            </w:r>
+          </w:p>
+        </w:tc>
+        <w:tc>
+          <w:tcPr>
+            <w:tcW w:w="1279" w:type="dxa"/>
+          </w:tcPr>
+          <w:p>
+            <w:pPr>
+              <w:pStyle w:val="af"/>
+              <w:jc w:val="both"/>
               <w:rPr>
                 <w:rFonts w:ascii="Times New Roman" w:hAnsi="Times New Roman" w:cs="Times New Roman"/>
                 <w:sz w:val="20"/>
-              </w:rPr>
-              <w:t>845</w:t>
-            </w:r>
-            <w:r>
+                <w:szCs w:val="20"/>
+                <w:lang w:val="en-US"/>
+              </w:rPr>
+            </w:pPr>
+          </w:p>
+        </w:tc>
+        <w:tc>
+          <w:tcPr>
+            <w:tcW w:w="2808" w:type="dxa"/>
+          </w:tcPr>
+          <w:p>
+            <w:pPr>
+              <w:pStyle w:val="af"/>
+              <w:jc w:val="both"/>
               <w:rPr>
                 <w:rFonts w:ascii="Times New Roman" w:hAnsi="Times New Roman" w:cs="Times New Roman"/>
                 <w:sz w:val="20"/>
-              </w:rPr>
-              <w:t xml:space="preserve"> 000</w:t>
-            </w:r>
-            <w:r>
-              <w:rPr>
-                <w:rFonts w:ascii="Times New Roman" w:hAnsi="Times New Roman" w:cs="Times New Roman"/>
-                <w:sz w:val="20"/>
-              </w:rPr>
-              <w:t>,00</w:t>
-            </w:r>
+                <w:szCs w:val="20"/>
+                <w:lang w:val="en-US"/>
+              </w:rPr>
+            </w:pPr>
           </w:p>
         </w:tc>
       </w:tr>
@@ -3954,12 +4337,13 @@
     <w:p>
       <w:pPr>
         <w:pStyle w:val="af"/>
-        <w:ind w:left="720"/>
+        <w:ind w:left="680"/>
         <w:jc w:val="both"/>
         <w:rPr>
           <w:rFonts w:ascii="Times New Roman" w:hAnsi="Times New Roman" w:cs="Times New Roman"/>
           <w:sz w:val="20"/>
           <w:szCs w:val="20"/>
+          <w:lang w:val="en-US"/>
         </w:rPr>
       </w:pPr>
     </w:p>
@@ -3970,6 +4354,7 @@
           <w:ilvl w:val="0"/>
           <w:numId w:val="13"/>
         </w:numPr>
+        <w:ind w:left="641" w:hanging="357"/>
         <w:jc w:val="both"/>
         <w:rPr>
           <w:rFonts w:ascii="Times New Roman" w:hAnsi="Times New Roman" w:cs="Times New Roman"/>
@@ -4009,7 +4394,16 @@
           <w:sz w:val="20"/>
           <w:szCs w:val="20"/>
         </w:rPr>
-        <w:t>Восемьсот сорок пять тысяч</w:t>
+        <w:t xml:space="preserve">Восемьсот сорок пять </w:t>
+      </w:r>
+      <w:proofErr w:type="gramStart"/>
+      <w:r>
+        <w:rPr>
+          <w:rFonts w:ascii="Times New Roman" w:hAnsi="Times New Roman" w:cs="Times New Roman"/>
+          <w:sz w:val="20"/>
+          <w:szCs w:val="20"/>
+        </w:rPr>
+        <w:t>тысяч</w:t>
       </w:r>
       <w:r>
         <w:rPr>
@@ -4041,7 +4435,16 @@
           <w:sz w:val="20"/>
           <w:szCs w:val="20"/>
         </w:rPr>
-        <w:t>ублей 00 копеек</w:t>
+        <w:t>ублей</w:t>
+      </w:r>
+      <w:proofErr w:type="gramEnd"/>
+      <w:r>
+        <w:rPr>
+          <w:rFonts w:ascii="Times New Roman" w:hAnsi="Times New Roman" w:cs="Times New Roman"/>
+          <w:sz w:val="20"/>
+          <w:szCs w:val="20"/>
+        </w:rPr>
+        <w:t xml:space="preserve"> 00 копеек</w:t>
       </w:r>
       <w:r>
         <w:rPr>
@@ -4087,6 +4490,7 @@
       </w:r>
       <w:bookmarkEnd w:id="16"/>
       <w:bookmarkEnd w:id="17"/>
+      <w:proofErr w:type="gramStart"/>
       <w:r>
         <w:rPr>
           <w:b/>
@@ -4101,6 +4505,7 @@
         <w:t>number</w:t>
       </w:r>
       <w:proofErr w:type="spellEnd"/>
+      <w:proofErr w:type="gramEnd"/>
       <w:r>
         <w:rPr>
           <w:b/>
@@ -4256,6 +4661,7 @@
             <w:shd w:val="clear" w:color="auto" w:fill="auto"/>
           </w:tcPr>
           <w:p>
+            <w:proofErr w:type="gramStart"/>
             <w:r>
               <w:rPr>
                 <w:b/>
@@ -4278,6 +4684,7 @@
               <w:t>fio</w:t>
             </w:r>
             <w:proofErr w:type="spellEnd"/>
+            <w:proofErr w:type="gramEnd"/>
             <w:r>
               <w:rPr>
                 <w:b/>
@@ -4328,11 +4735,19 @@
                 <w:color w:val="000000"/>
               </w:rPr>
             </w:pPr>
-            <w:r>
-              <w:rPr>
-                <w:color w:val="000000"/>
-              </w:rPr>
-              <w:t xml:space="preserve">ИНН  390702639548 </w:t>
+            <w:proofErr w:type="gramStart"/>
+            <w:r>
+              <w:rPr>
+                <w:color w:val="000000"/>
+              </w:rPr>
+              <w:t>ИНН  390702639548</w:t>
+            </w:r>
+            <w:proofErr w:type="gramEnd"/>
+            <w:r>
+              <w:rPr>
+                <w:color w:val="000000"/>
+              </w:rPr>
+              <w:t xml:space="preserve"> </w:t>
             </w:r>
           </w:p>
           <w:p>
@@ -4354,11 +4769,19 @@
                 <w:color w:val="000000"/>
               </w:rPr>
             </w:pPr>
-            <w:r>
-              <w:rPr>
-                <w:color w:val="000000"/>
-              </w:rPr>
-              <w:t>236029  г. Калининград,  ул. Тихая  д.20  кв.3</w:t>
+            <w:proofErr w:type="gramStart"/>
+            <w:r>
+              <w:rPr>
+                <w:color w:val="000000"/>
+              </w:rPr>
+              <w:t>236029  г.</w:t>
+            </w:r>
+            <w:proofErr w:type="gramEnd"/>
+            <w:r>
+              <w:rPr>
+                <w:color w:val="000000"/>
+              </w:rPr>
+              <w:t xml:space="preserve"> Калининград,  ул. Тихая  д.20  кв.3</w:t>
             </w:r>
           </w:p>
           <w:p>
@@ -4384,7 +4807,21 @@
               <w:rPr>
                 <w:color w:val="000000"/>
               </w:rPr>
-              <w:t>Банк получателя:  Ф-Л "ЕВРОПЕЙСКИЙ" ПАО "БАНК "САНКТ-ПЕТЕРБУРГ", г. КАЛИНИНГРАД</w:t>
+              <w:t xml:space="preserve">Банк </w:t>
+            </w:r>
+            <w:proofErr w:type="gramStart"/>
+            <w:r>
+              <w:rPr>
+                <w:color w:val="000000"/>
+              </w:rPr>
+              <w:t>получателя:  Ф</w:t>
+            </w:r>
+            <w:proofErr w:type="gramEnd"/>
+            <w:r>
+              <w:rPr>
+                <w:color w:val="000000"/>
+              </w:rPr>
+              <w:t>-Л "ЕВРОПЕЙСКИЙ" ПАО "БАНК "САНКТ-ПЕТЕРБУРГ", г. КАЛИНИНГРАД</w:t>
             </w:r>
           </w:p>
           <w:p>
@@ -4444,6 +4881,7 @@
                 <w:lang w:val="en-US" w:eastAsia="ar-SA"/>
               </w:rPr>
             </w:pPr>
+            <w:proofErr w:type="gramStart"/>
             <w:r>
               <w:rPr>
                 <w:rFonts w:eastAsia="Times New Roman"/>
@@ -4452,7 +4890,18 @@
                 <w:szCs w:val="20"/>
                 <w:lang w:val="en-US" w:eastAsia="ar-SA"/>
               </w:rPr>
-              <w:t>{{ address }}</w:t>
+              <w:t>{{ address</w:t>
+            </w:r>
+            <w:proofErr w:type="gramEnd"/>
+            <w:r>
+              <w:rPr>
+                <w:rFonts w:eastAsia="Times New Roman"/>
+                <w:color w:val="000000"/>
+                <w:sz w:val="20"/>
+                <w:szCs w:val="20"/>
+                <w:lang w:val="en-US" w:eastAsia="ar-SA"/>
+              </w:rPr>
+              <w:t xml:space="preserve"> }}</w:t>
             </w:r>
           </w:p>
           <w:p>
@@ -4505,7 +4954,18 @@
                 <w:szCs w:val="20"/>
                 <w:lang w:val="en-US" w:eastAsia="ar-SA"/>
               </w:rPr>
-              <w:t xml:space="preserve"> {{</w:t>
+              <w:t xml:space="preserve"> </w:t>
+            </w:r>
+            <w:proofErr w:type="gramStart"/>
+            <w:r>
+              <w:rPr>
+                <w:rFonts w:eastAsia="Times New Roman"/>
+                <w:color w:val="000000"/>
+                <w:sz w:val="20"/>
+                <w:szCs w:val="20"/>
+                <w:lang w:val="en-US" w:eastAsia="ar-SA"/>
+              </w:rPr>
+              <w:t>{{</w:t>
             </w:r>
             <w:r>
               <w:rPr>
@@ -4524,7 +4984,18 @@
                 <w:szCs w:val="20"/>
                 <w:lang w:val="en-US" w:eastAsia="ar-SA"/>
               </w:rPr>
-              <w:t>passport_series</w:t>
+              <w:t>passport</w:t>
+            </w:r>
+            <w:proofErr w:type="gramEnd"/>
+            <w:r>
+              <w:rPr>
+                <w:rFonts w:eastAsia="Times New Roman"/>
+                <w:color w:val="000000"/>
+                <w:sz w:val="20"/>
+                <w:szCs w:val="20"/>
+                <w:lang w:val="en-US" w:eastAsia="ar-SA"/>
+              </w:rPr>
+              <w:t>_series</w:t>
             </w:r>
             <w:proofErr w:type="spellEnd"/>
             <w:r>
@@ -4610,6 +5081,7 @@
               </w:rPr>
               <w:t xml:space="preserve"> </w:t>
             </w:r>
+            <w:proofErr w:type="gramStart"/>
             <w:r>
               <w:rPr>
                 <w:rFonts w:eastAsia="Times New Roman"/>
@@ -4629,7 +5101,18 @@
                 <w:szCs w:val="20"/>
                 <w:lang w:val="en-US" w:eastAsia="ar-SA"/>
               </w:rPr>
-              <w:t>passport_issued</w:t>
+              <w:t>passport</w:t>
+            </w:r>
+            <w:proofErr w:type="gramEnd"/>
+            <w:r>
+              <w:rPr>
+                <w:rFonts w:eastAsia="Times New Roman"/>
+                <w:color w:val="000000"/>
+                <w:sz w:val="20"/>
+                <w:szCs w:val="20"/>
+                <w:lang w:val="en-US" w:eastAsia="ar-SA"/>
+              </w:rPr>
+              <w:t>_issued</w:t>
             </w:r>
             <w:proofErr w:type="spellEnd"/>
             <w:r>
@@ -4693,7 +5176,18 @@
                 <w:szCs w:val="20"/>
                 <w:lang w:val="en-US" w:eastAsia="ar-SA"/>
               </w:rPr>
-              <w:t xml:space="preserve">: {{ </w:t>
+              <w:t xml:space="preserve">: </w:t>
+            </w:r>
+            <w:proofErr w:type="gramStart"/>
+            <w:r>
+              <w:rPr>
+                <w:rFonts w:eastAsia="Times New Roman"/>
+                <w:color w:val="000000"/>
+                <w:sz w:val="20"/>
+                <w:szCs w:val="20"/>
+                <w:lang w:val="en-US" w:eastAsia="ar-SA"/>
+              </w:rPr>
+              <w:t xml:space="preserve">{{ </w:t>
             </w:r>
             <w:proofErr w:type="spellStart"/>
             <w:r>
@@ -4706,6 +5200,7 @@
               </w:rPr>
               <w:t>passport</w:t>
             </w:r>
+            <w:proofErr w:type="gramEnd"/>
             <w:r>
               <w:rPr>
                 <w:rFonts w:eastAsia="Times New Roman"/>
@@ -4782,6 +5277,7 @@
               </w:rPr>
               <w:t xml:space="preserve">: </w:t>
             </w:r>
+            <w:proofErr w:type="gramStart"/>
             <w:r>
               <w:rPr>
                 <w:rFonts w:eastAsia="Times New Roman"/>
@@ -4803,6 +5299,7 @@
               </w:rPr>
               <w:t>passport</w:t>
             </w:r>
+            <w:proofErr w:type="gramEnd"/>
             <w:r>
               <w:rPr>
                 <w:rFonts w:eastAsia="Times New Roman"/>
@@ -4838,13 +5335,27 @@
               <w:rPr>
                 <w:lang w:val="en-US"/>
               </w:rPr>
-              <w:t>: {{</w:t>
-            </w:r>
+              <w:t xml:space="preserve">: </w:t>
+            </w:r>
+            <w:proofErr w:type="gramStart"/>
             <w:r>
               <w:rPr>
                 <w:lang w:val="en-US"/>
               </w:rPr>
-              <w:t xml:space="preserve"> phone </w:t>
+              <w:t>{{</w:t>
+            </w:r>
+            <w:r>
+              <w:rPr>
+                <w:lang w:val="en-US"/>
+              </w:rPr>
+              <w:t xml:space="preserve"> phone</w:t>
+            </w:r>
+            <w:proofErr w:type="gramEnd"/>
+            <w:r>
+              <w:rPr>
+                <w:lang w:val="en-US"/>
+              </w:rPr>
+              <w:t xml:space="preserve"> </w:t>
             </w:r>
             <w:r>
               <w:rPr>
@@ -4889,10 +5400,18 @@
         <w:t xml:space="preserve">                                                       </w:t>
       </w:r>
       <w:r>
-        <w:t xml:space="preserve">________________________  </w:t>
-      </w:r>
-      <w:r>
-        <w:t xml:space="preserve">{{ </w:t>
+        <w:t>_______________________</w:t>
+      </w:r>
+      <w:proofErr w:type="gramStart"/>
+      <w:r>
+        <w:t xml:space="preserve">_  </w:t>
+      </w:r>
+      <w:r>
+        <w:t>{</w:t>
+      </w:r>
+      <w:proofErr w:type="gramEnd"/>
+      <w:r>
+        <w:t xml:space="preserve">{ </w:t>
       </w:r>
       <w:r>
         <w:rPr>
@@ -5019,6 +5538,7 @@
         </w:rPr>
         <w:t xml:space="preserve">ия </w:t>
       </w:r>
+      <w:proofErr w:type="gramStart"/>
       <w:r>
         <w:rPr>
           <w:b/>
@@ -5035,6 +5555,7 @@
         </w:rPr>
         <w:t>number</w:t>
       </w:r>
+      <w:proofErr w:type="gramEnd"/>
       <w:r>
         <w:rPr>
           <w:b/>
@@ -5138,10 +5659,18 @@
         <w:jc w:val="both"/>
       </w:pPr>
       <w:r>
-        <w:t xml:space="preserve">г. Калининград                                                                                                                          </w:t>
-      </w:r>
-      <w:r>
-        <w:t>«__»_______  202</w:t>
+        <w:t xml:space="preserve">г. Калининград                                                                                                                       </w:t>
+      </w:r>
+      <w:proofErr w:type="gramStart"/>
+      <w:r>
+        <w:t xml:space="preserve">   </w:t>
+      </w:r>
+      <w:r>
+        <w:t>«</w:t>
+      </w:r>
+      <w:proofErr w:type="gramEnd"/>
+      <w:r>
+        <w:t>__»_______  202</w:t>
       </w:r>
       <w:r>
         <w:t>5</w:t>
@@ -5342,6 +5871,7 @@
       </w:r>
       <w:bookmarkEnd w:id="18"/>
       <w:bookmarkEnd w:id="19"/>
+      <w:proofErr w:type="gramStart"/>
       <w:r>
         <w:rPr>
           <w:b/>
@@ -5358,6 +5888,7 @@
         </w:rPr>
         <w:t>number</w:t>
       </w:r>
+      <w:proofErr w:type="gramEnd"/>
       <w:r>
         <w:rPr>
           <w:b/>
@@ -5748,7 +6279,11 @@
         <w:t xml:space="preserve">. Настоящий акт является неотъемлемой частью договора купли-продажи оборудования </w:t>
       </w:r>
       <w:r>
-        <w:t xml:space="preserve">купли-продажи оборудования </w:t>
+        <w:t xml:space="preserve">купли-продажи </w:t>
+      </w:r>
+      <w:proofErr w:type="gramStart"/>
+      <w:r>
+        <w:t xml:space="preserve">оборудования </w:t>
       </w:r>
       <w:r>
         <w:t xml:space="preserve"> </w:t>
@@ -5757,7 +6292,14 @@
         <w:rPr>
           <w:b/>
         </w:rPr>
-        <w:t xml:space="preserve">{{ </w:t>
+        <w:t>{</w:t>
+      </w:r>
+      <w:proofErr w:type="gramEnd"/>
+      <w:r>
+        <w:rPr>
+          <w:b/>
+        </w:rPr>
+        <w:t xml:space="preserve">{ </w:t>
       </w:r>
       <w:proofErr w:type="spellStart"/>
       <w:r>
@@ -5941,6 +6483,7 @@
             <w:shd w:val="clear" w:color="auto" w:fill="auto"/>
           </w:tcPr>
           <w:p>
+            <w:proofErr w:type="gramStart"/>
             <w:r>
               <w:rPr>
                 <w:b/>
@@ -5963,6 +6506,7 @@
               <w:t>fio</w:t>
             </w:r>
             <w:proofErr w:type="spellEnd"/>
+            <w:proofErr w:type="gramEnd"/>
             <w:r>
               <w:rPr>
                 <w:b/>
@@ -6013,11 +6557,19 @@
                 <w:color w:val="000000"/>
               </w:rPr>
             </w:pPr>
-            <w:r>
-              <w:rPr>
-                <w:color w:val="000000"/>
-              </w:rPr>
-              <w:t xml:space="preserve">ИНН  390702639548 </w:t>
+            <w:proofErr w:type="gramStart"/>
+            <w:r>
+              <w:rPr>
+                <w:color w:val="000000"/>
+              </w:rPr>
+              <w:t>ИНН  390702639548</w:t>
+            </w:r>
+            <w:proofErr w:type="gramEnd"/>
+            <w:r>
+              <w:rPr>
+                <w:color w:val="000000"/>
+              </w:rPr>
+              <w:t xml:space="preserve"> </w:t>
             </w:r>
           </w:p>
           <w:p>
@@ -6039,11 +6591,19 @@
                 <w:color w:val="000000"/>
               </w:rPr>
             </w:pPr>
-            <w:r>
-              <w:rPr>
-                <w:color w:val="000000"/>
-              </w:rPr>
-              <w:t>236029  г. Калининград,  ул. Тихая  д.20  кв.3</w:t>
+            <w:proofErr w:type="gramStart"/>
+            <w:r>
+              <w:rPr>
+                <w:color w:val="000000"/>
+              </w:rPr>
+              <w:t>236029  г.</w:t>
+            </w:r>
+            <w:proofErr w:type="gramEnd"/>
+            <w:r>
+              <w:rPr>
+                <w:color w:val="000000"/>
+              </w:rPr>
+              <w:t xml:space="preserve"> Калининград,  ул. Тихая  д.20  кв.3</w:t>
             </w:r>
           </w:p>
           <w:p>
@@ -6069,7 +6629,21 @@
               <w:rPr>
                 <w:color w:val="000000"/>
               </w:rPr>
-              <w:t>Банк получателя:  Ф-Л "ЕВРОПЕЙСКИЙ" ПАО "БАНК "САНКТ-ПЕТЕРБУРГ", г. КАЛИНИНГРАД</w:t>
+              <w:t xml:space="preserve">Банк </w:t>
+            </w:r>
+            <w:proofErr w:type="gramStart"/>
+            <w:r>
+              <w:rPr>
+                <w:color w:val="000000"/>
+              </w:rPr>
+              <w:t>получателя:  Ф</w:t>
+            </w:r>
+            <w:proofErr w:type="gramEnd"/>
+            <w:r>
+              <w:rPr>
+                <w:color w:val="000000"/>
+              </w:rPr>
+              <w:t>-Л "ЕВРОПЕЙСКИЙ" ПАО "БАНК "САНКТ-ПЕТЕРБУРГ", г. КАЛИНИНГРАД</w:t>
             </w:r>
           </w:p>
           <w:p>
@@ -6129,6 +6703,7 @@
                 <w:lang w:val="en-US" w:eastAsia="ar-SA"/>
               </w:rPr>
             </w:pPr>
+            <w:proofErr w:type="gramStart"/>
             <w:r>
               <w:rPr>
                 <w:rFonts w:eastAsia="Times New Roman"/>
@@ -6137,7 +6712,18 @@
                 <w:szCs w:val="20"/>
                 <w:lang w:val="en-US" w:eastAsia="ar-SA"/>
               </w:rPr>
-              <w:t>{{ address }}</w:t>
+              <w:t>{{ address</w:t>
+            </w:r>
+            <w:proofErr w:type="gramEnd"/>
+            <w:r>
+              <w:rPr>
+                <w:rFonts w:eastAsia="Times New Roman"/>
+                <w:color w:val="000000"/>
+                <w:sz w:val="20"/>
+                <w:szCs w:val="20"/>
+                <w:lang w:val="en-US" w:eastAsia="ar-SA"/>
+              </w:rPr>
+              <w:t xml:space="preserve"> }}</w:t>
             </w:r>
           </w:p>
           <w:p>
@@ -6190,7 +6776,18 @@
                 <w:szCs w:val="20"/>
                 <w:lang w:val="en-US" w:eastAsia="ar-SA"/>
               </w:rPr>
-              <w:t xml:space="preserve"> {{</w:t>
+              <w:t xml:space="preserve"> </w:t>
+            </w:r>
+            <w:proofErr w:type="gramStart"/>
+            <w:r>
+              <w:rPr>
+                <w:rFonts w:eastAsia="Times New Roman"/>
+                <w:color w:val="000000"/>
+                <w:sz w:val="20"/>
+                <w:szCs w:val="20"/>
+                <w:lang w:val="en-US" w:eastAsia="ar-SA"/>
+              </w:rPr>
+              <w:t>{{</w:t>
             </w:r>
             <w:r>
               <w:rPr>
@@ -6209,7 +6806,18 @@
                 <w:szCs w:val="20"/>
                 <w:lang w:val="en-US" w:eastAsia="ar-SA"/>
               </w:rPr>
-              <w:t>passport_series</w:t>
+              <w:t>passport</w:t>
+            </w:r>
+            <w:proofErr w:type="gramEnd"/>
+            <w:r>
+              <w:rPr>
+                <w:rFonts w:eastAsia="Times New Roman"/>
+                <w:color w:val="000000"/>
+                <w:sz w:val="20"/>
+                <w:szCs w:val="20"/>
+                <w:lang w:val="en-US" w:eastAsia="ar-SA"/>
+              </w:rPr>
+              <w:t>_series</w:t>
             </w:r>
             <w:proofErr w:type="spellEnd"/>
             <w:r>
@@ -6285,6 +6893,7 @@
               </w:rPr>
               <w:t xml:space="preserve"> </w:t>
             </w:r>
+            <w:proofErr w:type="gramStart"/>
             <w:r>
               <w:rPr>
                 <w:rFonts w:eastAsia="Times New Roman"/>
@@ -6304,7 +6913,18 @@
                 <w:szCs w:val="20"/>
                 <w:lang w:val="en-US" w:eastAsia="ar-SA"/>
               </w:rPr>
-              <w:t>passport_issued</w:t>
+              <w:t>passport</w:t>
+            </w:r>
+            <w:proofErr w:type="gramEnd"/>
+            <w:r>
+              <w:rPr>
+                <w:rFonts w:eastAsia="Times New Roman"/>
+                <w:color w:val="000000"/>
+                <w:sz w:val="20"/>
+                <w:szCs w:val="20"/>
+                <w:lang w:val="en-US" w:eastAsia="ar-SA"/>
+              </w:rPr>
+              <w:t>_issued</w:t>
             </w:r>
             <w:proofErr w:type="spellEnd"/>
             <w:r>
@@ -6368,7 +6988,18 @@
                 <w:szCs w:val="20"/>
                 <w:lang w:val="en-US" w:eastAsia="ar-SA"/>
               </w:rPr>
-              <w:t xml:space="preserve">: {{ </w:t>
+              <w:t xml:space="preserve">: </w:t>
+            </w:r>
+            <w:proofErr w:type="gramStart"/>
+            <w:r>
+              <w:rPr>
+                <w:rFonts w:eastAsia="Times New Roman"/>
+                <w:color w:val="000000"/>
+                <w:sz w:val="20"/>
+                <w:szCs w:val="20"/>
+                <w:lang w:val="en-US" w:eastAsia="ar-SA"/>
+              </w:rPr>
+              <w:t xml:space="preserve">{{ </w:t>
             </w:r>
             <w:proofErr w:type="spellStart"/>
             <w:r>
@@ -6381,6 +7012,7 @@
               </w:rPr>
               <w:t>passport</w:t>
             </w:r>
+            <w:proofErr w:type="gramEnd"/>
             <w:r>
               <w:rPr>
                 <w:rFonts w:eastAsia="Times New Roman"/>
@@ -6457,6 +7089,7 @@
               </w:rPr>
               <w:t xml:space="preserve">: </w:t>
             </w:r>
+            <w:proofErr w:type="gramStart"/>
             <w:r>
               <w:rPr>
                 <w:rFonts w:eastAsia="Times New Roman"/>
@@ -6478,6 +7111,7 @@
               </w:rPr>
               <w:t>passport</w:t>
             </w:r>
+            <w:proofErr w:type="gramEnd"/>
             <w:r>
               <w:rPr>
                 <w:rFonts w:eastAsia="Times New Roman"/>
@@ -6513,7 +7147,21 @@
               <w:rPr>
                 <w:lang w:val="en-US"/>
               </w:rPr>
-              <w:t>: {{ phone }}</w:t>
+              <w:t xml:space="preserve">: </w:t>
+            </w:r>
+            <w:proofErr w:type="gramStart"/>
+            <w:r>
+              <w:rPr>
+                <w:lang w:val="en-US"/>
+              </w:rPr>
+              <w:t>{{ phone</w:t>
+            </w:r>
+            <w:proofErr w:type="gramEnd"/>
+            <w:r>
+              <w:rPr>
+                <w:lang w:val="en-US"/>
+              </w:rPr>
+              <w:t xml:space="preserve"> }}</w:t>
             </w:r>
           </w:p>
           <w:p>
@@ -6521,6 +7169,7 @@
               <w:rPr>
                 <w:color w:val="000000"/>
                 <w:sz w:val="18"/>
+                <w:lang w:val="en-US"/>
               </w:rPr>
             </w:pPr>
           </w:p>
@@ -6531,11 +7180,24 @@
               <w:rPr>
                 <w:sz w:val="18"/>
                 <w:szCs w:val="18"/>
+                <w:lang w:val="en-US"/>
               </w:rPr>
             </w:pPr>
           </w:p>
-          <w:p/>
-          <w:p/>
+          <w:p>
+            <w:pPr>
+              <w:rPr>
+                <w:lang w:val="en-US"/>
+              </w:rPr>
+            </w:pPr>
+          </w:p>
+          <w:p>
+            <w:pPr>
+              <w:rPr>
+                <w:lang w:val="en-US"/>
+              </w:rPr>
+            </w:pPr>
+          </w:p>
         </w:tc>
       </w:tr>
     </w:tbl>
@@ -6565,10 +7227,18 @@
         <w:t xml:space="preserve">                                                       </w:t>
       </w:r>
       <w:r>
-        <w:t xml:space="preserve">________________________  </w:t>
-      </w:r>
-      <w:r>
-        <w:t xml:space="preserve">{{ </w:t>
+        <w:t>_______________________</w:t>
+      </w:r>
+      <w:proofErr w:type="gramStart"/>
+      <w:r>
+        <w:t xml:space="preserve">_  </w:t>
+      </w:r>
+      <w:r>
+        <w:t>{</w:t>
+      </w:r>
+      <w:proofErr w:type="gramEnd"/>
+      <w:r>
+        <w:t xml:space="preserve">{ </w:t>
       </w:r>
       <w:r>
         <w:rPr>
@@ -6652,6 +7322,7 @@
         <w:i/>
       </w:rPr>
     </w:pPr>
+    <w:proofErr w:type="gramStart"/>
     <w:r>
       <w:rPr>
         <w:i/>
@@ -6662,7 +7333,14 @@
       <w:rPr>
         <w:i/>
       </w:rPr>
-      <w:t>купли-продажи</w:t>
+      <w:t>купли</w:t>
+    </w:r>
+    <w:proofErr w:type="gramEnd"/>
+    <w:r>
+      <w:rPr>
+        <w:i/>
+      </w:rPr>
+      <w:t>-продажи</w:t>
     </w:r>
     <w:r>
       <w:rPr>
@@ -6764,7 +7442,21 @@
       <w:rPr>
         <w:i/>
       </w:rPr>
-      <w:t>От ПОСТАВЩИКА: ____________________________   От ПОКУПАТЕЛЯ:_______________________________</w:t>
+      <w:t xml:space="preserve">От ПОСТАВЩИКА: ____________________________   От </w:t>
+    </w:r>
+    <w:proofErr w:type="gramStart"/>
+    <w:r>
+      <w:rPr>
+        <w:i/>
+      </w:rPr>
+      <w:t>ПОКУПАТЕЛЯ:_</w:t>
+    </w:r>
+    <w:proofErr w:type="gramEnd"/>
+    <w:r>
+      <w:rPr>
+        <w:i/>
+      </w:rPr>
+      <w:t>______________________________</w:t>
     </w:r>
   </w:p>
   <w:p>
@@ -9134,6 +9826,65 @@
       <w:lang w:eastAsia="ru-RU"/>
     </w:rPr>
   </w:style>
+  <w:style w:type="paragraph" w:styleId="HTML">
+    <w:name w:val="HTML Preformatted"/>
+    <w:basedOn w:val="a0"/>
+    <w:link w:val="HTML0"/>
+    <w:uiPriority w:val="99"/>
+    <w:unhideWhenUsed/>
+    <w:rsid w:val="002B1F23"/>
+    <w:pPr>
+      <w:tabs>
+        <w:tab w:val="left" w:pos="916"/>
+        <w:tab w:val="left" w:pos="1832"/>
+        <w:tab w:val="left" w:pos="2748"/>
+        <w:tab w:val="left" w:pos="3664"/>
+        <w:tab w:val="left" w:pos="4580"/>
+        <w:tab w:val="left" w:pos="5496"/>
+        <w:tab w:val="left" w:pos="6412"/>
+        <w:tab w:val="left" w:pos="7328"/>
+        <w:tab w:val="left" w:pos="8244"/>
+        <w:tab w:val="left" w:pos="9160"/>
+        <w:tab w:val="left" w:pos="10076"/>
+        <w:tab w:val="left" w:pos="10992"/>
+        <w:tab w:val="left" w:pos="11908"/>
+        <w:tab w:val="left" w:pos="12824"/>
+        <w:tab w:val="left" w:pos="13740"/>
+        <w:tab w:val="left" w:pos="14656"/>
+      </w:tabs>
+      <w:suppressAutoHyphens w:val="0"/>
+    </w:pPr>
+    <w:rPr>
+      <w:rFonts w:ascii="Courier New" w:hAnsi="Courier New" w:cs="Courier New"/>
+      <w:lang w:eastAsia="ru-RU"/>
+    </w:rPr>
+  </w:style>
+  <w:style w:type="character" w:customStyle="1" w:styleId="HTML0">
+    <w:name w:val="Стандартный HTML Знак"/>
+    <w:basedOn w:val="a1"/>
+    <w:link w:val="HTML"/>
+    <w:uiPriority w:val="99"/>
+    <w:rsid w:val="002B1F23"/>
+    <w:rPr>
+      <w:rFonts w:ascii="Courier New" w:hAnsi="Courier New" w:cs="Courier New"/>
+    </w:rPr>
+  </w:style>
+  <w:style w:type="table" w:styleId="af7">
+    <w:name w:val="Table Grid"/>
+    <w:basedOn w:val="a2"/>
+    <w:uiPriority w:val="59"/>
+    <w:rsid w:val="000E0F68"/>
+    <w:tblPr>
+      <w:tblBorders>
+        <w:top w:val="single" w:sz="4" w:space="0" w:color="auto"/>
+        <w:left w:val="single" w:sz="4" w:space="0" w:color="auto"/>
+        <w:bottom w:val="single" w:sz="4" w:space="0" w:color="auto"/>
+        <w:right w:val="single" w:sz="4" w:space="0" w:color="auto"/>
+        <w:insideH w:val="single" w:sz="4" w:space="0" w:color="auto"/>
+        <w:insideV w:val="single" w:sz="4" w:space="0" w:color="auto"/>
+      </w:tblBorders>
+    </w:tblPr>
+  </w:style>
 </w:styles>
 </file>
 

</xml_diff>

<commit_message>
many changes have been added
</commit_message>
<xml_diff>
--- a/templates/contract_template.docx
+++ b/templates/contract_template.docx
@@ -271,7 +271,39 @@
         <w:t>, выдан</w:t>
       </w:r>
       <w:r>
-        <w:t xml:space="preserve"> 08.06.2011</w:t>
+        <w:t xml:space="preserve"> </w:t>
+      </w:r>
+      <w:r>
+        <w:rPr>
+          <w:color w:val="000000"/>
+        </w:rPr>
+        <w:t xml:space="preserve">{{ </w:t>
+      </w:r>
+      <w:r>
+        <w:rPr>
+          <w:color w:val="000000"/>
+          <w:lang w:val="en-US"/>
+        </w:rPr>
+        <w:t>passport</w:t>
+      </w:r>
+      <w:r>
+        <w:rPr>
+          <w:color w:val="000000"/>
+        </w:rPr>
+        <w:t>_</w:t>
+      </w:r>
+      <w:r>
+        <w:rPr>
+          <w:color w:val="000000"/>
+          <w:lang w:val="en-US"/>
+        </w:rPr>
+        <w:t>date</w:t>
+      </w:r>
+      <w:r>
+        <w:rPr>
+          <w:color w:val="000000"/>
+        </w:rPr>
+        <w:t xml:space="preserve"> }}</w:t>
       </w:r>
       <w:r>
         <w:t xml:space="preserve"> года</w:t>
@@ -767,7 +799,59 @@
           <w:sz w:val="20"/>
           <w:szCs w:val="20"/>
         </w:rPr>
-        <w:t>00 копеек</w:t>
+        <w:t xml:space="preserve">{{ </w:t>
+      </w:r>
+      <w:proofErr w:type="spellStart"/>
+      <w:r>
+        <w:rPr>
+          <w:rFonts w:ascii="Times New Roman" w:hAnsi="Times New Roman" w:cs="Times New Roman"/>
+          <w:sz w:val="20"/>
+          <w:szCs w:val="20"/>
+        </w:rPr>
+        <w:t>cents_number</w:t>
+      </w:r>
+      <w:proofErr w:type="spellEnd"/>
+      <w:r>
+        <w:rPr>
+          <w:rFonts w:ascii="Times New Roman" w:hAnsi="Times New Roman" w:cs="Times New Roman"/>
+          <w:sz w:val="20"/>
+          <w:szCs w:val="20"/>
+        </w:rPr>
+        <w:t xml:space="preserve"> }}</w:t>
+      </w:r>
+      <w:r>
+        <w:rPr>
+          <w:rFonts w:ascii="Times New Roman" w:hAnsi="Times New Roman" w:cs="Times New Roman"/>
+          <w:sz w:val="20"/>
+          <w:szCs w:val="20"/>
+        </w:rPr>
+        <w:t xml:space="preserve"> </w:t>
+      </w:r>
+      <w:r>
+        <w:rPr>
+          <w:rFonts w:ascii="Times New Roman" w:hAnsi="Times New Roman" w:cs="Times New Roman"/>
+          <w:sz w:val="20"/>
+          <w:szCs w:val="20"/>
+        </w:rPr>
+        <w:t xml:space="preserve">{{ </w:t>
+      </w:r>
+      <w:proofErr w:type="spellStart"/>
+      <w:r>
+        <w:rPr>
+          <w:rFonts w:ascii="Times New Roman" w:hAnsi="Times New Roman" w:cs="Times New Roman"/>
+          <w:sz w:val="20"/>
+          <w:szCs w:val="20"/>
+        </w:rPr>
+        <w:t>currency_kop</w:t>
+      </w:r>
+      <w:proofErr w:type="spellEnd"/>
+      <w:r>
+        <w:rPr>
+          <w:rFonts w:ascii="Times New Roman" w:hAnsi="Times New Roman" w:cs="Times New Roman"/>
+          <w:sz w:val="20"/>
+          <w:szCs w:val="20"/>
+        </w:rPr>
+        <w:t xml:space="preserve"> }}</w:t>
       </w:r>
       <w:bookmarkEnd w:id="6"/>
       <w:bookmarkEnd w:id="7"/>
@@ -803,7 +887,260 @@
           <w:sz w:val="20"/>
           <w:szCs w:val="20"/>
         </w:rPr>
-        <w:t>НДС 5%</w:t>
+        <w:t xml:space="preserve">НДС </w:t>
+      </w:r>
+      <w:r>
+        <w:rPr>
+          <w:rFonts w:ascii="Times New Roman" w:hAnsi="Times New Roman" w:cs="Times New Roman"/>
+          <w:sz w:val="20"/>
+          <w:szCs w:val="20"/>
+          <w:highlight w:val="yellow"/>
+        </w:rPr>
+        <w:t>5%</w:t>
+      </w:r>
+      <w:r>
+        <w:rPr>
+          <w:rFonts w:ascii="Times New Roman" w:hAnsi="Times New Roman" w:cs="Times New Roman"/>
+          <w:sz w:val="18"/>
+          <w:szCs w:val="20"/>
+        </w:rPr>
+        <w:t>, в размере</w:t>
+      </w:r>
+      <w:r>
+        <w:rPr>
+          <w:rFonts w:ascii="Times New Roman" w:hAnsi="Times New Roman" w:cs="Times New Roman"/>
+          <w:sz w:val="20"/>
+          <w:szCs w:val="20"/>
+        </w:rPr>
+        <w:t xml:space="preserve"> </w:t>
+      </w:r>
+      <w:r>
+        <w:rPr>
+          <w:rFonts w:ascii="Times New Roman" w:hAnsi="Times New Roman" w:cs="Times New Roman"/>
+          <w:sz w:val="20"/>
+          <w:szCs w:val="20"/>
+        </w:rPr>
+        <w:t xml:space="preserve">{{ </w:t>
+      </w:r>
+      <w:proofErr w:type="spellStart"/>
+      <w:r>
+        <w:rPr>
+          <w:rFonts w:ascii="Times New Roman" w:hAnsi="Times New Roman" w:cs="Times New Roman"/>
+          <w:sz w:val="20"/>
+          <w:szCs w:val="20"/>
+          <w:lang w:val="en-US"/>
+        </w:rPr>
+        <w:t>nds</w:t>
+      </w:r>
+      <w:proofErr w:type="spellEnd"/>
+      <w:r>
+        <w:rPr>
+          <w:rFonts w:ascii="Times New Roman" w:hAnsi="Times New Roman" w:cs="Times New Roman"/>
+          <w:sz w:val="20"/>
+          <w:szCs w:val="20"/>
+        </w:rPr>
+        <w:t xml:space="preserve"> }} </w:t>
+      </w:r>
+      <w:r>
+        <w:rPr>
+          <w:rFonts w:ascii="Times New Roman" w:hAnsi="Times New Roman" w:cs="Times New Roman"/>
+          <w:sz w:val="20"/>
+          <w:szCs w:val="20"/>
+        </w:rPr>
+        <w:t>(</w:t>
+      </w:r>
+      <w:r>
+        <w:rPr>
+          <w:rFonts w:ascii="Times New Roman" w:hAnsi="Times New Roman" w:cs="Times New Roman"/>
+          <w:sz w:val="20"/>
+          <w:szCs w:val="20"/>
+        </w:rPr>
+        <w:t xml:space="preserve">{{ </w:t>
+      </w:r>
+      <w:proofErr w:type="spellStart"/>
+      <w:r>
+        <w:rPr>
+          <w:rFonts w:ascii="Times New Roman" w:hAnsi="Times New Roman" w:cs="Times New Roman"/>
+          <w:sz w:val="20"/>
+          <w:szCs w:val="20"/>
+        </w:rPr>
+        <w:t>nds_amount_words</w:t>
+      </w:r>
+      <w:proofErr w:type="spellEnd"/>
+      <w:r>
+        <w:rPr>
+          <w:rFonts w:ascii="Times New Roman" w:hAnsi="Times New Roman" w:cs="Times New Roman"/>
+          <w:sz w:val="20"/>
+          <w:szCs w:val="20"/>
+        </w:rPr>
+        <w:t xml:space="preserve"> }}</w:t>
+      </w:r>
+      <w:r>
+        <w:rPr>
+          <w:rFonts w:ascii="Times New Roman" w:hAnsi="Times New Roman" w:cs="Times New Roman"/>
+          <w:sz w:val="20"/>
+          <w:szCs w:val="20"/>
+        </w:rPr>
+        <w:t>)</w:t>
+      </w:r>
+      <w:r>
+        <w:rPr>
+          <w:rFonts w:ascii="Times New Roman" w:hAnsi="Times New Roman" w:cs="Times New Roman"/>
+          <w:sz w:val="20"/>
+          <w:szCs w:val="20"/>
+        </w:rPr>
+        <w:t xml:space="preserve"> </w:t>
+      </w:r>
+      <w:r>
+        <w:rPr>
+          <w:rFonts w:ascii="Times New Roman" w:hAnsi="Times New Roman" w:cs="Times New Roman"/>
+          <w:sz w:val="20"/>
+          <w:szCs w:val="20"/>
+        </w:rPr>
+        <w:t xml:space="preserve">{{ </w:t>
+      </w:r>
+      <w:proofErr w:type="spellStart"/>
+      <w:r>
+        <w:rPr>
+          <w:rFonts w:ascii="Times New Roman" w:hAnsi="Times New Roman" w:cs="Times New Roman"/>
+          <w:sz w:val="20"/>
+          <w:szCs w:val="20"/>
+          <w:lang w:val="en-US"/>
+        </w:rPr>
+        <w:t>nds</w:t>
+      </w:r>
+      <w:proofErr w:type="spellEnd"/>
+      <w:r>
+        <w:rPr>
+          <w:rFonts w:ascii="Times New Roman" w:hAnsi="Times New Roman" w:cs="Times New Roman"/>
+          <w:sz w:val="20"/>
+          <w:szCs w:val="20"/>
+        </w:rPr>
+        <w:t>_</w:t>
+      </w:r>
+      <w:proofErr w:type="spellStart"/>
+      <w:r>
+        <w:rPr>
+          <w:rFonts w:ascii="Times New Roman" w:hAnsi="Times New Roman" w:cs="Times New Roman"/>
+          <w:sz w:val="20"/>
+          <w:szCs w:val="20"/>
+        </w:rPr>
+        <w:t>currency_rub</w:t>
+      </w:r>
+      <w:proofErr w:type="spellEnd"/>
+      <w:r>
+        <w:rPr>
+          <w:rFonts w:ascii="Times New Roman" w:hAnsi="Times New Roman" w:cs="Times New Roman"/>
+          <w:sz w:val="20"/>
+          <w:szCs w:val="20"/>
+        </w:rPr>
+        <w:t xml:space="preserve"> }}</w:t>
+      </w:r>
+      <w:r>
+        <w:rPr>
+          <w:rFonts w:ascii="Times New Roman" w:hAnsi="Times New Roman" w:cs="Times New Roman"/>
+          <w:sz w:val="20"/>
+          <w:szCs w:val="20"/>
+        </w:rPr>
+        <w:t xml:space="preserve"> </w:t>
+      </w:r>
+      <w:r>
+        <w:rPr>
+          <w:rFonts w:ascii="Times New Roman" w:hAnsi="Times New Roman" w:cs="Times New Roman"/>
+          <w:sz w:val="20"/>
+          <w:szCs w:val="20"/>
+        </w:rPr>
+        <w:t xml:space="preserve">{{ </w:t>
+      </w:r>
+      <w:proofErr w:type="spellStart"/>
+      <w:r>
+        <w:rPr>
+          <w:rFonts w:ascii="Times New Roman" w:hAnsi="Times New Roman" w:cs="Times New Roman"/>
+          <w:sz w:val="20"/>
+          <w:szCs w:val="20"/>
+          <w:lang w:val="en-US"/>
+        </w:rPr>
+        <w:t>nds</w:t>
+      </w:r>
+      <w:proofErr w:type="spellEnd"/>
+      <w:r>
+        <w:rPr>
+          <w:rFonts w:ascii="Times New Roman" w:hAnsi="Times New Roman" w:cs="Times New Roman"/>
+          <w:sz w:val="20"/>
+          <w:szCs w:val="20"/>
+        </w:rPr>
+        <w:t>_</w:t>
+      </w:r>
+      <w:proofErr w:type="spellStart"/>
+      <w:r>
+        <w:rPr>
+          <w:rFonts w:ascii="Times New Roman" w:hAnsi="Times New Roman" w:cs="Times New Roman"/>
+          <w:sz w:val="20"/>
+          <w:szCs w:val="20"/>
+        </w:rPr>
+        <w:t>cents_number</w:t>
+      </w:r>
+      <w:proofErr w:type="spellEnd"/>
+      <w:r>
+        <w:rPr>
+          <w:rFonts w:ascii="Times New Roman" w:hAnsi="Times New Roman" w:cs="Times New Roman"/>
+          <w:sz w:val="20"/>
+          <w:szCs w:val="20"/>
+        </w:rPr>
+        <w:t xml:space="preserve"> }}</w:t>
+      </w:r>
+      <w:r>
+        <w:rPr>
+          <w:rFonts w:ascii="Times New Roman" w:hAnsi="Times New Roman" w:cs="Times New Roman"/>
+          <w:sz w:val="20"/>
+          <w:szCs w:val="20"/>
+        </w:rPr>
+        <w:t xml:space="preserve"> </w:t>
+      </w:r>
+      <w:r>
+        <w:rPr>
+          <w:rFonts w:ascii="Times New Roman" w:hAnsi="Times New Roman" w:cs="Times New Roman"/>
+          <w:sz w:val="20"/>
+          <w:szCs w:val="20"/>
+        </w:rPr>
+        <w:t xml:space="preserve">{{ </w:t>
+      </w:r>
+      <w:proofErr w:type="spellStart"/>
+      <w:r>
+        <w:rPr>
+          <w:rFonts w:ascii="Times New Roman" w:hAnsi="Times New Roman" w:cs="Times New Roman"/>
+          <w:sz w:val="20"/>
+          <w:szCs w:val="20"/>
+          <w:lang w:val="en-US"/>
+        </w:rPr>
+        <w:t>nds</w:t>
+      </w:r>
+      <w:proofErr w:type="spellEnd"/>
+      <w:r>
+        <w:rPr>
+          <w:rFonts w:ascii="Times New Roman" w:hAnsi="Times New Roman" w:cs="Times New Roman"/>
+          <w:sz w:val="20"/>
+          <w:szCs w:val="20"/>
+        </w:rPr>
+        <w:t>_</w:t>
+      </w:r>
+      <w:proofErr w:type="spellStart"/>
+      <w:r>
+        <w:rPr>
+          <w:rFonts w:ascii="Times New Roman" w:hAnsi="Times New Roman" w:cs="Times New Roman"/>
+          <w:sz w:val="20"/>
+          <w:szCs w:val="20"/>
+        </w:rPr>
+        <w:t>currency_kop</w:t>
+      </w:r>
+      <w:proofErr w:type="spellEnd"/>
+      <w:r>
+        <w:rPr>
+          <w:rFonts w:ascii="Times New Roman" w:hAnsi="Times New Roman" w:cs="Times New Roman"/>
+          <w:sz w:val="20"/>
+          <w:szCs w:val="20"/>
+        </w:rPr>
+        <w:t xml:space="preserve"> }}</w:t>
       </w:r>
       <w:r>
         <w:rPr>
@@ -873,31 +1210,244 @@
           <w:sz w:val="20"/>
           <w:szCs w:val="20"/>
         </w:rPr>
-        <w:t>845 000</w:t>
-      </w:r>
-      <w:r>
-        <w:rPr>
-          <w:rFonts w:ascii="Times New Roman" w:hAnsi="Times New Roman" w:cs="Times New Roman"/>
-          <w:sz w:val="20"/>
-          <w:szCs w:val="20"/>
-        </w:rPr>
-        <w:t>,00 (</w:t>
-      </w:r>
-      <w:r>
-        <w:rPr>
-          <w:rFonts w:ascii="Times New Roman" w:hAnsi="Times New Roman" w:cs="Times New Roman"/>
-          <w:sz w:val="20"/>
-          <w:szCs w:val="20"/>
-        </w:rPr>
-        <w:t>Восемьсот сорок пять тысяч</w:t>
-      </w:r>
-      <w:r>
-        <w:rPr>
-          <w:rFonts w:ascii="Times New Roman" w:hAnsi="Times New Roman" w:cs="Times New Roman"/>
-          <w:sz w:val="20"/>
-          <w:szCs w:val="20"/>
-        </w:rPr>
-        <w:t>)</w:t>
+        <w:t xml:space="preserve">{{ </w:t>
+      </w:r>
+      <w:proofErr w:type="spellStart"/>
+      <w:r>
+        <w:rPr>
+          <w:rFonts w:ascii="Times New Roman" w:hAnsi="Times New Roman" w:cs="Times New Roman"/>
+          <w:sz w:val="20"/>
+          <w:szCs w:val="20"/>
+        </w:rPr>
+        <w:t>total</w:t>
+      </w:r>
+      <w:proofErr w:type="spellEnd"/>
+      <w:r>
+        <w:rPr>
+          <w:rFonts w:ascii="Times New Roman" w:hAnsi="Times New Roman" w:cs="Times New Roman"/>
+          <w:sz w:val="20"/>
+          <w:szCs w:val="20"/>
+        </w:rPr>
+        <w:t xml:space="preserve"> }} ({{ </w:t>
+      </w:r>
+      <w:proofErr w:type="spellStart"/>
+      <w:r>
+        <w:rPr>
+          <w:rFonts w:ascii="Times New Roman" w:hAnsi="Times New Roman" w:cs="Times New Roman"/>
+          <w:sz w:val="20"/>
+          <w:szCs w:val="20"/>
+        </w:rPr>
+        <w:t>amount_words</w:t>
+      </w:r>
+      <w:proofErr w:type="spellEnd"/>
+      <w:r>
+        <w:rPr>
+          <w:rFonts w:ascii="Times New Roman" w:hAnsi="Times New Roman" w:cs="Times New Roman"/>
+          <w:sz w:val="20"/>
+          <w:szCs w:val="20"/>
+        </w:rPr>
+        <w:t xml:space="preserve"> }}) {{ </w:t>
+      </w:r>
+      <w:proofErr w:type="spellStart"/>
+      <w:r>
+        <w:rPr>
+          <w:rFonts w:ascii="Times New Roman" w:hAnsi="Times New Roman" w:cs="Times New Roman"/>
+          <w:sz w:val="20"/>
+          <w:szCs w:val="20"/>
+        </w:rPr>
+        <w:t>currency_rub</w:t>
+      </w:r>
+      <w:proofErr w:type="spellEnd"/>
+      <w:r>
+        <w:rPr>
+          <w:rFonts w:ascii="Times New Roman" w:hAnsi="Times New Roman" w:cs="Times New Roman"/>
+          <w:sz w:val="20"/>
+          <w:szCs w:val="20"/>
+        </w:rPr>
+        <w:t xml:space="preserve"> }} {{ </w:t>
+      </w:r>
+      <w:proofErr w:type="spellStart"/>
+      <w:r>
+        <w:rPr>
+          <w:rFonts w:ascii="Times New Roman" w:hAnsi="Times New Roman" w:cs="Times New Roman"/>
+          <w:sz w:val="20"/>
+          <w:szCs w:val="20"/>
+        </w:rPr>
+        <w:t>cents_number</w:t>
+      </w:r>
+      <w:proofErr w:type="spellEnd"/>
+      <w:r>
+        <w:rPr>
+          <w:rFonts w:ascii="Times New Roman" w:hAnsi="Times New Roman" w:cs="Times New Roman"/>
+          <w:sz w:val="20"/>
+          <w:szCs w:val="20"/>
+        </w:rPr>
+        <w:t xml:space="preserve"> }} {{ </w:t>
+      </w:r>
+      <w:proofErr w:type="spellStart"/>
+      <w:r>
+        <w:rPr>
+          <w:rFonts w:ascii="Times New Roman" w:hAnsi="Times New Roman" w:cs="Times New Roman"/>
+          <w:sz w:val="20"/>
+          <w:szCs w:val="20"/>
+        </w:rPr>
+        <w:t>currency_kop</w:t>
+      </w:r>
+      <w:proofErr w:type="spellEnd"/>
+      <w:r>
+        <w:rPr>
+          <w:rFonts w:ascii="Times New Roman" w:hAnsi="Times New Roman" w:cs="Times New Roman"/>
+          <w:sz w:val="20"/>
+          <w:szCs w:val="20"/>
+        </w:rPr>
+        <w:t xml:space="preserve"> }}, в соответствии с Приложением №1 к настоящему договору, включая НДС </w:t>
+      </w:r>
+      <w:r>
+        <w:rPr>
+          <w:rFonts w:ascii="Times New Roman" w:hAnsi="Times New Roman" w:cs="Times New Roman"/>
+          <w:sz w:val="20"/>
+          <w:szCs w:val="20"/>
+          <w:highlight w:val="yellow"/>
+        </w:rPr>
+        <w:t>5%</w:t>
+      </w:r>
+      <w:r>
+        <w:rPr>
+          <w:rFonts w:ascii="Times New Roman" w:hAnsi="Times New Roman" w:cs="Times New Roman"/>
+          <w:sz w:val="20"/>
+          <w:szCs w:val="20"/>
+        </w:rPr>
+        <w:t>,</w:t>
+      </w:r>
+      <w:r>
+        <w:rPr>
+          <w:rFonts w:ascii="Times New Roman" w:hAnsi="Times New Roman" w:cs="Times New Roman"/>
+          <w:sz w:val="18"/>
+          <w:szCs w:val="20"/>
+        </w:rPr>
+        <w:t xml:space="preserve"> в размере</w:t>
+      </w:r>
+      <w:r>
+        <w:rPr>
+          <w:rFonts w:ascii="Times New Roman" w:hAnsi="Times New Roman" w:cs="Times New Roman"/>
+          <w:sz w:val="20"/>
+          <w:szCs w:val="20"/>
+        </w:rPr>
+        <w:t xml:space="preserve"> {{ </w:t>
+      </w:r>
+      <w:proofErr w:type="spellStart"/>
+      <w:r>
+        <w:rPr>
+          <w:rFonts w:ascii="Times New Roman" w:hAnsi="Times New Roman" w:cs="Times New Roman"/>
+          <w:sz w:val="20"/>
+          <w:szCs w:val="20"/>
+        </w:rPr>
+        <w:t>nds</w:t>
+      </w:r>
+      <w:proofErr w:type="spellEnd"/>
+      <w:r>
+        <w:rPr>
+          <w:rFonts w:ascii="Times New Roman" w:hAnsi="Times New Roman" w:cs="Times New Roman"/>
+          <w:sz w:val="20"/>
+          <w:szCs w:val="20"/>
+        </w:rPr>
+        <w:t xml:space="preserve"> }} ({{ </w:t>
+      </w:r>
+      <w:proofErr w:type="spellStart"/>
+      <w:r>
+        <w:rPr>
+          <w:rFonts w:ascii="Times New Roman" w:hAnsi="Times New Roman" w:cs="Times New Roman"/>
+          <w:sz w:val="20"/>
+          <w:szCs w:val="20"/>
+        </w:rPr>
+        <w:t>nds_amount_words</w:t>
+      </w:r>
+      <w:proofErr w:type="spellEnd"/>
+      <w:r>
+        <w:rPr>
+          <w:rFonts w:ascii="Times New Roman" w:hAnsi="Times New Roman" w:cs="Times New Roman"/>
+          <w:sz w:val="20"/>
+          <w:szCs w:val="20"/>
+        </w:rPr>
+        <w:t xml:space="preserve"> }}) {{ </w:t>
+      </w:r>
+      <w:proofErr w:type="spellStart"/>
+      <w:r>
+        <w:rPr>
+          <w:rFonts w:ascii="Times New Roman" w:hAnsi="Times New Roman" w:cs="Times New Roman"/>
+          <w:sz w:val="20"/>
+          <w:szCs w:val="20"/>
+        </w:rPr>
+        <w:t>nds_currency_rub</w:t>
+      </w:r>
+      <w:proofErr w:type="spellEnd"/>
+      <w:r>
+        <w:rPr>
+          <w:rFonts w:ascii="Times New Roman" w:hAnsi="Times New Roman" w:cs="Times New Roman"/>
+          <w:sz w:val="20"/>
+          <w:szCs w:val="20"/>
+        </w:rPr>
+        <w:t xml:space="preserve"> }} {{ </w:t>
+      </w:r>
+      <w:proofErr w:type="spellStart"/>
+      <w:r>
+        <w:rPr>
+          <w:rFonts w:ascii="Times New Roman" w:hAnsi="Times New Roman" w:cs="Times New Roman"/>
+          <w:sz w:val="20"/>
+          <w:szCs w:val="20"/>
+        </w:rPr>
+        <w:t>nds_cents_number</w:t>
+      </w:r>
+      <w:proofErr w:type="spellEnd"/>
+      <w:r>
+        <w:rPr>
+          <w:rFonts w:ascii="Times New Roman" w:hAnsi="Times New Roman" w:cs="Times New Roman"/>
+          <w:sz w:val="20"/>
+          <w:szCs w:val="20"/>
+        </w:rPr>
+        <w:t xml:space="preserve"> }} {{ </w:t>
+      </w:r>
+      <w:proofErr w:type="spellStart"/>
+      <w:r>
+        <w:rPr>
+          <w:rFonts w:ascii="Times New Roman" w:hAnsi="Times New Roman" w:cs="Times New Roman"/>
+          <w:sz w:val="20"/>
+          <w:szCs w:val="20"/>
+        </w:rPr>
+        <w:t>nds_currency_kop</w:t>
+      </w:r>
+      <w:proofErr w:type="spellEnd"/>
+      <w:r>
+        <w:rPr>
+          <w:rFonts w:ascii="Times New Roman" w:hAnsi="Times New Roman" w:cs="Times New Roman"/>
+          <w:sz w:val="20"/>
+          <w:szCs w:val="20"/>
+        </w:rPr>
+        <w:t xml:space="preserve"> }}</w:t>
+      </w:r>
+      <w:r>
+        <w:rPr>
+          <w:rFonts w:ascii="Times New Roman" w:hAnsi="Times New Roman" w:cs="Times New Roman"/>
+          <w:sz w:val="20"/>
+          <w:szCs w:val="20"/>
+        </w:rPr>
+        <w:t xml:space="preserve">, </w:t>
+      </w:r>
+      <w:r>
+        <w:rPr>
+          <w:rFonts w:ascii="Times New Roman" w:hAnsi="Times New Roman" w:cs="Times New Roman"/>
+          <w:sz w:val="20"/>
+          <w:szCs w:val="20"/>
+        </w:rPr>
+        <w:t xml:space="preserve">в течении </w:t>
+      </w:r>
+      <w:r>
+        <w:rPr>
+          <w:rFonts w:ascii="Times New Roman" w:hAnsi="Times New Roman" w:cs="Times New Roman"/>
+          <w:sz w:val="20"/>
+          <w:szCs w:val="20"/>
+        </w:rPr>
+        <w:t>3</w:t>
       </w:r>
       <w:r>
         <w:rPr>
@@ -913,61 +1463,6 @@
           <w:sz w:val="20"/>
           <w:szCs w:val="20"/>
         </w:rPr>
-        <w:t>Рублей 00</w:t>
-      </w:r>
-      <w:r>
-        <w:rPr>
-          <w:sz w:val="20"/>
-          <w:szCs w:val="20"/>
-        </w:rPr>
-        <w:t xml:space="preserve"> </w:t>
-      </w:r>
-      <w:r>
-        <w:rPr>
-          <w:rFonts w:ascii="Times New Roman" w:hAnsi="Times New Roman" w:cs="Times New Roman"/>
-          <w:sz w:val="20"/>
-          <w:szCs w:val="20"/>
-        </w:rPr>
-        <w:t>копеек</w:t>
-      </w:r>
-      <w:r>
-        <w:rPr>
-          <w:rFonts w:ascii="Times New Roman" w:hAnsi="Times New Roman" w:cs="Times New Roman"/>
-          <w:sz w:val="20"/>
-          <w:szCs w:val="20"/>
-        </w:rPr>
-        <w:t xml:space="preserve">, </w:t>
-      </w:r>
-      <w:r>
-        <w:rPr>
-          <w:rFonts w:ascii="Times New Roman" w:hAnsi="Times New Roman" w:cs="Times New Roman"/>
-          <w:sz w:val="20"/>
-          <w:szCs w:val="20"/>
-        </w:rPr>
-        <w:t xml:space="preserve">в течении </w:t>
-      </w:r>
-      <w:r>
-        <w:rPr>
-          <w:rFonts w:ascii="Times New Roman" w:hAnsi="Times New Roman" w:cs="Times New Roman"/>
-          <w:sz w:val="20"/>
-          <w:szCs w:val="20"/>
-        </w:rPr>
-        <w:t>7</w:t>
-      </w:r>
-      <w:r>
-        <w:rPr>
-          <w:rFonts w:ascii="Times New Roman" w:hAnsi="Times New Roman" w:cs="Times New Roman"/>
-          <w:sz w:val="20"/>
-          <w:szCs w:val="20"/>
-        </w:rPr>
-        <w:t xml:space="preserve"> </w:t>
-      </w:r>
-      <w:r>
-        <w:rPr>
-          <w:rFonts w:ascii="Times New Roman" w:hAnsi="Times New Roman" w:cs="Times New Roman"/>
-          <w:sz w:val="20"/>
-          <w:szCs w:val="20"/>
-        </w:rPr>
         <w:t>(</w:t>
       </w:r>
       <w:r>
@@ -976,7 +1471,7 @@
           <w:sz w:val="20"/>
           <w:szCs w:val="20"/>
         </w:rPr>
-        <w:t>семи</w:t>
+        <w:t>трёх</w:t>
       </w:r>
       <w:r>
         <w:rPr>
@@ -1091,6 +1586,7 @@
           <w:rFonts w:ascii="Times New Roman" w:hAnsi="Times New Roman" w:cs="Times New Roman"/>
           <w:sz w:val="20"/>
           <w:szCs w:val="20"/>
+          <w:highlight w:val="yellow"/>
         </w:rPr>
         <w:t>60</w:t>
       </w:r>
@@ -1099,6 +1595,7 @@
           <w:rFonts w:ascii="Times New Roman" w:hAnsi="Times New Roman" w:cs="Times New Roman"/>
           <w:sz w:val="20"/>
           <w:szCs w:val="20"/>
+          <w:highlight w:val="yellow"/>
         </w:rPr>
         <w:t xml:space="preserve"> (</w:t>
       </w:r>
@@ -1107,6 +1604,7 @@
           <w:rFonts w:ascii="Times New Roman" w:hAnsi="Times New Roman" w:cs="Times New Roman"/>
           <w:sz w:val="20"/>
           <w:szCs w:val="20"/>
+          <w:highlight w:val="yellow"/>
         </w:rPr>
         <w:t>шестьдесят</w:t>
       </w:r>
@@ -1115,8 +1613,17 @@
           <w:rFonts w:ascii="Times New Roman" w:hAnsi="Times New Roman" w:cs="Times New Roman"/>
           <w:sz w:val="20"/>
           <w:szCs w:val="20"/>
-        </w:rPr>
-        <w:t xml:space="preserve">) </w:t>
+          <w:highlight w:val="yellow"/>
+        </w:rPr>
+        <w:t>)</w:t>
+      </w:r>
+      <w:r>
+        <w:rPr>
+          <w:rFonts w:ascii="Times New Roman" w:hAnsi="Times New Roman" w:cs="Times New Roman"/>
+          <w:sz w:val="20"/>
+          <w:szCs w:val="20"/>
+        </w:rPr>
+        <w:t xml:space="preserve"> </w:t>
       </w:r>
       <w:r>
         <w:rPr>
@@ -1530,6 +2037,7 @@
           <w:sz w:val="20"/>
           <w:szCs w:val="20"/>
         </w:rPr>
+        <w:lastRenderedPageBreak/>
         <w:t xml:space="preserve">6.1. Приемка Оборудования осуществляется Покупателем или уполномоченным лицом Покупателя на складе Поставщика. При этом уполномоченное лицо Покупателя обязано передать Поставщику доверенность на право получения Оборудования и предъявить паспорт.     </w:t>
       </w:r>
     </w:p>
@@ -1549,7 +2057,6 @@
           <w:sz w:val="20"/>
           <w:szCs w:val="20"/>
         </w:rPr>
-        <w:lastRenderedPageBreak/>
         <w:t xml:space="preserve">6.2. Приемка Оборудования производится Покупателем в присутствии представителя Поставщика путем </w:t>
       </w:r>
       <w:proofErr w:type="spellStart"/>
@@ -2217,7 +2724,11 @@
       </w:r>
       <w:proofErr w:type="gramStart"/>
       <w:r>
-        <w:t>иного вмешательства</w:t>
+        <w:t xml:space="preserve">иного </w:t>
+      </w:r>
+      <w:r>
+        <w:lastRenderedPageBreak/>
+        <w:t>вмешательства</w:t>
       </w:r>
       <w:proofErr w:type="gramEnd"/>
       <w:r>
@@ -2229,7 +2740,6 @@
         <w:jc w:val="both"/>
       </w:pPr>
       <w:r>
-        <w:lastRenderedPageBreak/>
         <w:t xml:space="preserve">7.10. Ремонт Оборудования (иное устранение недостатков) в не гарантийных случаях может осуществляться специалистами Сервисного центра Поставщика на основании отдельного письменного соглашения Сторон за счет Покупателя. </w:t>
       </w:r>
     </w:p>
@@ -3298,44 +3808,141 @@
               <w:pStyle w:val="af6"/>
               <w:spacing w:before="0" w:beforeAutospacing="0" w:after="0" w:afterAutospacing="0"/>
               <w:rPr>
+                <w:rFonts w:eastAsia="Times New Roman"/>
+                <w:color w:val="000000"/>
+                <w:sz w:val="20"/>
+                <w:szCs w:val="20"/>
+                <w:lang w:val="en-US" w:eastAsia="ar-SA"/>
+              </w:rPr>
+            </w:pPr>
+            <w:r>
+              <w:rPr>
+                <w:color w:val="000000"/>
+                <w:sz w:val="20"/>
+                <w:szCs w:val="20"/>
+              </w:rPr>
+              <w:t>Код</w:t>
+            </w:r>
+            <w:r>
+              <w:rPr>
+                <w:color w:val="000000"/>
                 <w:sz w:val="20"/>
                 <w:szCs w:val="20"/>
                 <w:lang w:val="en-US"/>
               </w:rPr>
+              <w:t xml:space="preserve"> </w:t>
+            </w:r>
+            <w:r>
+              <w:rPr>
+                <w:color w:val="000000"/>
+                <w:sz w:val="20"/>
+                <w:szCs w:val="20"/>
+              </w:rPr>
+              <w:t>подразделения</w:t>
+            </w:r>
+            <w:r>
+              <w:rPr>
+                <w:color w:val="000000"/>
+                <w:sz w:val="20"/>
+                <w:szCs w:val="20"/>
+                <w:lang w:val="en-US"/>
+              </w:rPr>
+              <w:t xml:space="preserve">: </w:t>
+            </w:r>
+            <w:proofErr w:type="gramStart"/>
+            <w:r>
+              <w:rPr>
+                <w:rFonts w:eastAsia="Times New Roman"/>
+                <w:color w:val="000000"/>
+                <w:sz w:val="20"/>
+                <w:szCs w:val="20"/>
+                <w:lang w:val="en-US" w:eastAsia="ar-SA"/>
+              </w:rPr>
+              <w:t xml:space="preserve">{{ </w:t>
+            </w:r>
+            <w:proofErr w:type="spellStart"/>
+            <w:r>
+              <w:rPr>
+                <w:rFonts w:eastAsia="Times New Roman"/>
+                <w:color w:val="000000"/>
+                <w:sz w:val="20"/>
+                <w:szCs w:val="20"/>
+                <w:lang w:val="en-US" w:eastAsia="ar-SA"/>
+              </w:rPr>
+              <w:t>passport</w:t>
+            </w:r>
+            <w:proofErr w:type="gramEnd"/>
+            <w:r>
+              <w:rPr>
+                <w:rFonts w:eastAsia="Times New Roman"/>
+                <w:color w:val="000000"/>
+                <w:sz w:val="20"/>
+                <w:szCs w:val="20"/>
+                <w:lang w:val="en-US" w:eastAsia="ar-SA"/>
+              </w:rPr>
+              <w:t>_code</w:t>
+            </w:r>
+            <w:proofErr w:type="spellEnd"/>
+            <w:r>
+              <w:rPr>
+                <w:rFonts w:eastAsia="Times New Roman"/>
+                <w:color w:val="000000"/>
+                <w:sz w:val="20"/>
+                <w:szCs w:val="20"/>
+                <w:lang w:val="en-US" w:eastAsia="ar-SA"/>
+              </w:rPr>
+              <w:t xml:space="preserve"> }}</w:t>
+            </w:r>
+          </w:p>
+          <w:p>
+            <w:pPr>
+              <w:pStyle w:val="af6"/>
+              <w:spacing w:before="0" w:beforeAutospacing="0" w:after="0" w:afterAutospacing="0"/>
+              <w:rPr>
+                <w:sz w:val="20"/>
+                <w:szCs w:val="20"/>
+                <w:lang w:val="en-US"/>
+              </w:rPr>
             </w:pPr>
             <w:r>
               <w:rPr>
-                <w:color w:val="000000"/>
-                <w:sz w:val="20"/>
-                <w:szCs w:val="20"/>
-              </w:rPr>
-              <w:t>Код</w:t>
-            </w:r>
-            <w:r>
-              <w:rPr>
-                <w:color w:val="000000"/>
-                <w:sz w:val="20"/>
-                <w:szCs w:val="20"/>
-                <w:lang w:val="en-US"/>
+                <w:rFonts w:eastAsia="Times New Roman"/>
+                <w:color w:val="000000"/>
+                <w:sz w:val="20"/>
+                <w:szCs w:val="20"/>
+                <w:lang w:eastAsia="ar-SA"/>
+              </w:rPr>
+              <w:t>Дата</w:t>
+            </w:r>
+            <w:r>
+              <w:rPr>
+                <w:rFonts w:eastAsia="Times New Roman"/>
+                <w:color w:val="000000"/>
+                <w:sz w:val="20"/>
+                <w:szCs w:val="20"/>
+                <w:lang w:val="en-US" w:eastAsia="ar-SA"/>
               </w:rPr>
               <w:t xml:space="preserve"> </w:t>
             </w:r>
             <w:r>
               <w:rPr>
-                <w:color w:val="000000"/>
-                <w:sz w:val="20"/>
-                <w:szCs w:val="20"/>
-              </w:rPr>
-              <w:t>подразделения</w:t>
-            </w:r>
-            <w:r>
-              <w:rPr>
-                <w:color w:val="000000"/>
-                <w:sz w:val="20"/>
-                <w:szCs w:val="20"/>
-                <w:lang w:val="en-US"/>
-              </w:rPr>
-              <w:t xml:space="preserve">: </w:t>
+                <w:rFonts w:eastAsia="Times New Roman"/>
+                <w:color w:val="000000"/>
+                <w:sz w:val="20"/>
+                <w:szCs w:val="20"/>
+                <w:lang w:eastAsia="ar-SA"/>
+              </w:rPr>
+              <w:t>рождения</w:t>
+            </w:r>
+            <w:r>
+              <w:rPr>
+                <w:rFonts w:eastAsia="Times New Roman"/>
+                <w:color w:val="000000"/>
+                <w:sz w:val="20"/>
+                <w:szCs w:val="20"/>
+                <w:lang w:val="en-US" w:eastAsia="ar-SA"/>
+              </w:rPr>
+              <w:t xml:space="preserve"> </w:t>
             </w:r>
             <w:proofErr w:type="gramStart"/>
             <w:r>
@@ -3357,7 +3964,7 @@
                 <w:szCs w:val="20"/>
                 <w:lang w:val="en-US" w:eastAsia="ar-SA"/>
               </w:rPr>
-              <w:t>passport</w:t>
+              <w:t>birth</w:t>
             </w:r>
             <w:proofErr w:type="gramEnd"/>
             <w:r>
@@ -3368,7 +3975,7 @@
                 <w:szCs w:val="20"/>
                 <w:lang w:val="en-US" w:eastAsia="ar-SA"/>
               </w:rPr>
-              <w:t>_code</w:t>
+              <w:t>_date</w:t>
             </w:r>
             <w:proofErr w:type="spellEnd"/>
             <w:r>
@@ -3535,14 +4142,6 @@
     </w:p>
     <w:p>
       <w:pPr>
-        <w:pStyle w:val="Iauiue1"/>
-        <w:rPr>
-          <w:i/>
-        </w:rPr>
-      </w:pPr>
-    </w:p>
-    <w:p>
-      <w:pPr>
         <w:pStyle w:val="ae"/>
         <w:rPr>
           <w:i/>
@@ -3595,38 +4194,27 @@
         <w:rPr>
           <w:b/>
         </w:rPr>
-        <w:t>05</w:t>
+        <w:t>{</w:t>
       </w:r>
       <w:proofErr w:type="gramEnd"/>
       <w:r>
         <w:rPr>
           <w:b/>
         </w:rPr>
-        <w:t>/</w:t>
-      </w:r>
-      <w:r>
-        <w:rPr>
-          <w:b/>
-        </w:rPr>
-        <w:t>02</w:t>
-      </w:r>
-      <w:r>
-        <w:rPr>
-          <w:b/>
-        </w:rPr>
-        <w:t>/202</w:t>
-      </w:r>
-      <w:r>
-        <w:rPr>
-          <w:b/>
-        </w:rPr>
-        <w:t>5</w:t>
-      </w:r>
-      <w:r>
-        <w:rPr>
-          <w:b/>
-        </w:rPr>
-        <w:t>/М</w:t>
+        <w:t xml:space="preserve">{ </w:t>
+      </w:r>
+      <w:r>
+        <w:rPr>
+          <w:b/>
+          <w:lang w:val="en-US"/>
+        </w:rPr>
+        <w:t>number</w:t>
+      </w:r>
+      <w:r>
+        <w:rPr>
+          <w:b/>
+        </w:rPr>
+        <w:t xml:space="preserve"> }}</w:t>
       </w:r>
       <w:r>
         <w:rPr>
@@ -3636,33 +4224,28 @@
       </w:r>
       <w:r>
         <w:rPr>
-          <w:b/>
-        </w:rPr>
-        <w:t xml:space="preserve"> </w:t>
-      </w:r>
-      <w:r>
-        <w:rPr>
           <w:i/>
         </w:rPr>
-        <w:t>от  «</w:t>
+        <w:t xml:space="preserve">от  </w:t>
       </w:r>
       <w:r>
         <w:rPr>
           <w:i/>
         </w:rPr>
-        <w:t>05</w:t>
+        <w:t xml:space="preserve">{{ </w:t>
       </w:r>
       <w:r>
         <w:rPr>
           <w:i/>
-        </w:rPr>
-        <w:t>» февраля 2025</w:t>
+          <w:lang w:val="en-US"/>
+        </w:rPr>
+        <w:t>date</w:t>
       </w:r>
       <w:r>
         <w:rPr>
           <w:i/>
         </w:rPr>
-        <w:t xml:space="preserve"> года</w:t>
+        <w:t xml:space="preserve"> }}</w:t>
       </w:r>
     </w:p>
     <w:p>
@@ -4241,17 +4824,26 @@
             </w:pPr>
             <w:proofErr w:type="gramStart"/>
             <w:r>
-              <w:t>{{ p.</w:t>
+              <w:t>{{ p</w:t>
             </w:r>
             <w:proofErr w:type="gramEnd"/>
             <w:r>
+              <w:t>.</w:t>
+            </w:r>
+            <w:r>
+              <w:rPr>
+                <w:lang w:val="en-US"/>
+              </w:rPr>
+              <w:t>a</w:t>
+            </w:r>
+            <w:proofErr w:type="spellStart"/>
+            <w:r>
+              <w:t>mount</w:t>
+            </w:r>
+            <w:proofErr w:type="spellEnd"/>
+            <w:r>
               <w:t xml:space="preserve"> </w:t>
             </w:r>
-            <w:proofErr w:type="spellStart"/>
-            <w:r>
-              <w:t>amount</w:t>
-            </w:r>
-            <w:proofErr w:type="spellEnd"/>
             <w:r>
               <w:t>}}</w:t>
             </w:r>
@@ -4360,64 +4952,176 @@
           <w:rFonts w:ascii="Times New Roman" w:hAnsi="Times New Roman" w:cs="Times New Roman"/>
           <w:sz w:val="20"/>
           <w:szCs w:val="20"/>
-        </w:rPr>
-      </w:pPr>
-      <w:r>
-        <w:rPr>
-          <w:rFonts w:ascii="Times New Roman" w:hAnsi="Times New Roman" w:cs="Times New Roman"/>
-          <w:sz w:val="20"/>
-          <w:szCs w:val="20"/>
-        </w:rPr>
-        <w:t xml:space="preserve">Стоимость оборудования составляет </w:t>
+          <w:lang w:val="en-US"/>
+        </w:rPr>
+      </w:pPr>
+      <w:r>
+        <w:rPr>
+          <w:rFonts w:ascii="Times New Roman" w:hAnsi="Times New Roman" w:cs="Times New Roman"/>
+          <w:sz w:val="20"/>
+          <w:szCs w:val="20"/>
+        </w:rPr>
+        <w:t>Стоимость</w:t>
+      </w:r>
+      <w:r>
+        <w:rPr>
+          <w:rFonts w:ascii="Times New Roman" w:hAnsi="Times New Roman" w:cs="Times New Roman"/>
+          <w:sz w:val="20"/>
+          <w:szCs w:val="20"/>
+          <w:lang w:val="en-US"/>
+        </w:rPr>
+        <w:t xml:space="preserve"> </w:t>
+      </w:r>
+      <w:r>
+        <w:rPr>
+          <w:rFonts w:ascii="Times New Roman" w:hAnsi="Times New Roman" w:cs="Times New Roman"/>
+          <w:sz w:val="20"/>
+          <w:szCs w:val="20"/>
+        </w:rPr>
+        <w:t>оборудования</w:t>
+      </w:r>
+      <w:r>
+        <w:rPr>
+          <w:rFonts w:ascii="Times New Roman" w:hAnsi="Times New Roman" w:cs="Times New Roman"/>
+          <w:sz w:val="20"/>
+          <w:szCs w:val="20"/>
+          <w:lang w:val="en-US"/>
+        </w:rPr>
+        <w:t xml:space="preserve"> </w:t>
+      </w:r>
+      <w:r>
+        <w:rPr>
+          <w:rFonts w:ascii="Times New Roman" w:hAnsi="Times New Roman" w:cs="Times New Roman"/>
+          <w:sz w:val="20"/>
+          <w:szCs w:val="20"/>
+        </w:rPr>
+        <w:t>составляет</w:t>
+      </w:r>
+      <w:r>
+        <w:rPr>
+          <w:rFonts w:ascii="Times New Roman" w:hAnsi="Times New Roman" w:cs="Times New Roman"/>
+          <w:sz w:val="20"/>
+          <w:szCs w:val="20"/>
+          <w:lang w:val="en-US"/>
+        </w:rPr>
+        <w:t xml:space="preserve"> </w:t>
       </w:r>
       <w:bookmarkStart w:id="14" w:name="OLE_LINK21"/>
       <w:bookmarkStart w:id="15" w:name="OLE_LINK22"/>
-      <w:r>
-        <w:rPr>
-          <w:rFonts w:ascii="Times New Roman" w:hAnsi="Times New Roman" w:cs="Times New Roman"/>
-          <w:sz w:val="20"/>
-          <w:szCs w:val="20"/>
-        </w:rPr>
-        <w:t>845 000</w:t>
-      </w:r>
-      <w:r>
-        <w:rPr>
-          <w:rFonts w:ascii="Times New Roman" w:hAnsi="Times New Roman" w:cs="Times New Roman"/>
-          <w:sz w:val="20"/>
-          <w:szCs w:val="20"/>
-        </w:rPr>
-        <w:t>,00 (</w:t>
-      </w:r>
-      <w:r>
-        <w:rPr>
-          <w:rFonts w:ascii="Times New Roman" w:hAnsi="Times New Roman" w:cs="Times New Roman"/>
-          <w:sz w:val="20"/>
-          <w:szCs w:val="20"/>
-        </w:rPr>
-        <w:t xml:space="preserve">Восемьсот сорок пять </w:t>
-      </w:r>
       <w:proofErr w:type="gramStart"/>
       <w:r>
         <w:rPr>
           <w:rFonts w:ascii="Times New Roman" w:hAnsi="Times New Roman" w:cs="Times New Roman"/>
           <w:sz w:val="20"/>
           <w:szCs w:val="20"/>
-        </w:rPr>
-        <w:t>тысяч</w:t>
-      </w:r>
-      <w:r>
-        <w:rPr>
-          <w:rFonts w:ascii="Times New Roman" w:hAnsi="Times New Roman" w:cs="Times New Roman"/>
-          <w:sz w:val="20"/>
-          <w:szCs w:val="20"/>
-        </w:rPr>
-        <w:t xml:space="preserve">) </w:t>
-      </w:r>
-      <w:r>
-        <w:rPr>
-          <w:rFonts w:ascii="Times New Roman" w:hAnsi="Times New Roman" w:cs="Times New Roman"/>
-          <w:sz w:val="20"/>
-          <w:szCs w:val="20"/>
+          <w:lang w:val="en-US"/>
+        </w:rPr>
+        <w:t>{{ total</w:t>
+      </w:r>
+      <w:proofErr w:type="gramEnd"/>
+      <w:r>
+        <w:rPr>
+          <w:rFonts w:ascii="Times New Roman" w:hAnsi="Times New Roman" w:cs="Times New Roman"/>
+          <w:sz w:val="20"/>
+          <w:szCs w:val="20"/>
+          <w:lang w:val="en-US"/>
+        </w:rPr>
+        <w:t xml:space="preserve"> }} ({{ </w:t>
+      </w:r>
+      <w:proofErr w:type="spellStart"/>
+      <w:r>
+        <w:rPr>
+          <w:rFonts w:ascii="Times New Roman" w:hAnsi="Times New Roman" w:cs="Times New Roman"/>
+          <w:sz w:val="20"/>
+          <w:szCs w:val="20"/>
+          <w:lang w:val="en-US"/>
+        </w:rPr>
+        <w:t>amount_words</w:t>
+      </w:r>
+      <w:proofErr w:type="spellEnd"/>
+      <w:r>
+        <w:rPr>
+          <w:rFonts w:ascii="Times New Roman" w:hAnsi="Times New Roman" w:cs="Times New Roman"/>
+          <w:sz w:val="20"/>
+          <w:szCs w:val="20"/>
+          <w:lang w:val="en-US"/>
+        </w:rPr>
+        <w:t xml:space="preserve"> }}) {{ </w:t>
+      </w:r>
+      <w:proofErr w:type="spellStart"/>
+      <w:r>
+        <w:rPr>
+          <w:rFonts w:ascii="Times New Roman" w:hAnsi="Times New Roman" w:cs="Times New Roman"/>
+          <w:sz w:val="20"/>
+          <w:szCs w:val="20"/>
+          <w:lang w:val="en-US"/>
+        </w:rPr>
+        <w:t>currency_rub</w:t>
+      </w:r>
+      <w:proofErr w:type="spellEnd"/>
+      <w:r>
+        <w:rPr>
+          <w:rFonts w:ascii="Times New Roman" w:hAnsi="Times New Roman" w:cs="Times New Roman"/>
+          <w:sz w:val="20"/>
+          <w:szCs w:val="20"/>
+          <w:lang w:val="en-US"/>
+        </w:rPr>
+        <w:t xml:space="preserve"> }} {{ </w:t>
+      </w:r>
+      <w:proofErr w:type="spellStart"/>
+      <w:r>
+        <w:rPr>
+          <w:rFonts w:ascii="Times New Roman" w:hAnsi="Times New Roman" w:cs="Times New Roman"/>
+          <w:sz w:val="20"/>
+          <w:szCs w:val="20"/>
+          <w:lang w:val="en-US"/>
+        </w:rPr>
+        <w:t>cents_number</w:t>
+      </w:r>
+      <w:proofErr w:type="spellEnd"/>
+      <w:r>
+        <w:rPr>
+          <w:rFonts w:ascii="Times New Roman" w:hAnsi="Times New Roman" w:cs="Times New Roman"/>
+          <w:sz w:val="20"/>
+          <w:szCs w:val="20"/>
+          <w:lang w:val="en-US"/>
+        </w:rPr>
+        <w:t xml:space="preserve"> }} {{ </w:t>
+      </w:r>
+      <w:proofErr w:type="spellStart"/>
+      <w:r>
+        <w:rPr>
+          <w:rFonts w:ascii="Times New Roman" w:hAnsi="Times New Roman" w:cs="Times New Roman"/>
+          <w:sz w:val="20"/>
+          <w:szCs w:val="20"/>
+          <w:lang w:val="en-US"/>
+        </w:rPr>
+        <w:t>currency_kop</w:t>
+      </w:r>
+      <w:proofErr w:type="spellEnd"/>
+      <w:r>
+        <w:rPr>
+          <w:rFonts w:ascii="Times New Roman" w:hAnsi="Times New Roman" w:cs="Times New Roman"/>
+          <w:sz w:val="20"/>
+          <w:szCs w:val="20"/>
+          <w:lang w:val="en-US"/>
+        </w:rPr>
+        <w:t xml:space="preserve"> }}, </w:t>
+      </w:r>
+      <w:r>
+        <w:rPr>
+          <w:rFonts w:ascii="Times New Roman" w:hAnsi="Times New Roman" w:cs="Times New Roman"/>
+          <w:sz w:val="20"/>
+          <w:szCs w:val="20"/>
+        </w:rPr>
+        <w:t>включая</w:t>
+      </w:r>
+      <w:r>
+        <w:rPr>
+          <w:rFonts w:ascii="Times New Roman" w:hAnsi="Times New Roman" w:cs="Times New Roman"/>
+          <w:sz w:val="20"/>
+          <w:szCs w:val="20"/>
+          <w:lang w:val="en-US"/>
         </w:rPr>
         <w:t xml:space="preserve"> </w:t>
       </w:r>
@@ -4427,48 +5131,162 @@
           <w:sz w:val="20"/>
           <w:szCs w:val="20"/>
         </w:rPr>
-        <w:t>р</w:t>
-      </w:r>
-      <w:r>
-        <w:rPr>
-          <w:rFonts w:ascii="Times New Roman" w:hAnsi="Times New Roman" w:cs="Times New Roman"/>
-          <w:sz w:val="20"/>
-          <w:szCs w:val="20"/>
-        </w:rPr>
-        <w:t>ублей</w:t>
-      </w:r>
-      <w:proofErr w:type="gramEnd"/>
-      <w:r>
-        <w:rPr>
-          <w:rFonts w:ascii="Times New Roman" w:hAnsi="Times New Roman" w:cs="Times New Roman"/>
-          <w:sz w:val="20"/>
-          <w:szCs w:val="20"/>
-        </w:rPr>
-        <w:t xml:space="preserve"> 00 копеек</w:t>
-      </w:r>
-      <w:r>
-        <w:rPr>
-          <w:rFonts w:ascii="Times New Roman" w:hAnsi="Times New Roman" w:cs="Times New Roman"/>
-          <w:sz w:val="20"/>
-          <w:szCs w:val="20"/>
-        </w:rPr>
-        <w:t xml:space="preserve">, </w:t>
-      </w:r>
-      <w:r>
-        <w:rPr>
-          <w:rFonts w:ascii="Times New Roman" w:hAnsi="Times New Roman" w:cs="Times New Roman"/>
-          <w:sz w:val="20"/>
-          <w:szCs w:val="20"/>
-        </w:rPr>
-        <w:t>включая</w:t>
-      </w:r>
-      <w:r>
-        <w:rPr>
-          <w:rFonts w:ascii="Times New Roman" w:hAnsi="Times New Roman" w:cs="Times New Roman"/>
-          <w:sz w:val="20"/>
-          <w:szCs w:val="20"/>
-        </w:rPr>
-        <w:t xml:space="preserve"> НДС 5%.</w:t>
+        <w:t>НДС</w:t>
+      </w:r>
+      <w:r>
+        <w:rPr>
+          <w:rFonts w:ascii="Times New Roman" w:hAnsi="Times New Roman" w:cs="Times New Roman"/>
+          <w:sz w:val="20"/>
+          <w:szCs w:val="20"/>
+          <w:lang w:val="en-US"/>
+        </w:rPr>
+        <w:t xml:space="preserve"> </w:t>
+      </w:r>
+      <w:r>
+        <w:rPr>
+          <w:rFonts w:ascii="Times New Roman" w:hAnsi="Times New Roman" w:cs="Times New Roman"/>
+          <w:sz w:val="20"/>
+          <w:szCs w:val="20"/>
+          <w:highlight w:val="yellow"/>
+          <w:lang w:val="en-US"/>
+        </w:rPr>
+        <w:t>5%</w:t>
+      </w:r>
+      <w:r>
+        <w:rPr>
+          <w:rFonts w:ascii="Times New Roman" w:hAnsi="Times New Roman" w:cs="Times New Roman"/>
+          <w:sz w:val="20"/>
+          <w:szCs w:val="20"/>
+          <w:lang w:val="en-US"/>
+        </w:rPr>
+        <w:t xml:space="preserve"> {{ </w:t>
+      </w:r>
+      <w:proofErr w:type="spellStart"/>
+      <w:r>
+        <w:rPr>
+          <w:rFonts w:ascii="Times New Roman" w:hAnsi="Times New Roman" w:cs="Times New Roman"/>
+          <w:sz w:val="20"/>
+          <w:szCs w:val="20"/>
+          <w:lang w:val="en-US"/>
+        </w:rPr>
+        <w:t>nds</w:t>
+      </w:r>
+      <w:proofErr w:type="spellEnd"/>
+      <w:r>
+        <w:rPr>
+          <w:rFonts w:ascii="Times New Roman" w:hAnsi="Times New Roman" w:cs="Times New Roman"/>
+          <w:sz w:val="20"/>
+          <w:szCs w:val="20"/>
+          <w:lang w:val="en-US"/>
+        </w:rPr>
+        <w:t xml:space="preserve"> }} ({{ </w:t>
+      </w:r>
+      <w:proofErr w:type="spellStart"/>
+      <w:r>
+        <w:rPr>
+          <w:rFonts w:ascii="Times New Roman" w:hAnsi="Times New Roman" w:cs="Times New Roman"/>
+          <w:sz w:val="20"/>
+          <w:szCs w:val="20"/>
+          <w:lang w:val="en-US"/>
+        </w:rPr>
+        <w:t>nds_amount_words</w:t>
+      </w:r>
+      <w:proofErr w:type="spellEnd"/>
+      <w:r>
+        <w:rPr>
+          <w:rFonts w:ascii="Times New Roman" w:hAnsi="Times New Roman" w:cs="Times New Roman"/>
+          <w:sz w:val="20"/>
+          <w:szCs w:val="20"/>
+          <w:lang w:val="en-US"/>
+        </w:rPr>
+        <w:t xml:space="preserve"> }}) {{ </w:t>
+      </w:r>
+      <w:proofErr w:type="spellStart"/>
+      <w:r>
+        <w:rPr>
+          <w:rFonts w:ascii="Times New Roman" w:hAnsi="Times New Roman" w:cs="Times New Roman"/>
+          <w:sz w:val="20"/>
+          <w:szCs w:val="20"/>
+          <w:lang w:val="en-US"/>
+        </w:rPr>
+        <w:t>nds</w:t>
+      </w:r>
+      <w:r>
+        <w:rPr>
+          <w:rFonts w:ascii="Times New Roman" w:hAnsi="Times New Roman" w:cs="Times New Roman"/>
+          <w:sz w:val="20"/>
+          <w:szCs w:val="20"/>
+          <w:lang w:val="en-US"/>
+        </w:rPr>
+        <w:t>_currency_rub</w:t>
+      </w:r>
+      <w:proofErr w:type="spellEnd"/>
+      <w:r>
+        <w:rPr>
+          <w:rFonts w:ascii="Times New Roman" w:hAnsi="Times New Roman" w:cs="Times New Roman"/>
+          <w:sz w:val="20"/>
+          <w:szCs w:val="20"/>
+          <w:lang w:val="en-US"/>
+        </w:rPr>
+        <w:t xml:space="preserve"> }} {{ </w:t>
+      </w:r>
+      <w:proofErr w:type="spellStart"/>
+      <w:r>
+        <w:rPr>
+          <w:rFonts w:ascii="Times New Roman" w:hAnsi="Times New Roman" w:cs="Times New Roman"/>
+          <w:sz w:val="20"/>
+          <w:szCs w:val="20"/>
+          <w:lang w:val="en-US"/>
+        </w:rPr>
+        <w:t>nds</w:t>
+      </w:r>
+      <w:r>
+        <w:rPr>
+          <w:rFonts w:ascii="Times New Roman" w:hAnsi="Times New Roman" w:cs="Times New Roman"/>
+          <w:sz w:val="20"/>
+          <w:szCs w:val="20"/>
+          <w:lang w:val="en-US"/>
+        </w:rPr>
+        <w:t>_cents_number</w:t>
+      </w:r>
+      <w:proofErr w:type="spellEnd"/>
+      <w:r>
+        <w:rPr>
+          <w:rFonts w:ascii="Times New Roman" w:hAnsi="Times New Roman" w:cs="Times New Roman"/>
+          <w:sz w:val="20"/>
+          <w:szCs w:val="20"/>
+          <w:lang w:val="en-US"/>
+        </w:rPr>
+        <w:t xml:space="preserve"> }} {{ </w:t>
+      </w:r>
+      <w:proofErr w:type="spellStart"/>
+      <w:r>
+        <w:rPr>
+          <w:rFonts w:ascii="Times New Roman" w:hAnsi="Times New Roman" w:cs="Times New Roman"/>
+          <w:sz w:val="20"/>
+          <w:szCs w:val="20"/>
+          <w:lang w:val="en-US"/>
+        </w:rPr>
+        <w:t>nds</w:t>
+      </w:r>
+      <w:r>
+        <w:rPr>
+          <w:rFonts w:ascii="Times New Roman" w:hAnsi="Times New Roman" w:cs="Times New Roman"/>
+          <w:sz w:val="20"/>
+          <w:szCs w:val="20"/>
+          <w:lang w:val="en-US"/>
+        </w:rPr>
+        <w:t>_currency_kop</w:t>
+      </w:r>
+      <w:proofErr w:type="spellEnd"/>
+      <w:r>
+        <w:rPr>
+          <w:rFonts w:ascii="Times New Roman" w:hAnsi="Times New Roman" w:cs="Times New Roman"/>
+          <w:sz w:val="20"/>
+          <w:szCs w:val="20"/>
+          <w:lang w:val="en-US"/>
+        </w:rPr>
+        <w:t xml:space="preserve"> }}.</w:t>
       </w:r>
     </w:p>
     <w:bookmarkEnd w:id="14"/>
@@ -5238,44 +6056,141 @@
               <w:pStyle w:val="af6"/>
               <w:spacing w:before="0" w:beforeAutospacing="0" w:after="0" w:afterAutospacing="0"/>
               <w:rPr>
+                <w:rFonts w:eastAsia="Times New Roman"/>
+                <w:color w:val="000000"/>
+                <w:sz w:val="20"/>
+                <w:szCs w:val="20"/>
+                <w:lang w:val="en-US" w:eastAsia="ar-SA"/>
+              </w:rPr>
+            </w:pPr>
+            <w:r>
+              <w:rPr>
+                <w:color w:val="000000"/>
+                <w:sz w:val="20"/>
+                <w:szCs w:val="20"/>
+              </w:rPr>
+              <w:t>Код</w:t>
+            </w:r>
+            <w:r>
+              <w:rPr>
+                <w:color w:val="000000"/>
                 <w:sz w:val="20"/>
                 <w:szCs w:val="20"/>
                 <w:lang w:val="en-US"/>
               </w:rPr>
+              <w:t xml:space="preserve"> </w:t>
+            </w:r>
+            <w:r>
+              <w:rPr>
+                <w:color w:val="000000"/>
+                <w:sz w:val="20"/>
+                <w:szCs w:val="20"/>
+              </w:rPr>
+              <w:t>подразделения</w:t>
+            </w:r>
+            <w:r>
+              <w:rPr>
+                <w:color w:val="000000"/>
+                <w:sz w:val="20"/>
+                <w:szCs w:val="20"/>
+                <w:lang w:val="en-US"/>
+              </w:rPr>
+              <w:t xml:space="preserve">: </w:t>
+            </w:r>
+            <w:proofErr w:type="gramStart"/>
+            <w:r>
+              <w:rPr>
+                <w:rFonts w:eastAsia="Times New Roman"/>
+                <w:color w:val="000000"/>
+                <w:sz w:val="20"/>
+                <w:szCs w:val="20"/>
+                <w:lang w:val="en-US" w:eastAsia="ar-SA"/>
+              </w:rPr>
+              <w:t xml:space="preserve">{{ </w:t>
+            </w:r>
+            <w:proofErr w:type="spellStart"/>
+            <w:r>
+              <w:rPr>
+                <w:rFonts w:eastAsia="Times New Roman"/>
+                <w:color w:val="000000"/>
+                <w:sz w:val="20"/>
+                <w:szCs w:val="20"/>
+                <w:lang w:val="en-US" w:eastAsia="ar-SA"/>
+              </w:rPr>
+              <w:t>passport</w:t>
+            </w:r>
+            <w:proofErr w:type="gramEnd"/>
+            <w:r>
+              <w:rPr>
+                <w:rFonts w:eastAsia="Times New Roman"/>
+                <w:color w:val="000000"/>
+                <w:sz w:val="20"/>
+                <w:szCs w:val="20"/>
+                <w:lang w:val="en-US" w:eastAsia="ar-SA"/>
+              </w:rPr>
+              <w:t>_code</w:t>
+            </w:r>
+            <w:proofErr w:type="spellEnd"/>
+            <w:r>
+              <w:rPr>
+                <w:rFonts w:eastAsia="Times New Roman"/>
+                <w:color w:val="000000"/>
+                <w:sz w:val="20"/>
+                <w:szCs w:val="20"/>
+                <w:lang w:val="en-US" w:eastAsia="ar-SA"/>
+              </w:rPr>
+              <w:t xml:space="preserve"> }}</w:t>
+            </w:r>
+          </w:p>
+          <w:p>
+            <w:pPr>
+              <w:pStyle w:val="af6"/>
+              <w:spacing w:before="0" w:beforeAutospacing="0" w:after="0" w:afterAutospacing="0"/>
+              <w:rPr>
+                <w:sz w:val="20"/>
+                <w:szCs w:val="20"/>
+                <w:lang w:val="en-US"/>
+              </w:rPr>
             </w:pPr>
             <w:r>
               <w:rPr>
-                <w:color w:val="000000"/>
-                <w:sz w:val="20"/>
-                <w:szCs w:val="20"/>
-              </w:rPr>
-              <w:t>Код</w:t>
-            </w:r>
-            <w:r>
-              <w:rPr>
-                <w:color w:val="000000"/>
-                <w:sz w:val="20"/>
-                <w:szCs w:val="20"/>
-                <w:lang w:val="en-US"/>
+                <w:rFonts w:eastAsia="Times New Roman"/>
+                <w:color w:val="000000"/>
+                <w:sz w:val="20"/>
+                <w:szCs w:val="20"/>
+                <w:lang w:eastAsia="ar-SA"/>
+              </w:rPr>
+              <w:t>Дата</w:t>
+            </w:r>
+            <w:r>
+              <w:rPr>
+                <w:rFonts w:eastAsia="Times New Roman"/>
+                <w:color w:val="000000"/>
+                <w:sz w:val="20"/>
+                <w:szCs w:val="20"/>
+                <w:lang w:val="en-US" w:eastAsia="ar-SA"/>
               </w:rPr>
               <w:t xml:space="preserve"> </w:t>
             </w:r>
             <w:r>
               <w:rPr>
-                <w:color w:val="000000"/>
-                <w:sz w:val="20"/>
-                <w:szCs w:val="20"/>
-              </w:rPr>
-              <w:t>подразделения</w:t>
-            </w:r>
-            <w:r>
-              <w:rPr>
-                <w:color w:val="000000"/>
-                <w:sz w:val="20"/>
-                <w:szCs w:val="20"/>
-                <w:lang w:val="en-US"/>
-              </w:rPr>
-              <w:t xml:space="preserve">: </w:t>
+                <w:rFonts w:eastAsia="Times New Roman"/>
+                <w:color w:val="000000"/>
+                <w:sz w:val="20"/>
+                <w:szCs w:val="20"/>
+                <w:lang w:eastAsia="ar-SA"/>
+              </w:rPr>
+              <w:t>рождения</w:t>
+            </w:r>
+            <w:r>
+              <w:rPr>
+                <w:rFonts w:eastAsia="Times New Roman"/>
+                <w:color w:val="000000"/>
+                <w:sz w:val="20"/>
+                <w:szCs w:val="20"/>
+                <w:lang w:val="en-US" w:eastAsia="ar-SA"/>
+              </w:rPr>
+              <w:t xml:space="preserve"> </w:t>
             </w:r>
             <w:proofErr w:type="gramStart"/>
             <w:r>
@@ -5297,7 +6212,7 @@
                 <w:szCs w:val="20"/>
                 <w:lang w:val="en-US" w:eastAsia="ar-SA"/>
               </w:rPr>
-              <w:t>passport</w:t>
+              <w:t>birth</w:t>
             </w:r>
             <w:proofErr w:type="gramEnd"/>
             <w:r>
@@ -5308,7 +6223,7 @@
                 <w:szCs w:val="20"/>
                 <w:lang w:val="en-US" w:eastAsia="ar-SA"/>
               </w:rPr>
-              <w:t>_code</w:t>
+              <w:t>_date</w:t>
             </w:r>
             <w:proofErr w:type="spellEnd"/>
             <w:r>
@@ -5517,7 +6432,6 @@
         <w:rPr>
           <w:i/>
         </w:rPr>
-        <w:lastRenderedPageBreak/>
         <w:t>Приложение №2 к дог</w:t>
       </w:r>
       <w:r>
@@ -5960,29 +6874,34 @@
         <w:t xml:space="preserve"> </w:t>
       </w:r>
     </w:p>
+    <w:p>
+      <w:pPr>
+        <w:pStyle w:val="af"/>
+        <w:rPr>
+          <w:rFonts w:ascii="Times New Roman" w:hAnsi="Times New Roman" w:cs="Times New Roman"/>
+          <w:sz w:val="20"/>
+          <w:szCs w:val="20"/>
+        </w:rPr>
+      </w:pPr>
+    </w:p>
     <w:tbl>
       <w:tblPr>
+        <w:tblStyle w:val="af7"/>
         <w:tblW w:w="0" w:type="auto"/>
-        <w:tblInd w:w="392" w:type="dxa"/>
-        <w:tblBorders>
-          <w:top w:val="single" w:sz="4" w:space="0" w:color="auto"/>
-          <w:left w:val="single" w:sz="4" w:space="0" w:color="auto"/>
-          <w:bottom w:val="single" w:sz="4" w:space="0" w:color="auto"/>
-          <w:right w:val="single" w:sz="4" w:space="0" w:color="auto"/>
-          <w:insideH w:val="single" w:sz="4" w:space="0" w:color="auto"/>
-          <w:insideV w:val="single" w:sz="4" w:space="0" w:color="auto"/>
-        </w:tblBorders>
+        <w:jc w:val="center"/>
         <w:tblLook w:val="04A0" w:firstRow="1" w:lastRow="0" w:firstColumn="1" w:lastColumn="0" w:noHBand="0" w:noVBand="1"/>
       </w:tblPr>
       <w:tblGrid>
-        <w:gridCol w:w="7469"/>
-        <w:gridCol w:w="2595"/>
+        <w:gridCol w:w="8364"/>
+        <w:gridCol w:w="1696"/>
       </w:tblGrid>
       <w:tr>
+        <w:trPr>
+          <w:jc w:val="center"/>
+        </w:trPr>
         <w:tc>
           <w:tcPr>
-            <w:tcW w:w="7654" w:type="dxa"/>
-            <w:shd w:val="clear" w:color="auto" w:fill="auto"/>
+            <w:tcW w:w="8364" w:type="dxa"/>
           </w:tcPr>
           <w:p>
             <w:pPr>
@@ -5991,14 +6910,18 @@
               <w:rPr>
                 <w:rFonts w:ascii="Times New Roman" w:hAnsi="Times New Roman" w:cs="Times New Roman"/>
                 <w:b/>
-                <w:sz w:val="20"/>
+                <w:bCs/>
+                <w:sz w:val="20"/>
+                <w:szCs w:val="20"/>
               </w:rPr>
             </w:pPr>
             <w:r>
               <w:rPr>
                 <w:rFonts w:ascii="Times New Roman" w:hAnsi="Times New Roman" w:cs="Times New Roman"/>
                 <w:b/>
-                <w:sz w:val="20"/>
+                <w:bCs/>
+                <w:sz w:val="20"/>
+                <w:szCs w:val="20"/>
               </w:rPr>
               <w:t>Наименование</w:t>
             </w:r>
@@ -6006,8 +6929,7 @@
         </w:tc>
         <w:tc>
           <w:tcPr>
-            <w:tcW w:w="2636" w:type="dxa"/>
-            <w:shd w:val="clear" w:color="auto" w:fill="auto"/>
+            <w:tcW w:w="1696" w:type="dxa"/>
           </w:tcPr>
           <w:p>
             <w:pPr>
@@ -6016,14 +6938,18 @@
               <w:rPr>
                 <w:rFonts w:ascii="Times New Roman" w:hAnsi="Times New Roman" w:cs="Times New Roman"/>
                 <w:b/>
-                <w:sz w:val="20"/>
+                <w:bCs/>
+                <w:sz w:val="20"/>
+                <w:szCs w:val="20"/>
               </w:rPr>
             </w:pPr>
             <w:r>
               <w:rPr>
                 <w:rFonts w:ascii="Times New Roman" w:hAnsi="Times New Roman" w:cs="Times New Roman"/>
                 <w:b/>
-                <w:sz w:val="20"/>
+                <w:bCs/>
+                <w:sz w:val="20"/>
+                <w:szCs w:val="20"/>
               </w:rPr>
               <w:t>Количество</w:t>
             </w:r>
@@ -6031,10 +6957,12 @@
         </w:tc>
       </w:tr>
       <w:tr>
+        <w:trPr>
+          <w:jc w:val="center"/>
+        </w:trPr>
         <w:tc>
           <w:tcPr>
-            <w:tcW w:w="7654" w:type="dxa"/>
-            <w:shd w:val="clear" w:color="auto" w:fill="auto"/>
+            <w:tcW w:w="8364" w:type="dxa"/>
           </w:tcPr>
           <w:p>
             <w:pPr>
@@ -6042,95 +6970,90 @@
               <w:jc w:val="both"/>
               <w:rPr>
                 <w:rFonts w:ascii="Times New Roman" w:hAnsi="Times New Roman" w:cs="Times New Roman"/>
-                <w:b/>
-                <w:sz w:val="20"/>
-                <w:szCs w:val="20"/>
+                <w:sz w:val="20"/>
+                <w:szCs w:val="20"/>
+                <w:lang w:val="en-US"/>
               </w:rPr>
             </w:pPr>
             <w:r>
               <w:rPr>
-                <w:rFonts w:ascii="Times New Roman" w:hAnsi="Times New Roman" w:cs="Times New Roman"/>
-                <w:b/>
-                <w:sz w:val="20"/>
-                <w:szCs w:val="20"/>
-              </w:rPr>
-              <w:t xml:space="preserve">Косилка </w:t>
-            </w:r>
-            <w:r>
-              <w:rPr>
-                <w:rFonts w:ascii="Times New Roman" w:hAnsi="Times New Roman" w:cs="Times New Roman"/>
-                <w:b/>
-                <w:sz w:val="20"/>
-                <w:szCs w:val="20"/>
-              </w:rPr>
-              <w:t xml:space="preserve">дисковая </w:t>
-            </w:r>
-            <w:proofErr w:type="spellStart"/>
-            <w:r>
-              <w:rPr>
-                <w:rFonts w:ascii="Times New Roman" w:hAnsi="Times New Roman" w:cs="Times New Roman"/>
-                <w:b/>
-                <w:sz w:val="20"/>
-                <w:szCs w:val="20"/>
-              </w:rPr>
-              <w:t>задненавесная</w:t>
-            </w:r>
-            <w:proofErr w:type="spellEnd"/>
-            <w:r>
-              <w:rPr>
-                <w:rFonts w:ascii="Times New Roman" w:hAnsi="Times New Roman" w:cs="Times New Roman"/>
-                <w:b/>
-                <w:sz w:val="20"/>
-                <w:szCs w:val="20"/>
-              </w:rPr>
-              <w:t xml:space="preserve"> </w:t>
-            </w:r>
-            <w:proofErr w:type="spellStart"/>
-            <w:r>
-              <w:rPr>
-                <w:rFonts w:ascii="Times New Roman" w:hAnsi="Times New Roman" w:cs="Times New Roman"/>
-                <w:b/>
-                <w:sz w:val="20"/>
-                <w:szCs w:val="20"/>
-              </w:rPr>
-              <w:t>Samba</w:t>
-            </w:r>
-            <w:proofErr w:type="spellEnd"/>
-            <w:r>
-              <w:rPr>
-                <w:rFonts w:ascii="Times New Roman" w:hAnsi="Times New Roman" w:cs="Times New Roman"/>
-                <w:b/>
-                <w:sz w:val="20"/>
-                <w:szCs w:val="20"/>
-              </w:rPr>
-              <w:t xml:space="preserve"> 280</w:t>
-            </w:r>
-            <w:r>
-              <w:rPr>
-                <w:rFonts w:ascii="Times New Roman" w:hAnsi="Times New Roman" w:cs="Times New Roman"/>
-                <w:b/>
-                <w:sz w:val="20"/>
-                <w:szCs w:val="20"/>
-              </w:rPr>
-              <w:t xml:space="preserve"> </w:t>
-            </w:r>
-            <w:proofErr w:type="spellStart"/>
-            <w:r>
-              <w:rPr>
-                <w:rFonts w:ascii="Times New Roman" w:hAnsi="Times New Roman" w:cs="Times New Roman"/>
-                <w:b/>
-                <w:sz w:val="20"/>
-                <w:szCs w:val="20"/>
-              </w:rPr>
-              <w:t>SaMASZ</w:t>
-            </w:r>
-            <w:proofErr w:type="spellEnd"/>
+                <w:lang w:val="en-US"/>
+              </w:rPr>
+              <w:t xml:space="preserve">{%tr for p in </w:t>
+            </w:r>
+            <w:r>
+              <w:rPr>
+                <w:lang w:val="en-US"/>
+              </w:rPr>
+              <w:t>products</w:t>
+            </w:r>
+            <w:r>
+              <w:rPr>
+                <w:lang w:val="en-US"/>
+              </w:rPr>
+              <w:t xml:space="preserve"> %}</w:t>
+            </w:r>
           </w:p>
         </w:tc>
         <w:tc>
           <w:tcPr>
-            <w:tcW w:w="2636" w:type="dxa"/>
-            <w:shd w:val="clear" w:color="auto" w:fill="auto"/>
+            <w:tcW w:w="1696" w:type="dxa"/>
+          </w:tcPr>
+          <w:p>
+            <w:pPr>
+              <w:pStyle w:val="af"/>
+              <w:jc w:val="both"/>
+              <w:rPr>
+                <w:rFonts w:ascii="Times New Roman" w:hAnsi="Times New Roman" w:cs="Times New Roman"/>
+                <w:sz w:val="20"/>
+                <w:szCs w:val="20"/>
+                <w:lang w:val="en-US"/>
+              </w:rPr>
+            </w:pPr>
+          </w:p>
+        </w:tc>
+      </w:tr>
+      <w:tr>
+        <w:trPr>
+          <w:jc w:val="center"/>
+        </w:trPr>
+        <w:tc>
+          <w:tcPr>
+            <w:tcW w:w="8364" w:type="dxa"/>
+          </w:tcPr>
+          <w:p>
+            <w:pPr>
+              <w:pStyle w:val="af"/>
+              <w:rPr>
+                <w:rFonts w:ascii="Times New Roman" w:hAnsi="Times New Roman" w:cs="Times New Roman"/>
+                <w:b/>
+                <w:bCs/>
+                <w:sz w:val="20"/>
+                <w:szCs w:val="20"/>
+                <w:lang w:val="en-US"/>
+              </w:rPr>
+            </w:pPr>
+            <w:proofErr w:type="gramStart"/>
+            <w:r>
+              <w:rPr>
+                <w:b/>
+                <w:bCs/>
+              </w:rPr>
+              <w:t>{{ p</w:t>
+            </w:r>
+            <w:proofErr w:type="gramEnd"/>
+            <w:r>
+              <w:rPr>
+                <w:b/>
+                <w:bCs/>
+              </w:rPr>
+              <w:t>.name }}</w:t>
+            </w:r>
+          </w:p>
+        </w:tc>
+        <w:tc>
+          <w:tcPr>
+            <w:tcW w:w="1696" w:type="dxa"/>
           </w:tcPr>
           <w:p>
             <w:pPr>
@@ -6139,15 +7062,84 @@
               <w:rPr>
                 <w:rFonts w:ascii="Times New Roman" w:hAnsi="Times New Roman" w:cs="Times New Roman"/>
                 <w:sz w:val="20"/>
+                <w:szCs w:val="20"/>
+                <w:lang w:val="en-US"/>
               </w:rPr>
             </w:pPr>
-            <w:r>
+            <w:proofErr w:type="gramStart"/>
+            <w:r>
+              <w:t>{{ p.</w:t>
+            </w:r>
+            <w:proofErr w:type="gramEnd"/>
+            <w:r>
+              <w:t xml:space="preserve"> </w:t>
+            </w:r>
+            <w:proofErr w:type="spellStart"/>
+            <w:r>
+              <w:t>quantity</w:t>
+            </w:r>
+            <w:proofErr w:type="spellEnd"/>
+            <w:r>
+              <w:t>}}</w:t>
+            </w:r>
+          </w:p>
+        </w:tc>
+      </w:tr>
+      <w:tr>
+        <w:trPr>
+          <w:jc w:val="center"/>
+        </w:trPr>
+        <w:tc>
+          <w:tcPr>
+            <w:tcW w:w="8364" w:type="dxa"/>
+          </w:tcPr>
+          <w:p>
+            <w:pPr>
+              <w:pStyle w:val="af"/>
+              <w:jc w:val="both"/>
               <w:rPr>
                 <w:rFonts w:ascii="Times New Roman" w:hAnsi="Times New Roman" w:cs="Times New Roman"/>
                 <w:sz w:val="20"/>
-              </w:rPr>
-              <w:t>1</w:t>
-            </w:r>
+                <w:szCs w:val="20"/>
+                <w:lang w:val="en-US"/>
+              </w:rPr>
+            </w:pPr>
+            <w:r>
+              <w:t>{%</w:t>
+            </w:r>
+            <w:proofErr w:type="spellStart"/>
+            <w:r>
+              <w:t>tr</w:t>
+            </w:r>
+            <w:proofErr w:type="spellEnd"/>
+            <w:r>
+              <w:t xml:space="preserve"> </w:t>
+            </w:r>
+            <w:proofErr w:type="spellStart"/>
+            <w:r>
+              <w:t>endfor</w:t>
+            </w:r>
+            <w:proofErr w:type="spellEnd"/>
+            <w:r>
+              <w:t xml:space="preserve"> %}</w:t>
+            </w:r>
+          </w:p>
+        </w:tc>
+        <w:tc>
+          <w:tcPr>
+            <w:tcW w:w="1696" w:type="dxa"/>
+          </w:tcPr>
+          <w:p>
+            <w:pPr>
+              <w:pStyle w:val="af"/>
+              <w:jc w:val="both"/>
+              <w:rPr>
+                <w:rFonts w:ascii="Times New Roman" w:hAnsi="Times New Roman" w:cs="Times New Roman"/>
+                <w:sz w:val="20"/>
+                <w:szCs w:val="20"/>
+                <w:lang w:val="en-US"/>
+              </w:rPr>
+            </w:pPr>
           </w:p>
         </w:tc>
       </w:tr>
@@ -7050,44 +8042,141 @@
               <w:pStyle w:val="af6"/>
               <w:spacing w:before="0" w:beforeAutospacing="0" w:after="0" w:afterAutospacing="0"/>
               <w:rPr>
+                <w:rFonts w:eastAsia="Times New Roman"/>
+                <w:color w:val="000000"/>
+                <w:sz w:val="20"/>
+                <w:szCs w:val="20"/>
+                <w:lang w:val="en-US" w:eastAsia="ar-SA"/>
+              </w:rPr>
+            </w:pPr>
+            <w:r>
+              <w:rPr>
+                <w:color w:val="000000"/>
+                <w:sz w:val="20"/>
+                <w:szCs w:val="20"/>
+              </w:rPr>
+              <w:t>Код</w:t>
+            </w:r>
+            <w:r>
+              <w:rPr>
+                <w:color w:val="000000"/>
                 <w:sz w:val="20"/>
                 <w:szCs w:val="20"/>
                 <w:lang w:val="en-US"/>
               </w:rPr>
+              <w:t xml:space="preserve"> </w:t>
+            </w:r>
+            <w:r>
+              <w:rPr>
+                <w:color w:val="000000"/>
+                <w:sz w:val="20"/>
+                <w:szCs w:val="20"/>
+              </w:rPr>
+              <w:t>подразделения</w:t>
+            </w:r>
+            <w:r>
+              <w:rPr>
+                <w:color w:val="000000"/>
+                <w:sz w:val="20"/>
+                <w:szCs w:val="20"/>
+                <w:lang w:val="en-US"/>
+              </w:rPr>
+              <w:t xml:space="preserve">: </w:t>
+            </w:r>
+            <w:proofErr w:type="gramStart"/>
+            <w:r>
+              <w:rPr>
+                <w:rFonts w:eastAsia="Times New Roman"/>
+                <w:color w:val="000000"/>
+                <w:sz w:val="20"/>
+                <w:szCs w:val="20"/>
+                <w:lang w:val="en-US" w:eastAsia="ar-SA"/>
+              </w:rPr>
+              <w:t xml:space="preserve">{{ </w:t>
+            </w:r>
+            <w:proofErr w:type="spellStart"/>
+            <w:r>
+              <w:rPr>
+                <w:rFonts w:eastAsia="Times New Roman"/>
+                <w:color w:val="000000"/>
+                <w:sz w:val="20"/>
+                <w:szCs w:val="20"/>
+                <w:lang w:val="en-US" w:eastAsia="ar-SA"/>
+              </w:rPr>
+              <w:t>passport</w:t>
+            </w:r>
+            <w:proofErr w:type="gramEnd"/>
+            <w:r>
+              <w:rPr>
+                <w:rFonts w:eastAsia="Times New Roman"/>
+                <w:color w:val="000000"/>
+                <w:sz w:val="20"/>
+                <w:szCs w:val="20"/>
+                <w:lang w:val="en-US" w:eastAsia="ar-SA"/>
+              </w:rPr>
+              <w:t>_code</w:t>
+            </w:r>
+            <w:proofErr w:type="spellEnd"/>
+            <w:r>
+              <w:rPr>
+                <w:rFonts w:eastAsia="Times New Roman"/>
+                <w:color w:val="000000"/>
+                <w:sz w:val="20"/>
+                <w:szCs w:val="20"/>
+                <w:lang w:val="en-US" w:eastAsia="ar-SA"/>
+              </w:rPr>
+              <w:t xml:space="preserve"> }}</w:t>
+            </w:r>
+          </w:p>
+          <w:p>
+            <w:pPr>
+              <w:pStyle w:val="af6"/>
+              <w:spacing w:before="0" w:beforeAutospacing="0" w:after="0" w:afterAutospacing="0"/>
+              <w:rPr>
+                <w:sz w:val="20"/>
+                <w:szCs w:val="20"/>
+                <w:lang w:val="en-US"/>
+              </w:rPr>
             </w:pPr>
             <w:r>
               <w:rPr>
-                <w:color w:val="000000"/>
-                <w:sz w:val="20"/>
-                <w:szCs w:val="20"/>
-              </w:rPr>
-              <w:t>Код</w:t>
-            </w:r>
-            <w:r>
-              <w:rPr>
-                <w:color w:val="000000"/>
-                <w:sz w:val="20"/>
-                <w:szCs w:val="20"/>
-                <w:lang w:val="en-US"/>
+                <w:rFonts w:eastAsia="Times New Roman"/>
+                <w:color w:val="000000"/>
+                <w:sz w:val="20"/>
+                <w:szCs w:val="20"/>
+                <w:lang w:eastAsia="ar-SA"/>
+              </w:rPr>
+              <w:t>Дата</w:t>
+            </w:r>
+            <w:r>
+              <w:rPr>
+                <w:rFonts w:eastAsia="Times New Roman"/>
+                <w:color w:val="000000"/>
+                <w:sz w:val="20"/>
+                <w:szCs w:val="20"/>
+                <w:lang w:val="en-US" w:eastAsia="ar-SA"/>
               </w:rPr>
               <w:t xml:space="preserve"> </w:t>
             </w:r>
             <w:r>
               <w:rPr>
-                <w:color w:val="000000"/>
-                <w:sz w:val="20"/>
-                <w:szCs w:val="20"/>
-              </w:rPr>
-              <w:t>подразделения</w:t>
-            </w:r>
-            <w:r>
-              <w:rPr>
-                <w:color w:val="000000"/>
-                <w:sz w:val="20"/>
-                <w:szCs w:val="20"/>
-                <w:lang w:val="en-US"/>
-              </w:rPr>
-              <w:t xml:space="preserve">: </w:t>
+                <w:rFonts w:eastAsia="Times New Roman"/>
+                <w:color w:val="000000"/>
+                <w:sz w:val="20"/>
+                <w:szCs w:val="20"/>
+                <w:lang w:eastAsia="ar-SA"/>
+              </w:rPr>
+              <w:t>рождения</w:t>
+            </w:r>
+            <w:r>
+              <w:rPr>
+                <w:rFonts w:eastAsia="Times New Roman"/>
+                <w:color w:val="000000"/>
+                <w:sz w:val="20"/>
+                <w:szCs w:val="20"/>
+                <w:lang w:val="en-US" w:eastAsia="ar-SA"/>
+              </w:rPr>
+              <w:t xml:space="preserve"> </w:t>
             </w:r>
             <w:proofErr w:type="gramStart"/>
             <w:r>
@@ -7109,7 +8198,7 @@
                 <w:szCs w:val="20"/>
                 <w:lang w:val="en-US" w:eastAsia="ar-SA"/>
               </w:rPr>
-              <w:t>passport</w:t>
+              <w:t>birth</w:t>
             </w:r>
             <w:proofErr w:type="gramEnd"/>
             <w:r>
@@ -7120,7 +8209,7 @@
                 <w:szCs w:val="20"/>
                 <w:lang w:val="en-US" w:eastAsia="ar-SA"/>
               </w:rPr>
-              <w:t>_code</w:t>
+              <w:t>_date</w:t>
             </w:r>
             <w:proofErr w:type="spellEnd"/>
             <w:r>

</xml_diff>